<commit_message>
Finalized the revised manuscript.
</commit_message>
<xml_diff>
--- a/2025_fecundity_supp_mat.docx
+++ b/2025_fecundity_supp_mat.docx
@@ -74,6 +74,2909 @@
         <w:br w:type="page"/>
       </w:r>
     </w:p>
+    <w:bookmarkStart w:id="36" w:name="withinbetween-multivariate-model"/>
+    <w:p>
+      <w:pPr>
+        <w:pStyle w:val="Heading2"/>
+      </w:pPr>
+      <w:r>
+        <w:t xml:space="preserve">Within–between multivariate model</w:t>
+      </w:r>
+    </w:p>
+    <w:p>
+      <w:pPr>
+        <w:pStyle w:val="FirstParagraph"/>
+      </w:pPr>
+      <w:r>
+        <w:t xml:space="preserve">To partition covariance arising from within-female plasticity from covariance attributable to consistent among-female differences, I applied the within–between decomposition of can de Pol and Wright</w:t>
+      </w:r>
+      <w:r>
+        <w:t xml:space="preserve"> </w:t>
+      </w:r>
+      <w:r>
+        <w:t xml:space="preserve">(Pol and Wright 2009)</w:t>
+      </w:r>
+      <w:r>
+        <w:t xml:space="preserve">. Although mean-centering can impose assumptions about underlying biological processes</w:t>
+      </w:r>
+      <w:r>
+        <w:t xml:space="preserve"> </w:t>
+      </w:r>
+      <w:r>
+        <w:t xml:space="preserve">(Westneat et al. 2020)</w:t>
+      </w:r>
+      <w:r>
+        <w:t xml:space="preserve">, these assumptions are appropriate here because the aim was to distinguish plastic allocation within females from persistent differences among females.</w:t>
+      </w:r>
+    </w:p>
+    <w:p>
+      <w:pPr>
+        <w:pStyle w:val="BodyText"/>
+      </w:pPr>
+      <w:r>
+        <w:t xml:space="preserve">Let egg number for female</w:t>
+      </w:r>
+      <w:r>
+        <w:t xml:space="preserve"> </w:t>
+      </w:r>
+      <m:oMath>
+        <m:r>
+          <m:t>i</m:t>
+        </m:r>
+      </m:oMath>
+      <w:r>
+        <w:t xml:space="preserve"> </w:t>
+      </w:r>
+      <w:r>
+        <w:t xml:space="preserve">in brood</w:t>
+      </w:r>
+      <w:r>
+        <w:t xml:space="preserve"> </w:t>
+      </w:r>
+      <m:oMath>
+        <m:r>
+          <m:t>j</m:t>
+        </m:r>
+      </m:oMath>
+      <w:r>
+        <w:t xml:space="preserve"> </w:t>
+      </w:r>
+      <w:r>
+        <w:t xml:space="preserve">be denoted</w:t>
+      </w:r>
+      <w:r>
+        <w:t xml:space="preserve"> </w:t>
+      </w:r>
+      <m:oMath>
+        <m:sSub>
+          <m:e>
+            <m:r>
+              <m:t>N</m:t>
+            </m:r>
+          </m:e>
+          <m:sub>
+            <m:r>
+              <m:t>i</m:t>
+            </m:r>
+            <m:r>
+              <m:t>j</m:t>
+            </m:r>
+          </m:sub>
+        </m:sSub>
+      </m:oMath>
+      <w:r>
+        <w:t xml:space="preserve">. Egg number was decomposed as</w:t>
+      </w:r>
+    </w:p>
+    <w:p>
+      <w:pPr>
+        <w:pStyle w:val="BodyText"/>
+      </w:pPr>
+      <w:bookmarkStart w:id="21" w:name="eq-decomposition"/>
+      <m:oMathPara>
+        <m:oMathParaPr>
+          <m:jc m:val="center"/>
+        </m:oMathParaPr>
+        <m:oMath>
+          <m:sSub>
+            <m:e>
+              <m:r>
+                <m:t>N</m:t>
+              </m:r>
+            </m:e>
+            <m:sub>
+              <m:r>
+                <m:t>i</m:t>
+              </m:r>
+              <m:r>
+                <m:t>j</m:t>
+              </m:r>
+            </m:sub>
+          </m:sSub>
+          <m:r>
+            <m:rPr>
+              <m:sty m:val="p"/>
+            </m:rPr>
+            <m:t>=</m:t>
+          </m:r>
+          <m:sSub>
+            <m:e>
+              <m:acc>
+                <m:accPr>
+                  <m:chr m:val="‾"/>
+                </m:accPr>
+                <m:e>
+                  <m:r>
+                    <m:t>N</m:t>
+                  </m:r>
+                </m:e>
+              </m:acc>
+            </m:e>
+            <m:sub>
+              <m:r>
+                <m:t>i</m:t>
+              </m:r>
+            </m:sub>
+          </m:sSub>
+          <m:r>
+            <m:rPr>
+              <m:sty m:val="p"/>
+            </m:rPr>
+            <m:t>+</m:t>
+          </m:r>
+          <m:d>
+            <m:dPr>
+              <m:begChr m:val="("/>
+              <m:sepChr m:val=""/>
+              <m:endChr m:val=")"/>
+              <m:grow/>
+            </m:dPr>
+            <m:e>
+              <m:sSub>
+                <m:e>
+                  <m:r>
+                    <m:t>N</m:t>
+                  </m:r>
+                </m:e>
+                <m:sub>
+                  <m:r>
+                    <m:t>i</m:t>
+                  </m:r>
+                  <m:r>
+                    <m:t>j</m:t>
+                  </m:r>
+                </m:sub>
+              </m:sSub>
+              <m:r>
+                <m:rPr>
+                  <m:sty m:val="p"/>
+                </m:rPr>
+                <m:t>−</m:t>
+              </m:r>
+              <m:sSub>
+                <m:e>
+                  <m:acc>
+                    <m:accPr>
+                      <m:chr m:val="‾"/>
+                    </m:accPr>
+                    <m:e>
+                      <m:r>
+                        <m:t>N</m:t>
+                      </m:r>
+                    </m:e>
+                  </m:acc>
+                </m:e>
+                <m:sub>
+                  <m:r>
+                    <m:t>i</m:t>
+                  </m:r>
+                </m:sub>
+              </m:sSub>
+            </m:e>
+          </m:d>
+          <m:r>
+            <m:t>  </m:t>
+          </m:r>
+          <m:d>
+            <m:dPr>
+              <m:begChr m:val="("/>
+              <m:sepChr m:val=""/>
+              <m:endChr m:val=")"/>
+              <m:grow/>
+            </m:dPr>
+            <m:e>
+              <m:r>
+                <m:t>1</m:t>
+              </m:r>
+            </m:e>
+          </m:d>
+        </m:oMath>
+      </m:oMathPara>
+      <w:bookmarkEnd w:id="21"/>
+    </w:p>
+    <w:p>
+      <w:pPr>
+        <w:pStyle w:val="FirstParagraph"/>
+      </w:pPr>
+      <w:r>
+        <w:t xml:space="preserve">The between- and within-female components were defined as</w:t>
+      </w:r>
+    </w:p>
+    <w:p>
+      <w:pPr>
+        <w:pStyle w:val="BodyText"/>
+      </w:pPr>
+      <w:bookmarkStart w:id="22" w:name="eq-between"/>
+      <m:oMathPara>
+        <m:oMathParaPr>
+          <m:jc m:val="center"/>
+        </m:oMathParaPr>
+        <m:oMath>
+          <m:sSubSup>
+            <m:e>
+              <m:r>
+                <m:t>N</m:t>
+              </m:r>
+            </m:e>
+            <m:sub>
+              <m:r>
+                <m:t>i</m:t>
+              </m:r>
+            </m:sub>
+            <m:sup>
+              <m:r>
+                <m:t>B</m:t>
+              </m:r>
+            </m:sup>
+          </m:sSubSup>
+          <m:r>
+            <m:rPr>
+              <m:sty m:val="p"/>
+            </m:rPr>
+            <m:t>=</m:t>
+          </m:r>
+          <m:sSub>
+            <m:e>
+              <m:acc>
+                <m:accPr>
+                  <m:chr m:val="‾"/>
+                </m:accPr>
+                <m:e>
+                  <m:r>
+                    <m:t>N</m:t>
+                  </m:r>
+                </m:e>
+              </m:acc>
+            </m:e>
+            <m:sub>
+              <m:r>
+                <m:t>i</m:t>
+              </m:r>
+            </m:sub>
+          </m:sSub>
+          <m:r>
+            <m:rPr>
+              <m:sty m:val="p"/>
+            </m:rPr>
+            <m:t>−</m:t>
+          </m:r>
+          <m:acc>
+            <m:accPr>
+              <m:chr m:val="‾"/>
+            </m:accPr>
+            <m:e>
+              <m:r>
+                <m:t>N</m:t>
+              </m:r>
+            </m:e>
+          </m:acc>
+          <m:r>
+            <m:t>  </m:t>
+          </m:r>
+          <m:d>
+            <m:dPr>
+              <m:begChr m:val="("/>
+              <m:sepChr m:val=""/>
+              <m:endChr m:val=")"/>
+              <m:grow/>
+            </m:dPr>
+            <m:e>
+              <m:r>
+                <m:t>2</m:t>
+              </m:r>
+            </m:e>
+          </m:d>
+        </m:oMath>
+      </m:oMathPara>
+      <w:bookmarkEnd w:id="22"/>
+    </w:p>
+    <w:p>
+      <w:pPr>
+        <w:pStyle w:val="FirstParagraph"/>
+      </w:pPr>
+      <w:bookmarkStart w:id="23" w:name="eq-within"/>
+      <m:oMathPara>
+        <m:oMathParaPr>
+          <m:jc m:val="center"/>
+        </m:oMathParaPr>
+        <m:oMath>
+          <m:sSubSup>
+            <m:e>
+              <m:r>
+                <m:t>N</m:t>
+              </m:r>
+            </m:e>
+            <m:sub>
+              <m:r>
+                <m:t>i</m:t>
+              </m:r>
+              <m:r>
+                <m:t>j</m:t>
+              </m:r>
+            </m:sub>
+            <m:sup>
+              <m:r>
+                <m:t>W</m:t>
+              </m:r>
+            </m:sup>
+          </m:sSubSup>
+          <m:r>
+            <m:rPr>
+              <m:sty m:val="p"/>
+            </m:rPr>
+            <m:t>=</m:t>
+          </m:r>
+          <m:sSub>
+            <m:e>
+              <m:r>
+                <m:t>N</m:t>
+              </m:r>
+            </m:e>
+            <m:sub>
+              <m:r>
+                <m:t>i</m:t>
+              </m:r>
+              <m:r>
+                <m:t>j</m:t>
+              </m:r>
+            </m:sub>
+          </m:sSub>
+          <m:r>
+            <m:rPr>
+              <m:sty m:val="p"/>
+            </m:rPr>
+            <m:t>−</m:t>
+          </m:r>
+          <m:sSub>
+            <m:e>
+              <m:acc>
+                <m:accPr>
+                  <m:chr m:val="‾"/>
+                </m:accPr>
+                <m:e>
+                  <m:r>
+                    <m:t>N</m:t>
+                  </m:r>
+                </m:e>
+              </m:acc>
+            </m:e>
+            <m:sub>
+              <m:r>
+                <m:t>i</m:t>
+              </m:r>
+            </m:sub>
+          </m:sSub>
+          <m:r>
+            <m:t>  </m:t>
+          </m:r>
+          <m:d>
+            <m:dPr>
+              <m:begChr m:val="("/>
+              <m:sepChr m:val=""/>
+              <m:endChr m:val=")"/>
+              <m:grow/>
+            </m:dPr>
+            <m:e>
+              <m:r>
+                <m:t>3</m:t>
+              </m:r>
+            </m:e>
+          </m:d>
+        </m:oMath>
+      </m:oMathPara>
+      <w:bookmarkEnd w:id="23"/>
+    </w:p>
+    <w:bookmarkStart w:id="27" w:name="egg-number-submodel"/>
+    <w:p>
+      <w:pPr>
+        <w:pStyle w:val="Heading3"/>
+      </w:pPr>
+      <w:r>
+        <w:t xml:space="preserve">Egg number submodel</w:t>
+      </w:r>
+    </w:p>
+    <w:p>
+      <w:pPr>
+        <w:pStyle w:val="FirstParagraph"/>
+      </w:pPr>
+      <w:r>
+        <w:t xml:space="preserve">Egg number was modelled using a negative binomial distribution with a log link:</w:t>
+      </w:r>
+    </w:p>
+    <w:p>
+      <w:pPr>
+        <w:pStyle w:val="BodyText"/>
+      </w:pPr>
+      <w:bookmarkStart w:id="24" w:name="eq-nb_dist"/>
+      <m:oMathPara>
+        <m:oMathParaPr>
+          <m:jc m:val="center"/>
+        </m:oMathParaPr>
+        <m:oMath>
+          <m:sSub>
+            <m:e>
+              <m:r>
+                <m:t>N</m:t>
+              </m:r>
+            </m:e>
+            <m:sub>
+              <m:r>
+                <m:t>i</m:t>
+              </m:r>
+              <m:r>
+                <m:t>j</m:t>
+              </m:r>
+            </m:sub>
+          </m:sSub>
+          <m:r>
+            <m:rPr>
+              <m:sty m:val="p"/>
+            </m:rPr>
+            <m:t>∼</m:t>
+          </m:r>
+          <m:r>
+            <m:rPr>
+              <m:sty m:val="p"/>
+            </m:rPr>
+            <m:t>N</m:t>
+          </m:r>
+          <m:r>
+            <m:rPr>
+              <m:sty m:val="p"/>
+            </m:rPr>
+            <m:t>e</m:t>
+          </m:r>
+          <m:r>
+            <m:rPr>
+              <m:sty m:val="p"/>
+            </m:rPr>
+            <m:t>g</m:t>
+          </m:r>
+          <m:r>
+            <m:rPr>
+              <m:sty m:val="p"/>
+            </m:rPr>
+            <m:t>B</m:t>
+          </m:r>
+          <m:r>
+            <m:rPr>
+              <m:sty m:val="p"/>
+            </m:rPr>
+            <m:t>i</m:t>
+          </m:r>
+          <m:r>
+            <m:rPr>
+              <m:sty m:val="p"/>
+            </m:rPr>
+            <m:t>n</m:t>
+          </m:r>
+          <m:r>
+            <m:rPr>
+              <m:sty m:val="p"/>
+            </m:rPr>
+            <m:t>o</m:t>
+          </m:r>
+          <m:r>
+            <m:rPr>
+              <m:sty m:val="p"/>
+            </m:rPr>
+            <m:t>m</m:t>
+          </m:r>
+          <m:r>
+            <m:rPr>
+              <m:sty m:val="p"/>
+            </m:rPr>
+            <m:t>i</m:t>
+          </m:r>
+          <m:r>
+            <m:rPr>
+              <m:sty m:val="p"/>
+            </m:rPr>
+            <m:t>a</m:t>
+          </m:r>
+          <m:r>
+            <m:rPr>
+              <m:sty m:val="p"/>
+            </m:rPr>
+            <m:t>l</m:t>
+          </m:r>
+          <m:d>
+            <m:dPr>
+              <m:begChr m:val="("/>
+              <m:sepChr m:val=""/>
+              <m:endChr m:val=")"/>
+              <m:grow/>
+            </m:dPr>
+            <m:e>
+              <m:sSub>
+                <m:e>
+                  <m:r>
+                    <m:t>μ</m:t>
+                  </m:r>
+                </m:e>
+                <m:sub>
+                  <m:r>
+                    <m:t>i</m:t>
+                  </m:r>
+                  <m:r>
+                    <m:t>j</m:t>
+                  </m:r>
+                </m:sub>
+              </m:sSub>
+              <m:r>
+                <m:rPr>
+                  <m:sty m:val="p"/>
+                </m:rPr>
+                <m:t>,</m:t>
+              </m:r>
+              <m:r>
+                <m:t>θ</m:t>
+              </m:r>
+            </m:e>
+          </m:d>
+          <m:r>
+            <m:t>  </m:t>
+          </m:r>
+          <m:d>
+            <m:dPr>
+              <m:begChr m:val="("/>
+              <m:sepChr m:val=""/>
+              <m:endChr m:val=")"/>
+              <m:grow/>
+            </m:dPr>
+            <m:e>
+              <m:r>
+                <m:t>4</m:t>
+              </m:r>
+            </m:e>
+          </m:d>
+        </m:oMath>
+      </m:oMathPara>
+      <w:bookmarkEnd w:id="24"/>
+    </w:p>
+    <w:p>
+      <w:pPr>
+        <w:pStyle w:val="FirstParagraph"/>
+      </w:pPr>
+      <w:bookmarkStart w:id="25" w:name="eq-nb_link"/>
+      <m:oMathPara>
+        <m:oMathParaPr>
+          <m:jc m:val="center"/>
+        </m:oMathParaPr>
+        <m:oMath>
+          <m:r>
+            <m:rPr>
+              <m:sty m:val="p"/>
+            </m:rPr>
+            <m:t>log</m:t>
+          </m:r>
+          <m:d>
+            <m:dPr>
+              <m:begChr m:val="("/>
+              <m:sepChr m:val=""/>
+              <m:endChr m:val=")"/>
+              <m:grow/>
+            </m:dPr>
+            <m:e>
+              <m:sSub>
+                <m:e>
+                  <m:r>
+                    <m:t>μ</m:t>
+                  </m:r>
+                </m:e>
+                <m:sub>
+                  <m:r>
+                    <m:t>i</m:t>
+                  </m:r>
+                  <m:r>
+                    <m:t>j</m:t>
+                  </m:r>
+                </m:sub>
+              </m:sSub>
+            </m:e>
+          </m:d>
+          <m:r>
+            <m:rPr>
+              <m:sty m:val="p"/>
+            </m:rPr>
+            <m:t>=</m:t>
+          </m:r>
+          <m:sSubSup>
+            <m:e>
+              <m:r>
+                <m:t>β</m:t>
+              </m:r>
+            </m:e>
+            <m:sub>
+              <m:r>
+                <m:t>0</m:t>
+              </m:r>
+            </m:sub>
+            <m:sup>
+              <m:r>
+                <m:t>N</m:t>
+              </m:r>
+            </m:sup>
+          </m:sSubSup>
+          <m:r>
+            <m:rPr>
+              <m:sty m:val="p"/>
+            </m:rPr>
+            <m:t>+</m:t>
+          </m:r>
+          <m:sSubSup>
+            <m:e>
+              <m:r>
+                <m:t>β</m:t>
+              </m:r>
+            </m:e>
+            <m:sub>
+              <m:r>
+                <m:t>1</m:t>
+              </m:r>
+            </m:sub>
+            <m:sup>
+              <m:r>
+                <m:t>N</m:t>
+              </m:r>
+            </m:sup>
+          </m:sSubSup>
+          <m:sSub>
+            <m:e>
+              <m:r>
+                <m:rPr>
+                  <m:sty m:val="p"/>
+                </m:rPr>
+                <m:t>B</m:t>
+              </m:r>
+              <m:r>
+                <m:rPr>
+                  <m:sty m:val="p"/>
+                </m:rPr>
+                <m:t>r</m:t>
+              </m:r>
+              <m:r>
+                <m:rPr>
+                  <m:sty m:val="p"/>
+                </m:rPr>
+                <m:t>o</m:t>
+              </m:r>
+              <m:r>
+                <m:rPr>
+                  <m:sty m:val="p"/>
+                </m:rPr>
+                <m:t>o</m:t>
+              </m:r>
+              <m:r>
+                <m:rPr>
+                  <m:sty m:val="p"/>
+                </m:rPr>
+                <m:t>d</m:t>
+              </m:r>
+            </m:e>
+            <m:sub>
+              <m:r>
+                <m:t>i</m:t>
+              </m:r>
+              <m:r>
+                <m:t>j</m:t>
+              </m:r>
+            </m:sub>
+          </m:sSub>
+          <m:r>
+            <m:rPr>
+              <m:sty m:val="p"/>
+            </m:rPr>
+            <m:t>+</m:t>
+          </m:r>
+          <m:sSubSup>
+            <m:e>
+              <m:r>
+                <m:t>u</m:t>
+              </m:r>
+            </m:e>
+            <m:sub>
+              <m:r>
+                <m:t>0</m:t>
+              </m:r>
+              <m:r>
+                <m:t>i</m:t>
+              </m:r>
+            </m:sub>
+            <m:sup>
+              <m:r>
+                <m:t>N</m:t>
+              </m:r>
+            </m:sup>
+          </m:sSubSup>
+          <m:r>
+            <m:t>  </m:t>
+          </m:r>
+          <m:d>
+            <m:dPr>
+              <m:begChr m:val="("/>
+              <m:sepChr m:val=""/>
+              <m:endChr m:val=")"/>
+              <m:grow/>
+            </m:dPr>
+            <m:e>
+              <m:r>
+                <m:t>5</m:t>
+              </m:r>
+            </m:e>
+          </m:d>
+        </m:oMath>
+      </m:oMathPara>
+      <w:bookmarkEnd w:id="25"/>
+    </w:p>
+    <w:p>
+      <w:pPr>
+        <w:pStyle w:val="FirstParagraph"/>
+      </w:pPr>
+      <w:r>
+        <w:t xml:space="preserve">where</w:t>
+      </w:r>
+    </w:p>
+    <w:p>
+      <w:pPr>
+        <w:pStyle w:val="BodyText"/>
+      </w:pPr>
+      <w:bookmarkStart w:id="26" w:name="eq-nb_random"/>
+      <m:oMathPara>
+        <m:oMathParaPr>
+          <m:jc m:val="center"/>
+        </m:oMathParaPr>
+        <m:oMath>
+          <m:sSubSup>
+            <m:e>
+              <m:r>
+                <m:t>u</m:t>
+              </m:r>
+            </m:e>
+            <m:sub>
+              <m:r>
+                <m:t>0</m:t>
+              </m:r>
+              <m:r>
+                <m:t>i</m:t>
+              </m:r>
+            </m:sub>
+            <m:sup>
+              <m:r>
+                <m:t>N</m:t>
+              </m:r>
+            </m:sup>
+          </m:sSubSup>
+          <m:r>
+            <m:rPr>
+              <m:sty m:val="p"/>
+            </m:rPr>
+            <m:t>∼</m:t>
+          </m:r>
+          <m:r>
+            <m:rPr>
+              <m:sty m:val="p"/>
+              <m:scr m:val="script"/>
+            </m:rPr>
+            <m:t>N</m:t>
+          </m:r>
+          <m:d>
+            <m:dPr>
+              <m:begChr m:val="("/>
+              <m:sepChr m:val=""/>
+              <m:endChr m:val=")"/>
+              <m:grow/>
+            </m:dPr>
+            <m:e>
+              <m:r>
+                <m:t>0</m:t>
+              </m:r>
+              <m:r>
+                <m:rPr>
+                  <m:sty m:val="p"/>
+                </m:rPr>
+                <m:t>,</m:t>
+              </m:r>
+              <m:sSubSup>
+                <m:e>
+                  <m:r>
+                    <m:t>σ</m:t>
+                  </m:r>
+                </m:e>
+                <m:sub>
+                  <m:r>
+                    <m:t>N</m:t>
+                  </m:r>
+                </m:sub>
+                <m:sup>
+                  <m:r>
+                    <m:t>2</m:t>
+                  </m:r>
+                </m:sup>
+              </m:sSubSup>
+            </m:e>
+          </m:d>
+          <m:r>
+            <m:t>  </m:t>
+          </m:r>
+          <m:d>
+            <m:dPr>
+              <m:begChr m:val="("/>
+              <m:sepChr m:val=""/>
+              <m:endChr m:val=")"/>
+              <m:grow/>
+            </m:dPr>
+            <m:e>
+              <m:r>
+                <m:t>6</m:t>
+              </m:r>
+            </m:e>
+          </m:d>
+        </m:oMath>
+      </m:oMathPara>
+      <w:bookmarkEnd w:id="26"/>
+    </w:p>
+    <w:bookmarkEnd w:id="27"/>
+    <w:bookmarkStart w:id="31" w:name="mean-egg-size-submodel"/>
+    <w:p>
+      <w:pPr>
+        <w:pStyle w:val="Heading3"/>
+      </w:pPr>
+      <w:r>
+        <w:t xml:space="preserve">Mean egg size submodel</w:t>
+      </w:r>
+    </w:p>
+    <w:p>
+      <w:pPr>
+        <w:pStyle w:val="FirstParagraph"/>
+      </w:pPr>
+      <w:r>
+        <w:t xml:space="preserve">Mean egg size was modelled as</w:t>
+      </w:r>
+    </w:p>
+    <w:p>
+      <w:pPr>
+        <w:pStyle w:val="BodyText"/>
+      </w:pPr>
+      <w:bookmarkStart w:id="28" w:name="eq-gauss_dist"/>
+      <m:oMathPara>
+        <m:oMathParaPr>
+          <m:jc m:val="center"/>
+        </m:oMathParaPr>
+        <m:oMath>
+          <m:sSub>
+            <m:e>
+              <m:r>
+                <m:t>S</m:t>
+              </m:r>
+            </m:e>
+            <m:sub>
+              <m:r>
+                <m:t>i</m:t>
+              </m:r>
+              <m:r>
+                <m:t>j</m:t>
+              </m:r>
+            </m:sub>
+          </m:sSub>
+          <m:r>
+            <m:rPr>
+              <m:sty m:val="p"/>
+            </m:rPr>
+            <m:t>∼</m:t>
+          </m:r>
+          <m:r>
+            <m:rPr>
+              <m:sty m:val="p"/>
+              <m:scr m:val="script"/>
+            </m:rPr>
+            <m:t>N</m:t>
+          </m:r>
+          <m:d>
+            <m:dPr>
+              <m:begChr m:val="("/>
+              <m:sepChr m:val=""/>
+              <m:endChr m:val=")"/>
+              <m:grow/>
+            </m:dPr>
+            <m:e>
+              <m:sSubSup>
+                <m:e>
+                  <m:r>
+                    <m:t>μ</m:t>
+                  </m:r>
+                </m:e>
+                <m:sub>
+                  <m:r>
+                    <m:t>i</m:t>
+                  </m:r>
+                  <m:r>
+                    <m:t>j</m:t>
+                  </m:r>
+                </m:sub>
+                <m:sup>
+                  <m:r>
+                    <m:t>S</m:t>
+                  </m:r>
+                </m:sup>
+              </m:sSubSup>
+              <m:r>
+                <m:rPr>
+                  <m:sty m:val="p"/>
+                </m:rPr>
+                <m:t>,</m:t>
+              </m:r>
+              <m:sSubSup>
+                <m:e>
+                  <m:r>
+                    <m:t>σ</m:t>
+                  </m:r>
+                </m:e>
+                <m:sub>
+                  <m:r>
+                    <m:t>S</m:t>
+                  </m:r>
+                </m:sub>
+                <m:sup>
+                  <m:r>
+                    <m:t>2</m:t>
+                  </m:r>
+                </m:sup>
+              </m:sSubSup>
+            </m:e>
+          </m:d>
+          <m:r>
+            <m:t>  </m:t>
+          </m:r>
+          <m:d>
+            <m:dPr>
+              <m:begChr m:val="("/>
+              <m:sepChr m:val=""/>
+              <m:endChr m:val=")"/>
+              <m:grow/>
+            </m:dPr>
+            <m:e>
+              <m:r>
+                <m:t>7</m:t>
+              </m:r>
+            </m:e>
+          </m:d>
+        </m:oMath>
+      </m:oMathPara>
+      <w:bookmarkEnd w:id="28"/>
+    </w:p>
+    <w:p>
+      <w:pPr>
+        <w:pStyle w:val="FirstParagraph"/>
+      </w:pPr>
+      <w:bookmarkStart w:id="29" w:name="eq-gauss_link"/>
+      <m:oMathPara>
+        <m:oMathParaPr>
+          <m:jc m:val="center"/>
+        </m:oMathParaPr>
+        <m:oMath>
+          <m:sSubSup>
+            <m:e>
+              <m:r>
+                <m:t>μ</m:t>
+              </m:r>
+            </m:e>
+            <m:sub>
+              <m:r>
+                <m:t>i</m:t>
+              </m:r>
+              <m:r>
+                <m:t>j</m:t>
+              </m:r>
+            </m:sub>
+            <m:sup>
+              <m:r>
+                <m:t>S</m:t>
+              </m:r>
+            </m:sup>
+          </m:sSubSup>
+          <m:r>
+            <m:rPr>
+              <m:sty m:val="p"/>
+            </m:rPr>
+            <m:t>=</m:t>
+          </m:r>
+          <m:sSubSup>
+            <m:e>
+              <m:r>
+                <m:t>β</m:t>
+              </m:r>
+            </m:e>
+            <m:sub>
+              <m:r>
+                <m:t>0</m:t>
+              </m:r>
+            </m:sub>
+            <m:sup>
+              <m:r>
+                <m:t>S</m:t>
+              </m:r>
+            </m:sup>
+          </m:sSubSup>
+          <m:r>
+            <m:rPr>
+              <m:sty m:val="p"/>
+            </m:rPr>
+            <m:t>+</m:t>
+          </m:r>
+          <m:sSubSup>
+            <m:e>
+              <m:r>
+                <m:t>β</m:t>
+              </m:r>
+            </m:e>
+            <m:sub>
+              <m:r>
+                <m:t>1</m:t>
+              </m:r>
+            </m:sub>
+            <m:sup>
+              <m:r>
+                <m:t>S</m:t>
+              </m:r>
+            </m:sup>
+          </m:sSubSup>
+          <m:sSub>
+            <m:e>
+              <m:r>
+                <m:rPr>
+                  <m:sty m:val="p"/>
+                </m:rPr>
+                <m:t>B</m:t>
+              </m:r>
+              <m:r>
+                <m:rPr>
+                  <m:sty m:val="p"/>
+                </m:rPr>
+                <m:t>r</m:t>
+              </m:r>
+              <m:r>
+                <m:rPr>
+                  <m:sty m:val="p"/>
+                </m:rPr>
+                <m:t>o</m:t>
+              </m:r>
+              <m:r>
+                <m:rPr>
+                  <m:sty m:val="p"/>
+                </m:rPr>
+                <m:t>o</m:t>
+              </m:r>
+              <m:r>
+                <m:rPr>
+                  <m:sty m:val="p"/>
+                </m:rPr>
+                <m:t>d</m:t>
+              </m:r>
+            </m:e>
+            <m:sub>
+              <m:r>
+                <m:t>i</m:t>
+              </m:r>
+              <m:r>
+                <m:t>j</m:t>
+              </m:r>
+            </m:sub>
+          </m:sSub>
+          <m:r>
+            <m:rPr>
+              <m:sty m:val="p"/>
+            </m:rPr>
+            <m:t>+</m:t>
+          </m:r>
+          <m:sSub>
+            <m:e>
+              <m:r>
+                <m:t>β</m:t>
+              </m:r>
+            </m:e>
+            <m:sub>
+              <m:r>
+                <m:t>W</m:t>
+              </m:r>
+            </m:sub>
+          </m:sSub>
+          <m:sSubSup>
+            <m:e>
+              <m:r>
+                <m:t>N</m:t>
+              </m:r>
+            </m:e>
+            <m:sub>
+              <m:r>
+                <m:t>i</m:t>
+              </m:r>
+              <m:r>
+                <m:t>j</m:t>
+              </m:r>
+            </m:sub>
+            <m:sup>
+              <m:r>
+                <m:t>W</m:t>
+              </m:r>
+            </m:sup>
+          </m:sSubSup>
+          <m:r>
+            <m:rPr>
+              <m:sty m:val="p"/>
+            </m:rPr>
+            <m:t>+</m:t>
+          </m:r>
+          <m:sSub>
+            <m:e>
+              <m:r>
+                <m:t>β</m:t>
+              </m:r>
+            </m:e>
+            <m:sub>
+              <m:r>
+                <m:t>B</m:t>
+              </m:r>
+            </m:sub>
+          </m:sSub>
+          <m:sSubSup>
+            <m:e>
+              <m:r>
+                <m:t>N</m:t>
+              </m:r>
+            </m:e>
+            <m:sub>
+              <m:r>
+                <m:t>i</m:t>
+              </m:r>
+            </m:sub>
+            <m:sup>
+              <m:r>
+                <m:t>B</m:t>
+              </m:r>
+            </m:sup>
+          </m:sSubSup>
+          <m:r>
+            <m:rPr>
+              <m:sty m:val="p"/>
+            </m:rPr>
+            <m:t>+</m:t>
+          </m:r>
+          <m:sSubSup>
+            <m:e>
+              <m:r>
+                <m:t>u</m:t>
+              </m:r>
+            </m:e>
+            <m:sub>
+              <m:r>
+                <m:t>0</m:t>
+              </m:r>
+              <m:r>
+                <m:t>i</m:t>
+              </m:r>
+            </m:sub>
+            <m:sup>
+              <m:r>
+                <m:t>S</m:t>
+              </m:r>
+            </m:sup>
+          </m:sSubSup>
+          <m:r>
+            <m:t>  </m:t>
+          </m:r>
+          <m:d>
+            <m:dPr>
+              <m:begChr m:val="("/>
+              <m:sepChr m:val=""/>
+              <m:endChr m:val=")"/>
+              <m:grow/>
+            </m:dPr>
+            <m:e>
+              <m:r>
+                <m:t>8</m:t>
+              </m:r>
+            </m:e>
+          </m:d>
+        </m:oMath>
+      </m:oMathPara>
+      <w:bookmarkEnd w:id="29"/>
+    </w:p>
+    <w:p>
+      <w:pPr>
+        <w:pStyle w:val="FirstParagraph"/>
+      </w:pPr>
+      <w:r>
+        <w:t xml:space="preserve">with</w:t>
+      </w:r>
+    </w:p>
+    <w:p>
+      <w:pPr>
+        <w:pStyle w:val="BodyText"/>
+      </w:pPr>
+      <w:bookmarkStart w:id="30" w:name="eq-gauss_random"/>
+      <m:oMathPara>
+        <m:oMathParaPr>
+          <m:jc m:val="center"/>
+        </m:oMathParaPr>
+        <m:oMath>
+          <m:sSubSup>
+            <m:e>
+              <m:r>
+                <m:t>u</m:t>
+              </m:r>
+            </m:e>
+            <m:sub>
+              <m:r>
+                <m:t>0</m:t>
+              </m:r>
+              <m:r>
+                <m:t>i</m:t>
+              </m:r>
+            </m:sub>
+            <m:sup>
+              <m:r>
+                <m:t>S</m:t>
+              </m:r>
+            </m:sup>
+          </m:sSubSup>
+          <m:r>
+            <m:rPr>
+              <m:sty m:val="p"/>
+            </m:rPr>
+            <m:t>∼</m:t>
+          </m:r>
+          <m:r>
+            <m:rPr>
+              <m:sty m:val="p"/>
+              <m:scr m:val="script"/>
+            </m:rPr>
+            <m:t>N</m:t>
+          </m:r>
+          <m:d>
+            <m:dPr>
+              <m:begChr m:val="("/>
+              <m:sepChr m:val=""/>
+              <m:endChr m:val=")"/>
+              <m:grow/>
+            </m:dPr>
+            <m:e>
+              <m:r>
+                <m:t>0</m:t>
+              </m:r>
+              <m:r>
+                <m:rPr>
+                  <m:sty m:val="p"/>
+                </m:rPr>
+                <m:t>,</m:t>
+              </m:r>
+              <m:sSubSup>
+                <m:e>
+                  <m:r>
+                    <m:t>σ</m:t>
+                  </m:r>
+                </m:e>
+                <m:sub>
+                  <m:r>
+                    <m:t>S</m:t>
+                  </m:r>
+                  <m:r>
+                    <m:rPr>
+                      <m:sty m:val="p"/>
+                    </m:rPr>
+                    <m:t>,</m:t>
+                  </m:r>
+                  <m:r>
+                    <m:t>i</m:t>
+                  </m:r>
+                  <m:r>
+                    <m:t>d</m:t>
+                  </m:r>
+                </m:sub>
+                <m:sup>
+                  <m:r>
+                    <m:t>2</m:t>
+                  </m:r>
+                </m:sup>
+              </m:sSubSup>
+            </m:e>
+          </m:d>
+          <m:r>
+            <m:t>  </m:t>
+          </m:r>
+          <m:d>
+            <m:dPr>
+              <m:begChr m:val="("/>
+              <m:sepChr m:val=""/>
+              <m:endChr m:val=")"/>
+              <m:grow/>
+            </m:dPr>
+            <m:e>
+              <m:r>
+                <m:t>9</m:t>
+              </m:r>
+            </m:e>
+          </m:d>
+        </m:oMath>
+      </m:oMathPara>
+      <w:bookmarkEnd w:id="30"/>
+    </w:p>
+    <w:bookmarkEnd w:id="31"/>
+    <w:bookmarkStart w:id="35" w:name="multivariate-structure"/>
+    <w:p>
+      <w:pPr>
+        <w:pStyle w:val="Heading3"/>
+      </w:pPr>
+      <w:r>
+        <w:t xml:space="preserve">Multivariate structure</w:t>
+      </w:r>
+    </w:p>
+    <w:p>
+      <w:pPr>
+        <w:pStyle w:val="FirstParagraph"/>
+      </w:pPr>
+      <w:r>
+        <w:t xml:space="preserve">The two submodels were fit jointly:</w:t>
+      </w:r>
+    </w:p>
+    <w:p>
+      <w:pPr>
+        <w:pStyle w:val="BodyText"/>
+      </w:pPr>
+      <w:bookmarkStart w:id="32" w:name="eq-mvn"/>
+      <m:oMathPara>
+        <m:oMathParaPr>
+          <m:jc m:val="center"/>
+        </m:oMathParaPr>
+        <m:oMath>
+          <m:d>
+            <m:dPr>
+              <m:begChr m:val="("/>
+              <m:sepChr m:val=""/>
+              <m:endChr m:val=")"/>
+              <m:grow/>
+            </m:dPr>
+            <m:e>
+              <m:m>
+                <m:mPr>
+                  <m:baseJc m:val="center"/>
+                  <m:plcHide m:val="on"/>
+                  <m:mcs>
+                    <m:mc>
+                      <m:mcPr>
+                        <m:mcJc m:val="center"/>
+                        <m:count m:val="1"/>
+                      </m:mcPr>
+                    </m:mc>
+                  </m:mcs>
+                </m:mPr>
+                <m:mr>
+                  <m:e>
+                    <m:sSubSup>
+                      <m:e>
+                        <m:r>
+                          <m:t>u</m:t>
+                        </m:r>
+                      </m:e>
+                      <m:sub>
+                        <m:r>
+                          <m:t>0</m:t>
+                        </m:r>
+                        <m:r>
+                          <m:t>i</m:t>
+                        </m:r>
+                      </m:sub>
+                      <m:sup>
+                        <m:r>
+                          <m:t>N</m:t>
+                        </m:r>
+                      </m:sup>
+                    </m:sSubSup>
+                  </m:e>
+                </m:mr>
+                <m:mr>
+                  <m:e>
+                    <m:sSubSup>
+                      <m:e>
+                        <m:r>
+                          <m:t>u</m:t>
+                        </m:r>
+                      </m:e>
+                      <m:sub>
+                        <m:r>
+                          <m:t>0</m:t>
+                        </m:r>
+                        <m:r>
+                          <m:t>i</m:t>
+                        </m:r>
+                      </m:sub>
+                      <m:sup>
+                        <m:r>
+                          <m:t>S</m:t>
+                        </m:r>
+                      </m:sup>
+                    </m:sSubSup>
+                  </m:e>
+                </m:mr>
+              </m:m>
+            </m:e>
+          </m:d>
+          <m:r>
+            <m:rPr>
+              <m:sty m:val="p"/>
+            </m:rPr>
+            <m:t>∼</m:t>
+          </m:r>
+          <m:r>
+            <m:rPr>
+              <m:sty m:val="p"/>
+              <m:scr m:val="script"/>
+            </m:rPr>
+            <m:t>M</m:t>
+          </m:r>
+          <m:r>
+            <m:rPr>
+              <m:sty m:val="p"/>
+              <m:scr m:val="script"/>
+            </m:rPr>
+            <m:t>V</m:t>
+          </m:r>
+          <m:r>
+            <m:rPr>
+              <m:sty m:val="p"/>
+              <m:scr m:val="script"/>
+            </m:rPr>
+            <m:t>N</m:t>
+          </m:r>
+          <m:d>
+            <m:dPr>
+              <m:begChr m:val="("/>
+              <m:sepChr m:val=""/>
+              <m:endChr m:val=")"/>
+              <m:grow/>
+            </m:dPr>
+            <m:e>
+              <m:d>
+                <m:dPr>
+                  <m:begChr m:val="("/>
+                  <m:sepChr m:val=""/>
+                  <m:endChr m:val=")"/>
+                  <m:grow/>
+                </m:dPr>
+                <m:e>
+                  <m:m>
+                    <m:mPr>
+                      <m:baseJc m:val="center"/>
+                      <m:plcHide m:val="on"/>
+                      <m:mcs>
+                        <m:mc>
+                          <m:mcPr>
+                            <m:mcJc m:val="center"/>
+                            <m:count m:val="1"/>
+                          </m:mcPr>
+                        </m:mc>
+                      </m:mcs>
+                    </m:mPr>
+                    <m:mr>
+                      <m:e>
+                        <m:r>
+                          <m:t>0</m:t>
+                        </m:r>
+                      </m:e>
+                    </m:mr>
+                    <m:mr>
+                      <m:e>
+                        <m:r>
+                          <m:t>0</m:t>
+                        </m:r>
+                      </m:e>
+                    </m:mr>
+                  </m:m>
+                </m:e>
+              </m:d>
+              <m:r>
+                <m:rPr>
+                  <m:sty m:val="p"/>
+                </m:rPr>
+                <m:t>,</m:t>
+              </m:r>
+              <m:r>
+                <m:t>Σ</m:t>
+              </m:r>
+            </m:e>
+          </m:d>
+          <m:r>
+            <m:t>  </m:t>
+          </m:r>
+          <m:d>
+            <m:dPr>
+              <m:begChr m:val="("/>
+              <m:sepChr m:val=""/>
+              <m:endChr m:val=")"/>
+              <m:grow/>
+            </m:dPr>
+            <m:e>
+              <m:r>
+                <m:t>10</m:t>
+              </m:r>
+            </m:e>
+          </m:d>
+        </m:oMath>
+      </m:oMathPara>
+      <w:bookmarkEnd w:id="32"/>
+    </w:p>
+    <w:p>
+      <w:pPr>
+        <w:pStyle w:val="FirstParagraph"/>
+      </w:pPr>
+      <w:r>
+        <w:t xml:space="preserve">where</w:t>
+      </w:r>
+    </w:p>
+    <w:p>
+      <w:pPr>
+        <w:pStyle w:val="BodyText"/>
+      </w:pPr>
+      <w:bookmarkStart w:id="33" w:name="eq-sigma_matrix"/>
+      <m:oMathPara>
+        <m:oMathParaPr>
+          <m:jc m:val="center"/>
+        </m:oMathParaPr>
+        <m:oMath>
+          <m:r>
+            <m:t>Σ</m:t>
+          </m:r>
+          <m:r>
+            <m:rPr>
+              <m:sty m:val="p"/>
+            </m:rPr>
+            <m:t>=</m:t>
+          </m:r>
+          <m:d>
+            <m:dPr>
+              <m:begChr m:val="("/>
+              <m:sepChr m:val=""/>
+              <m:endChr m:val=")"/>
+              <m:grow/>
+            </m:dPr>
+            <m:e>
+              <m:m>
+                <m:mPr>
+                  <m:baseJc m:val="center"/>
+                  <m:plcHide m:val="on"/>
+                  <m:mcs>
+                    <m:mc>
+                      <m:mcPr>
+                        <m:mcJc m:val="center"/>
+                        <m:count m:val="1"/>
+                      </m:mcPr>
+                    </m:mc>
+                    <m:mc>
+                      <m:mcPr>
+                        <m:mcJc m:val="center"/>
+                        <m:count m:val="1"/>
+                      </m:mcPr>
+                    </m:mc>
+                  </m:mcs>
+                </m:mPr>
+                <m:mr>
+                  <m:e>
+                    <m:sSubSup>
+                      <m:e>
+                        <m:r>
+                          <m:t>σ</m:t>
+                        </m:r>
+                      </m:e>
+                      <m:sub>
+                        <m:r>
+                          <m:t>N</m:t>
+                        </m:r>
+                      </m:sub>
+                      <m:sup>
+                        <m:r>
+                          <m:t>2</m:t>
+                        </m:r>
+                      </m:sup>
+                    </m:sSubSup>
+                  </m:e>
+                  <m:e>
+                    <m:sSub>
+                      <m:e>
+                        <m:r>
+                          <m:t>σ</m:t>
+                        </m:r>
+                      </m:e>
+                      <m:sub>
+                        <m:r>
+                          <m:t>N</m:t>
+                        </m:r>
+                        <m:r>
+                          <m:t>S</m:t>
+                        </m:r>
+                      </m:sub>
+                    </m:sSub>
+                  </m:e>
+                </m:mr>
+                <m:mr>
+                  <m:e>
+                    <m:sSub>
+                      <m:e>
+                        <m:r>
+                          <m:t>σ</m:t>
+                        </m:r>
+                      </m:e>
+                      <m:sub>
+                        <m:r>
+                          <m:t>N</m:t>
+                        </m:r>
+                        <m:r>
+                          <m:t>S</m:t>
+                        </m:r>
+                      </m:sub>
+                    </m:sSub>
+                  </m:e>
+                  <m:e>
+                    <m:sSubSup>
+                      <m:e>
+                        <m:r>
+                          <m:t>σ</m:t>
+                        </m:r>
+                      </m:e>
+                      <m:sub>
+                        <m:r>
+                          <m:t>S</m:t>
+                        </m:r>
+                        <m:r>
+                          <m:rPr>
+                            <m:sty m:val="p"/>
+                          </m:rPr>
+                          <m:t>,</m:t>
+                        </m:r>
+                        <m:r>
+                          <m:t>i</m:t>
+                        </m:r>
+                        <m:r>
+                          <m:t>d</m:t>
+                        </m:r>
+                      </m:sub>
+                      <m:sup>
+                        <m:r>
+                          <m:t>2</m:t>
+                        </m:r>
+                      </m:sup>
+                    </m:sSubSup>
+                  </m:e>
+                </m:mr>
+              </m:m>
+            </m:e>
+          </m:d>
+          <m:r>
+            <m:t>  </m:t>
+          </m:r>
+          <m:d>
+            <m:dPr>
+              <m:begChr m:val="("/>
+              <m:sepChr m:val=""/>
+              <m:endChr m:val=")"/>
+              <m:grow/>
+            </m:dPr>
+            <m:e>
+              <m:r>
+                <m:t>11</m:t>
+              </m:r>
+            </m:e>
+          </m:d>
+        </m:oMath>
+      </m:oMathPara>
+      <w:bookmarkEnd w:id="33"/>
+    </w:p>
+    <w:p>
+      <w:pPr>
+        <w:pStyle w:val="FirstParagraph"/>
+      </w:pPr>
+      <w:r>
+        <w:t xml:space="preserve">The intercept correlation is</w:t>
+      </w:r>
+    </w:p>
+    <w:p>
+      <w:pPr>
+        <w:pStyle w:val="BodyText"/>
+      </w:pPr>
+      <w:bookmarkStart w:id="34" w:name="eq-intercept_corr"/>
+      <m:oMathPara>
+        <m:oMathParaPr>
+          <m:jc m:val="center"/>
+        </m:oMathParaPr>
+        <m:oMath>
+          <m:sSub>
+            <m:e>
+              <m:r>
+                <m:t>ρ</m:t>
+              </m:r>
+            </m:e>
+            <m:sub>
+              <m:r>
+                <m:t>N</m:t>
+              </m:r>
+              <m:r>
+                <m:t>S</m:t>
+              </m:r>
+            </m:sub>
+          </m:sSub>
+          <m:r>
+            <m:rPr>
+              <m:sty m:val="p"/>
+            </m:rPr>
+            <m:t>=</m:t>
+          </m:r>
+          <m:f>
+            <m:fPr>
+              <m:type m:val="bar"/>
+            </m:fPr>
+            <m:num>
+              <m:sSub>
+                <m:e>
+                  <m:r>
+                    <m:t>σ</m:t>
+                  </m:r>
+                </m:e>
+                <m:sub>
+                  <m:r>
+                    <m:t>N</m:t>
+                  </m:r>
+                  <m:r>
+                    <m:t>S</m:t>
+                  </m:r>
+                </m:sub>
+              </m:sSub>
+            </m:num>
+            <m:den>
+              <m:rad>
+                <m:radPr>
+                  <m:degHide m:val="on"/>
+                </m:radPr>
+                <m:deg/>
+                <m:e>
+                  <m:sSubSup>
+                    <m:e>
+                      <m:r>
+                        <m:t>σ</m:t>
+                      </m:r>
+                    </m:e>
+                    <m:sub>
+                      <m:r>
+                        <m:t>N</m:t>
+                      </m:r>
+                    </m:sub>
+                    <m:sup>
+                      <m:r>
+                        <m:t>2</m:t>
+                      </m:r>
+                    </m:sup>
+                  </m:sSubSup>
+                  <m:sSubSup>
+                    <m:e>
+                      <m:r>
+                        <m:t>σ</m:t>
+                      </m:r>
+                    </m:e>
+                    <m:sub>
+                      <m:r>
+                        <m:t>S</m:t>
+                      </m:r>
+                      <m:r>
+                        <m:rPr>
+                          <m:sty m:val="p"/>
+                        </m:rPr>
+                        <m:t>,</m:t>
+                      </m:r>
+                      <m:r>
+                        <m:t>i</m:t>
+                      </m:r>
+                      <m:r>
+                        <m:t>d</m:t>
+                      </m:r>
+                    </m:sub>
+                    <m:sup>
+                      <m:r>
+                        <m:t>2</m:t>
+                      </m:r>
+                    </m:sup>
+                  </m:sSubSup>
+                </m:e>
+              </m:rad>
+            </m:den>
+          </m:f>
+          <m:r>
+            <m:t>  </m:t>
+          </m:r>
+          <m:d>
+            <m:dPr>
+              <m:begChr m:val="("/>
+              <m:sepChr m:val=""/>
+              <m:endChr m:val=")"/>
+              <m:grow/>
+            </m:dPr>
+            <m:e>
+              <m:r>
+                <m:t>12</m:t>
+              </m:r>
+            </m:e>
+          </m:d>
+        </m:oMath>
+      </m:oMathPara>
+      <w:bookmarkEnd w:id="34"/>
+    </w:p>
+    <w:bookmarkEnd w:id="35"/>
+    <w:bookmarkEnd w:id="36"/>
+    <w:bookmarkStart w:id="49" w:name="X0f816ef2495b00e8a187e8ee26189908fbc39c6"/>
+    <w:p>
+      <w:pPr>
+        <w:pStyle w:val="Heading2"/>
+      </w:pPr>
+      <w:r>
+        <w:t xml:space="preserve">Relationship between model parameters and total phenotypic covariance</w:t>
+      </w:r>
+    </w:p>
+    <w:p>
+      <w:pPr>
+        <w:pStyle w:val="FirstParagraph"/>
+      </w:pPr>
+      <w:r>
+        <w:t xml:space="preserve">Total phenotypic covariance can be partitioned as</w:t>
+      </w:r>
+    </w:p>
+    <w:p>
+      <w:pPr>
+        <w:pStyle w:val="BodyText"/>
+      </w:pPr>
+      <w:bookmarkStart w:id="37" w:name="eq-cov_partition"/>
+      <m:oMathPara>
+        <m:oMathParaPr>
+          <m:jc m:val="center"/>
+        </m:oMathParaPr>
+        <m:oMath>
+          <m:sSub>
+            <m:e>
+              <m:r>
+                <m:rPr>
+                  <m:sty m:val="p"/>
+                </m:rPr>
+                <m:t>C</m:t>
+              </m:r>
+              <m:r>
+                <m:rPr>
+                  <m:sty m:val="p"/>
+                </m:rPr>
+                <m:t>o</m:t>
+              </m:r>
+              <m:r>
+                <m:rPr>
+                  <m:sty m:val="p"/>
+                </m:rPr>
+                <m:t>v</m:t>
+              </m:r>
+            </m:e>
+            <m:sub>
+              <m:r>
+                <m:rPr>
+                  <m:nor/>
+                  <m:sty m:val="p"/>
+                </m:rPr>
+                <m:t>total</m:t>
+              </m:r>
+            </m:sub>
+          </m:sSub>
+          <m:r>
+            <m:rPr>
+              <m:sty m:val="p"/>
+            </m:rPr>
+            <m:t>=</m:t>
+          </m:r>
+          <m:sSub>
+            <m:e>
+              <m:r>
+                <m:rPr>
+                  <m:sty m:val="p"/>
+                </m:rPr>
+                <m:t>C</m:t>
+              </m:r>
+              <m:r>
+                <m:rPr>
+                  <m:sty m:val="p"/>
+                </m:rPr>
+                <m:t>o</m:t>
+              </m:r>
+              <m:r>
+                <m:rPr>
+                  <m:sty m:val="p"/>
+                </m:rPr>
+                <m:t>v</m:t>
+              </m:r>
+            </m:e>
+            <m:sub>
+              <m:r>
+                <m:rPr>
+                  <m:nor/>
+                  <m:sty m:val="p"/>
+                </m:rPr>
+                <m:t>within</m:t>
+              </m:r>
+            </m:sub>
+          </m:sSub>
+          <m:r>
+            <m:rPr>
+              <m:sty m:val="p"/>
+            </m:rPr>
+            <m:t>+</m:t>
+          </m:r>
+          <m:sSub>
+            <m:e>
+              <m:r>
+                <m:rPr>
+                  <m:sty m:val="p"/>
+                </m:rPr>
+                <m:t>C</m:t>
+              </m:r>
+              <m:r>
+                <m:rPr>
+                  <m:sty m:val="p"/>
+                </m:rPr>
+                <m:t>o</m:t>
+              </m:r>
+              <m:r>
+                <m:rPr>
+                  <m:sty m:val="p"/>
+                </m:rPr>
+                <m:t>v</m:t>
+              </m:r>
+            </m:e>
+            <m:sub>
+              <m:r>
+                <m:rPr>
+                  <m:nor/>
+                  <m:sty m:val="p"/>
+                </m:rPr>
+                <m:t>among</m:t>
+              </m:r>
+            </m:sub>
+          </m:sSub>
+          <m:r>
+            <m:t>  </m:t>
+          </m:r>
+          <m:d>
+            <m:dPr>
+              <m:begChr m:val="("/>
+              <m:sepChr m:val=""/>
+              <m:endChr m:val=")"/>
+              <m:grow/>
+            </m:dPr>
+            <m:e>
+              <m:r>
+                <m:t>13</m:t>
+              </m:r>
+            </m:e>
+          </m:d>
+        </m:oMath>
+      </m:oMathPara>
+      <w:bookmarkEnd w:id="37"/>
+    </w:p>
+    <w:bookmarkStart w:id="39" w:name="within-female-covariance"/>
+    <w:p>
+      <w:pPr>
+        <w:pStyle w:val="Heading3"/>
+      </w:pPr>
+      <w:r>
+        <w:t xml:space="preserve">Within-female covariance</w:t>
+      </w:r>
+    </w:p>
+    <w:p>
+      <w:pPr>
+        <w:pStyle w:val="FirstParagraph"/>
+      </w:pPr>
+      <w:bookmarkStart w:id="38" w:name="eq-cov_within"/>
+      <m:oMathPara>
+        <m:oMathParaPr>
+          <m:jc m:val="center"/>
+        </m:oMathParaPr>
+        <m:oMath>
+          <m:sSub>
+            <m:e>
+              <m:r>
+                <m:rPr>
+                  <m:sty m:val="p"/>
+                </m:rPr>
+                <m:t>C</m:t>
+              </m:r>
+              <m:r>
+                <m:rPr>
+                  <m:sty m:val="p"/>
+                </m:rPr>
+                <m:t>o</m:t>
+              </m:r>
+              <m:r>
+                <m:rPr>
+                  <m:sty m:val="p"/>
+                </m:rPr>
+                <m:t>v</m:t>
+              </m:r>
+            </m:e>
+            <m:sub>
+              <m:r>
+                <m:rPr>
+                  <m:nor/>
+                  <m:sty m:val="p"/>
+                </m:rPr>
+                <m:t>within</m:t>
+              </m:r>
+            </m:sub>
+          </m:sSub>
+          <m:r>
+            <m:rPr>
+              <m:sty m:val="p"/>
+            </m:rPr>
+            <m:t>=</m:t>
+          </m:r>
+          <m:sSub>
+            <m:e>
+              <m:r>
+                <m:t>β</m:t>
+              </m:r>
+            </m:e>
+            <m:sub>
+              <m:r>
+                <m:t>W</m:t>
+              </m:r>
+            </m:sub>
+          </m:sSub>
+          <m:r>
+            <m:t> </m:t>
+          </m:r>
+          <m:r>
+            <m:rPr>
+              <m:sty m:val="p"/>
+            </m:rPr>
+            <m:t>V</m:t>
+          </m:r>
+          <m:r>
+            <m:rPr>
+              <m:sty m:val="p"/>
+            </m:rPr>
+            <m:t>a</m:t>
+          </m:r>
+          <m:r>
+            <m:rPr>
+              <m:sty m:val="p"/>
+            </m:rPr>
+            <m:t>r</m:t>
+          </m:r>
+          <m:d>
+            <m:dPr>
+              <m:begChr m:val="("/>
+              <m:sepChr m:val=""/>
+              <m:endChr m:val=")"/>
+              <m:grow/>
+            </m:dPr>
+            <m:e>
+              <m:sSubSup>
+                <m:e>
+                  <m:r>
+                    <m:t>N</m:t>
+                  </m:r>
+                </m:e>
+                <m:sub>
+                  <m:r>
+                    <m:t>i</m:t>
+                  </m:r>
+                  <m:r>
+                    <m:t>j</m:t>
+                  </m:r>
+                </m:sub>
+                <m:sup>
+                  <m:r>
+                    <m:t>W</m:t>
+                  </m:r>
+                </m:sup>
+              </m:sSubSup>
+            </m:e>
+          </m:d>
+          <m:r>
+            <m:t>  </m:t>
+          </m:r>
+          <m:d>
+            <m:dPr>
+              <m:begChr m:val="("/>
+              <m:sepChr m:val=""/>
+              <m:endChr m:val=")"/>
+              <m:grow/>
+            </m:dPr>
+            <m:e>
+              <m:r>
+                <m:t>14</m:t>
+              </m:r>
+            </m:e>
+          </m:d>
+        </m:oMath>
+      </m:oMathPara>
+      <w:bookmarkEnd w:id="38"/>
+    </w:p>
+    <w:bookmarkEnd w:id="39"/>
+    <w:bookmarkStart w:id="43" w:name="among-female-covariance"/>
+    <w:p>
+      <w:pPr>
+        <w:pStyle w:val="Heading3"/>
+      </w:pPr>
+      <w:r>
+        <w:t xml:space="preserve">Among-female covariance</w:t>
+      </w:r>
+    </w:p>
+    <w:p>
+      <w:pPr>
+        <w:pStyle w:val="FirstParagraph"/>
+      </w:pPr>
+      <w:bookmarkStart w:id="40" w:name="eq-cov_among_slope"/>
+      <m:oMathPara>
+        <m:oMathParaPr>
+          <m:jc m:val="center"/>
+        </m:oMathParaPr>
+        <m:oMath>
+          <m:sSub>
+            <m:e>
+              <m:r>
+                <m:rPr>
+                  <m:sty m:val="p"/>
+                </m:rPr>
+                <m:t>C</m:t>
+              </m:r>
+              <m:r>
+                <m:rPr>
+                  <m:sty m:val="p"/>
+                </m:rPr>
+                <m:t>o</m:t>
+              </m:r>
+              <m:r>
+                <m:rPr>
+                  <m:sty m:val="p"/>
+                </m:rPr>
+                <m:t>v</m:t>
+              </m:r>
+            </m:e>
+            <m:sub>
+              <m:r>
+                <m:rPr>
+                  <m:nor/>
+                  <m:sty m:val="p"/>
+                </m:rPr>
+                <m:t>among, slope</m:t>
+              </m:r>
+            </m:sub>
+          </m:sSub>
+          <m:r>
+            <m:rPr>
+              <m:sty m:val="p"/>
+            </m:rPr>
+            <m:t>=</m:t>
+          </m:r>
+          <m:sSub>
+            <m:e>
+              <m:r>
+                <m:t>β</m:t>
+              </m:r>
+            </m:e>
+            <m:sub>
+              <m:r>
+                <m:t>B</m:t>
+              </m:r>
+            </m:sub>
+          </m:sSub>
+          <m:r>
+            <m:t> </m:t>
+          </m:r>
+          <m:r>
+            <m:rPr>
+              <m:sty m:val="p"/>
+            </m:rPr>
+            <m:t>V</m:t>
+          </m:r>
+          <m:r>
+            <m:rPr>
+              <m:sty m:val="p"/>
+            </m:rPr>
+            <m:t>a</m:t>
+          </m:r>
+          <m:r>
+            <m:rPr>
+              <m:sty m:val="p"/>
+            </m:rPr>
+            <m:t>r</m:t>
+          </m:r>
+          <m:d>
+            <m:dPr>
+              <m:begChr m:val="("/>
+              <m:sepChr m:val=""/>
+              <m:endChr m:val=")"/>
+              <m:grow/>
+            </m:dPr>
+            <m:e>
+              <m:sSubSup>
+                <m:e>
+                  <m:r>
+                    <m:t>N</m:t>
+                  </m:r>
+                </m:e>
+                <m:sub>
+                  <m:r>
+                    <m:t>i</m:t>
+                  </m:r>
+                </m:sub>
+                <m:sup>
+                  <m:r>
+                    <m:t>B</m:t>
+                  </m:r>
+                </m:sup>
+              </m:sSubSup>
+            </m:e>
+          </m:d>
+          <m:r>
+            <m:t>  </m:t>
+          </m:r>
+          <m:d>
+            <m:dPr>
+              <m:begChr m:val="("/>
+              <m:sepChr m:val=""/>
+              <m:endChr m:val=")"/>
+              <m:grow/>
+            </m:dPr>
+            <m:e>
+              <m:r>
+                <m:t>15</m:t>
+              </m:r>
+            </m:e>
+          </m:d>
+        </m:oMath>
+      </m:oMathPara>
+      <w:bookmarkEnd w:id="40"/>
+    </w:p>
+    <w:p>
+      <w:pPr>
+        <w:pStyle w:val="FirstParagraph"/>
+      </w:pPr>
+      <w:bookmarkStart w:id="41" w:name="eq-cov_among_intercept"/>
+      <m:oMathPara>
+        <m:oMathParaPr>
+          <m:jc m:val="center"/>
+        </m:oMathParaPr>
+        <m:oMath>
+          <m:sSub>
+            <m:e>
+              <m:r>
+                <m:rPr>
+                  <m:sty m:val="p"/>
+                </m:rPr>
+                <m:t>C</m:t>
+              </m:r>
+              <m:r>
+                <m:rPr>
+                  <m:sty m:val="p"/>
+                </m:rPr>
+                <m:t>o</m:t>
+              </m:r>
+              <m:r>
+                <m:rPr>
+                  <m:sty m:val="p"/>
+                </m:rPr>
+                <m:t>v</m:t>
+              </m:r>
+            </m:e>
+            <m:sub>
+              <m:r>
+                <m:rPr>
+                  <m:nor/>
+                  <m:sty m:val="p"/>
+                </m:rPr>
+                <m:t>among, intercept</m:t>
+              </m:r>
+            </m:sub>
+          </m:sSub>
+          <m:r>
+            <m:rPr>
+              <m:sty m:val="p"/>
+            </m:rPr>
+            <m:t>=</m:t>
+          </m:r>
+          <m:sSub>
+            <m:e>
+              <m:r>
+                <m:t>σ</m:t>
+              </m:r>
+            </m:e>
+            <m:sub>
+              <m:r>
+                <m:t>N</m:t>
+              </m:r>
+              <m:r>
+                <m:t>S</m:t>
+              </m:r>
+            </m:sub>
+          </m:sSub>
+          <m:r>
+            <m:t>  </m:t>
+          </m:r>
+          <m:d>
+            <m:dPr>
+              <m:begChr m:val="("/>
+              <m:sepChr m:val=""/>
+              <m:endChr m:val=")"/>
+              <m:grow/>
+            </m:dPr>
+            <m:e>
+              <m:r>
+                <m:t>16</m:t>
+              </m:r>
+            </m:e>
+          </m:d>
+        </m:oMath>
+      </m:oMathPara>
+      <w:bookmarkEnd w:id="41"/>
+    </w:p>
+    <w:p>
+      <w:pPr>
+        <w:pStyle w:val="FirstParagraph"/>
+      </w:pPr>
+      <w:r>
+        <w:t xml:space="preserve">Total among-female covariance is therefore</w:t>
+      </w:r>
+    </w:p>
+    <w:p>
+      <w:pPr>
+        <w:pStyle w:val="BodyText"/>
+      </w:pPr>
+      <w:bookmarkStart w:id="42" w:name="eq-cov_among_total"/>
+      <m:oMathPara>
+        <m:oMathParaPr>
+          <m:jc m:val="center"/>
+        </m:oMathParaPr>
+        <m:oMath>
+          <m:sSub>
+            <m:e>
+              <m:r>
+                <m:rPr>
+                  <m:sty m:val="p"/>
+                </m:rPr>
+                <m:t>C</m:t>
+              </m:r>
+              <m:r>
+                <m:rPr>
+                  <m:sty m:val="p"/>
+                </m:rPr>
+                <m:t>o</m:t>
+              </m:r>
+              <m:r>
+                <m:rPr>
+                  <m:sty m:val="p"/>
+                </m:rPr>
+                <m:t>v</m:t>
+              </m:r>
+            </m:e>
+            <m:sub>
+              <m:r>
+                <m:rPr>
+                  <m:nor/>
+                  <m:sty m:val="p"/>
+                </m:rPr>
+                <m:t>among</m:t>
+              </m:r>
+            </m:sub>
+          </m:sSub>
+          <m:r>
+            <m:rPr>
+              <m:sty m:val="p"/>
+            </m:rPr>
+            <m:t>=</m:t>
+          </m:r>
+          <m:sSub>
+            <m:e>
+              <m:r>
+                <m:t>β</m:t>
+              </m:r>
+            </m:e>
+            <m:sub>
+              <m:r>
+                <m:t>B</m:t>
+              </m:r>
+            </m:sub>
+          </m:sSub>
+          <m:r>
+            <m:t> </m:t>
+          </m:r>
+          <m:r>
+            <m:rPr>
+              <m:sty m:val="p"/>
+            </m:rPr>
+            <m:t>V</m:t>
+          </m:r>
+          <m:r>
+            <m:rPr>
+              <m:sty m:val="p"/>
+            </m:rPr>
+            <m:t>a</m:t>
+          </m:r>
+          <m:r>
+            <m:rPr>
+              <m:sty m:val="p"/>
+            </m:rPr>
+            <m:t>r</m:t>
+          </m:r>
+          <m:d>
+            <m:dPr>
+              <m:begChr m:val="("/>
+              <m:sepChr m:val=""/>
+              <m:endChr m:val=")"/>
+              <m:grow/>
+            </m:dPr>
+            <m:e>
+              <m:sSubSup>
+                <m:e>
+                  <m:r>
+                    <m:t>N</m:t>
+                  </m:r>
+                </m:e>
+                <m:sub>
+                  <m:r>
+                    <m:t>i</m:t>
+                  </m:r>
+                </m:sub>
+                <m:sup>
+                  <m:r>
+                    <m:t>B</m:t>
+                  </m:r>
+                </m:sup>
+              </m:sSubSup>
+            </m:e>
+          </m:d>
+          <m:r>
+            <m:rPr>
+              <m:sty m:val="p"/>
+            </m:rPr>
+            <m:t>+</m:t>
+          </m:r>
+          <m:sSub>
+            <m:e>
+              <m:r>
+                <m:t>σ</m:t>
+              </m:r>
+            </m:e>
+            <m:sub>
+              <m:r>
+                <m:t>N</m:t>
+              </m:r>
+              <m:r>
+                <m:t>S</m:t>
+              </m:r>
+            </m:sub>
+          </m:sSub>
+          <m:r>
+            <m:t>  </m:t>
+          </m:r>
+          <m:d>
+            <m:dPr>
+              <m:begChr m:val="("/>
+              <m:sepChr m:val=""/>
+              <m:endChr m:val=")"/>
+              <m:grow/>
+            </m:dPr>
+            <m:e>
+              <m:r>
+                <m:t>17</m:t>
+              </m:r>
+            </m:e>
+          </m:d>
+        </m:oMath>
+      </m:oMathPara>
+      <w:bookmarkEnd w:id="42"/>
+    </w:p>
+    <w:bookmarkEnd w:id="43"/>
+    <w:bookmarkStart w:id="48" w:name="total-phenotypic-covariance"/>
+    <w:p>
+      <w:pPr>
+        <w:pStyle w:val="Heading3"/>
+      </w:pPr>
+      <w:r>
+        <w:t xml:space="preserve">Total phenotypic covariance</w:t>
+      </w:r>
+    </w:p>
+    <w:p>
+      <w:pPr>
+        <w:pStyle w:val="FirstParagraph"/>
+      </w:pPr>
+      <w:r>
+        <w:t xml:space="preserve">Combining components:</w:t>
+      </w:r>
+    </w:p>
+    <w:p>
+      <w:pPr>
+        <w:pStyle w:val="BodyText"/>
+      </w:pPr>
+      <w:bookmarkStart w:id="44" w:name="eq-cov_total_expanded"/>
+      <m:oMathPara>
+        <m:oMathParaPr>
+          <m:jc m:val="center"/>
+        </m:oMathParaPr>
+        <m:oMath>
+          <m:sSub>
+            <m:e>
+              <m:r>
+                <m:rPr>
+                  <m:sty m:val="p"/>
+                </m:rPr>
+                <m:t>C</m:t>
+              </m:r>
+              <m:r>
+                <m:rPr>
+                  <m:sty m:val="p"/>
+                </m:rPr>
+                <m:t>o</m:t>
+              </m:r>
+              <m:r>
+                <m:rPr>
+                  <m:sty m:val="p"/>
+                </m:rPr>
+                <m:t>v</m:t>
+              </m:r>
+            </m:e>
+            <m:sub>
+              <m:r>
+                <m:rPr>
+                  <m:nor/>
+                  <m:sty m:val="p"/>
+                </m:rPr>
+                <m:t>total</m:t>
+              </m:r>
+            </m:sub>
+          </m:sSub>
+          <m:r>
+            <m:rPr>
+              <m:sty m:val="p"/>
+            </m:rPr>
+            <m:t>=</m:t>
+          </m:r>
+          <m:sSub>
+            <m:e>
+              <m:r>
+                <m:t>β</m:t>
+              </m:r>
+            </m:e>
+            <m:sub>
+              <m:r>
+                <m:t>W</m:t>
+              </m:r>
+            </m:sub>
+          </m:sSub>
+          <m:r>
+            <m:t> </m:t>
+          </m:r>
+          <m:r>
+            <m:rPr>
+              <m:sty m:val="p"/>
+            </m:rPr>
+            <m:t>V</m:t>
+          </m:r>
+          <m:r>
+            <m:rPr>
+              <m:sty m:val="p"/>
+            </m:rPr>
+            <m:t>a</m:t>
+          </m:r>
+          <m:r>
+            <m:rPr>
+              <m:sty m:val="p"/>
+            </m:rPr>
+            <m:t>r</m:t>
+          </m:r>
+          <m:d>
+            <m:dPr>
+              <m:begChr m:val="("/>
+              <m:sepChr m:val=""/>
+              <m:endChr m:val=")"/>
+              <m:grow/>
+            </m:dPr>
+            <m:e>
+              <m:sSubSup>
+                <m:e>
+                  <m:r>
+                    <m:t>N</m:t>
+                  </m:r>
+                </m:e>
+                <m:sub>
+                  <m:r>
+                    <m:t>i</m:t>
+                  </m:r>
+                  <m:r>
+                    <m:t>j</m:t>
+                  </m:r>
+                </m:sub>
+                <m:sup>
+                  <m:r>
+                    <m:t>W</m:t>
+                  </m:r>
+                </m:sup>
+              </m:sSubSup>
+            </m:e>
+          </m:d>
+          <m:r>
+            <m:rPr>
+              <m:sty m:val="p"/>
+            </m:rPr>
+            <m:t>+</m:t>
+          </m:r>
+          <m:sSub>
+            <m:e>
+              <m:r>
+                <m:t>β</m:t>
+              </m:r>
+            </m:e>
+            <m:sub>
+              <m:r>
+                <m:t>B</m:t>
+              </m:r>
+            </m:sub>
+          </m:sSub>
+          <m:r>
+            <m:t> </m:t>
+          </m:r>
+          <m:r>
+            <m:rPr>
+              <m:sty m:val="p"/>
+            </m:rPr>
+            <m:t>V</m:t>
+          </m:r>
+          <m:r>
+            <m:rPr>
+              <m:sty m:val="p"/>
+            </m:rPr>
+            <m:t>a</m:t>
+          </m:r>
+          <m:r>
+            <m:rPr>
+              <m:sty m:val="p"/>
+            </m:rPr>
+            <m:t>r</m:t>
+          </m:r>
+          <m:d>
+            <m:dPr>
+              <m:begChr m:val="("/>
+              <m:sepChr m:val=""/>
+              <m:endChr m:val=")"/>
+              <m:grow/>
+            </m:dPr>
+            <m:e>
+              <m:sSubSup>
+                <m:e>
+                  <m:r>
+                    <m:t>N</m:t>
+                  </m:r>
+                </m:e>
+                <m:sub>
+                  <m:r>
+                    <m:t>i</m:t>
+                  </m:r>
+                </m:sub>
+                <m:sup>
+                  <m:r>
+                    <m:t>B</m:t>
+                  </m:r>
+                </m:sup>
+              </m:sSubSup>
+            </m:e>
+          </m:d>
+          <m:r>
+            <m:rPr>
+              <m:sty m:val="p"/>
+            </m:rPr>
+            <m:t>+</m:t>
+          </m:r>
+          <m:sSub>
+            <m:e>
+              <m:r>
+                <m:t>σ</m:t>
+              </m:r>
+            </m:e>
+            <m:sub>
+              <m:r>
+                <m:t>N</m:t>
+              </m:r>
+              <m:r>
+                <m:t>S</m:t>
+              </m:r>
+            </m:sub>
+          </m:sSub>
+          <m:r>
+            <m:t>  </m:t>
+          </m:r>
+          <m:d>
+            <m:dPr>
+              <m:begChr m:val="("/>
+              <m:sepChr m:val=""/>
+              <m:endChr m:val=")"/>
+              <m:grow/>
+            </m:dPr>
+            <m:e>
+              <m:r>
+                <m:t>18</m:t>
+              </m:r>
+            </m:e>
+          </m:d>
+        </m:oMath>
+      </m:oMathPara>
+      <w:bookmarkEnd w:id="44"/>
+    </w:p>
+    <w:p>
+      <w:pPr>
+        <w:pStyle w:val="FirstParagraph"/>
+      </w:pPr>
+      <w:r>
+        <w:t xml:space="preserve">The intercept correlation is</w:t>
+      </w:r>
+    </w:p>
+    <w:p>
+      <w:pPr>
+        <w:pStyle w:val="BodyText"/>
+      </w:pPr>
+      <w:bookmarkStart w:id="45" w:name="eq-rho_definition"/>
+      <m:oMathPara>
+        <m:oMathParaPr>
+          <m:jc m:val="center"/>
+        </m:oMathParaPr>
+        <m:oMath>
+          <m:sSub>
+            <m:e>
+              <m:r>
+                <m:t>ρ</m:t>
+              </m:r>
+            </m:e>
+            <m:sub>
+              <m:r>
+                <m:t>N</m:t>
+              </m:r>
+              <m:r>
+                <m:t>S</m:t>
+              </m:r>
+            </m:sub>
+          </m:sSub>
+          <m:r>
+            <m:rPr>
+              <m:sty m:val="p"/>
+            </m:rPr>
+            <m:t>=</m:t>
+          </m:r>
+          <m:f>
+            <m:fPr>
+              <m:type m:val="bar"/>
+            </m:fPr>
+            <m:num>
+              <m:sSub>
+                <m:e>
+                  <m:r>
+                    <m:t>σ</m:t>
+                  </m:r>
+                </m:e>
+                <m:sub>
+                  <m:r>
+                    <m:t>N</m:t>
+                  </m:r>
+                  <m:r>
+                    <m:t>S</m:t>
+                  </m:r>
+                </m:sub>
+              </m:sSub>
+            </m:num>
+            <m:den>
+              <m:rad>
+                <m:radPr>
+                  <m:degHide m:val="on"/>
+                </m:radPr>
+                <m:deg/>
+                <m:e>
+                  <m:sSubSup>
+                    <m:e>
+                      <m:r>
+                        <m:t>σ</m:t>
+                      </m:r>
+                    </m:e>
+                    <m:sub>
+                      <m:r>
+                        <m:t>N</m:t>
+                      </m:r>
+                    </m:sub>
+                    <m:sup>
+                      <m:r>
+                        <m:t>2</m:t>
+                      </m:r>
+                    </m:sup>
+                  </m:sSubSup>
+                  <m:sSubSup>
+                    <m:e>
+                      <m:r>
+                        <m:t>σ</m:t>
+                      </m:r>
+                    </m:e>
+                    <m:sub>
+                      <m:r>
+                        <m:t>S</m:t>
+                      </m:r>
+                      <m:r>
+                        <m:rPr>
+                          <m:sty m:val="p"/>
+                        </m:rPr>
+                        <m:t>,</m:t>
+                      </m:r>
+                      <m:r>
+                        <m:t>i</m:t>
+                      </m:r>
+                      <m:r>
+                        <m:t>d</m:t>
+                      </m:r>
+                    </m:sub>
+                    <m:sup>
+                      <m:r>
+                        <m:t>2</m:t>
+                      </m:r>
+                    </m:sup>
+                  </m:sSubSup>
+                </m:e>
+              </m:rad>
+            </m:den>
+          </m:f>
+          <m:r>
+            <m:t>  </m:t>
+          </m:r>
+          <m:d>
+            <m:dPr>
+              <m:begChr m:val="("/>
+              <m:sepChr m:val=""/>
+              <m:endChr m:val=")"/>
+              <m:grow/>
+            </m:dPr>
+            <m:e>
+              <m:r>
+                <m:t>19</m:t>
+              </m:r>
+            </m:e>
+          </m:d>
+        </m:oMath>
+      </m:oMathPara>
+      <w:bookmarkEnd w:id="45"/>
+    </w:p>
+    <w:p>
+      <w:r>
+        <w:br w:type="page"/>
+      </w:r>
+    </w:p>
+    <w:p>
+      <w:pPr>
+        <w:sectPr/>
+      </w:pPr>
+    </w:p>
     <w:tbl>
       <w:tblPr>
         <w:tblStyle w:val="Table"/>
@@ -87,7 +2990,7 @@
       <w:tr>
         <w:tc>
           <w:tcPr/>
-          <w:bookmarkStart w:id="21" w:name="tbl-one"/>
+          <w:bookmarkStart w:id="46" w:name="tbl-one"/>
           <w:p>
             <w:pPr>
               <w:jc w:val="center"/>
@@ -2767,14 +5670,16 @@
               </w:tc>
             </w:tr>
           </w:tbl>
-          <w:bookmarkEnd w:id="21"/>
+          <w:bookmarkEnd w:id="46"/>
         </w:tc>
       </w:tr>
     </w:tbl>
     <w:p>
-      <w:r>
-        <w:br w:type="page"/>
-      </w:r>
+      <w:pPr>
+        <w:sectPr>
+          <w:pgSz w:h="11906" w:w="16838" w:orient="landscape"/>
+        </w:sectPr>
+      </w:pPr>
     </w:p>
     <w:tbl>
       <w:tblPr>
@@ -2789,7 +5694,7 @@
       <w:tr>
         <w:tc>
           <w:tcPr/>
-          <w:bookmarkStart w:id="22" w:name="tbl-six"/>
+          <w:bookmarkStart w:id="47" w:name="tbl-two"/>
           <w:p>
             <w:pPr>
               <w:jc w:val="center"/>
@@ -3145,7 +6050,7 @@
                       <w:szCs w:val="22"/>
                       <w:color w:val="000000"/>
                     </w:rPr>
-                    <w:t xml:space="preserve">-0.594</w:t>
+                    <w:t xml:space="preserve">-0.535</w:t>
                   </w:r>
                 </w:p>
               </w:tc>
@@ -3199,7 +6104,7 @@
                       <w:szCs w:val="22"/>
                       <w:color w:val="000000"/>
                     </w:rPr>
-                    <w:t xml:space="preserve">-0.889</w:t>
+                    <w:t xml:space="preserve">-0.827</w:t>
                   </w:r>
                 </w:p>
               </w:tc>
@@ -3253,7 +6158,7 @@
                       <w:szCs w:val="22"/>
                       <w:color w:val="000000"/>
                     </w:rPr>
-                    <w:t xml:space="preserve">-0.285</w:t>
+                    <w:t xml:space="preserve">-0.246</w:t>
                   </w:r>
                 </w:p>
               </w:tc>
@@ -3366,7 +6271,7 @@
                       <w:szCs w:val="22"/>
                       <w:color w:val="000000"/>
                     </w:rPr>
-                    <w:t xml:space="preserve">0.311</w:t>
+                    <w:t xml:space="preserve">0.283</w:t>
                   </w:r>
                 </w:p>
               </w:tc>
@@ -3420,7 +6325,7 @@
                       <w:szCs w:val="22"/>
                       <w:color w:val="000000"/>
                     </w:rPr>
-                    <w:t xml:space="preserve">0.045</w:t>
+                    <w:t xml:space="preserve">0.050</w:t>
                   </w:r>
                 </w:p>
               </w:tc>
@@ -3474,7 +6379,7 @@
                       <w:szCs w:val="22"/>
                       <w:color w:val="000000"/>
                     </w:rPr>
-                    <w:t xml:space="preserve">0.576</w:t>
+                    <w:t xml:space="preserve">0.530</w:t>
                   </w:r>
                 </w:p>
               </w:tc>
@@ -3587,7 +6492,7 @@
                       <w:szCs w:val="22"/>
                       <w:color w:val="000000"/>
                     </w:rPr>
-                    <w:t xml:space="preserve">0.264</w:t>
+                    <w:t xml:space="preserve">0.250</w:t>
                   </w:r>
                 </w:p>
               </w:tc>
@@ -3641,7 +6546,7 @@
                       <w:szCs w:val="22"/>
                       <w:color w:val="000000"/>
                     </w:rPr>
-                    <w:t xml:space="preserve">-0.030</w:t>
+                    <w:t xml:space="preserve">-0.025</w:t>
                   </w:r>
                 </w:p>
               </w:tc>
@@ -3695,7 +6600,7 @@
                       <w:szCs w:val="22"/>
                       <w:color w:val="000000"/>
                     </w:rPr>
-                    <w:t xml:space="preserve">0.516</w:t>
+                    <w:t xml:space="preserve">0.488</w:t>
                   </w:r>
                 </w:p>
               </w:tc>
@@ -3808,7 +6713,7 @@
                       <w:szCs w:val="22"/>
                       <w:color w:val="000000"/>
                     </w:rPr>
-                    <w:t xml:space="preserve">0.876</w:t>
+                    <w:t xml:space="preserve">0.855</w:t>
                   </w:r>
                 </w:p>
               </w:tc>
@@ -3862,7 +6767,7 @@
                       <w:szCs w:val="22"/>
                       <w:color w:val="000000"/>
                     </w:rPr>
-                    <w:t xml:space="preserve">0.721</w:t>
+                    <w:t xml:space="preserve">0.704</w:t>
                   </w:r>
                 </w:p>
               </w:tc>
@@ -3916,7 +6821,7 @@
                       <w:szCs w:val="22"/>
                       <w:color w:val="000000"/>
                     </w:rPr>
-                    <w:t xml:space="preserve">1.108</w:t>
+                    <w:t xml:space="preserve">1.058</w:t>
                   </w:r>
                 </w:p>
               </w:tc>
@@ -4029,7 +6934,7 @@
                       <w:szCs w:val="22"/>
                       <w:color w:val="000000"/>
                     </w:rPr>
-                    <w:t xml:space="preserve">0.797</w:t>
+                    <w:t xml:space="preserve">0.784</w:t>
                   </w:r>
                 </w:p>
               </w:tc>
@@ -4083,7 +6988,7 @@
                       <w:szCs w:val="22"/>
                       <w:color w:val="000000"/>
                     </w:rPr>
-                    <w:t xml:space="preserve">0.648</w:t>
+                    <w:t xml:space="preserve">0.638</w:t>
                   </w:r>
                 </w:p>
               </w:tc>
@@ -4137,7 +7042,7 @@
                       <w:szCs w:val="22"/>
                       <w:color w:val="000000"/>
                     </w:rPr>
-                    <w:t xml:space="preserve">0.999</w:t>
+                    <w:t xml:space="preserve">0.982</w:t>
                   </w:r>
                 </w:p>
               </w:tc>
@@ -4471,7 +7376,7 @@
                       <w:szCs w:val="22"/>
                       <w:color w:val="000000"/>
                     </w:rPr>
-                    <w:t xml:space="preserve">0.595</w:t>
+                    <w:t xml:space="preserve">0.594</w:t>
                   </w:r>
                 </w:p>
               </w:tc>
@@ -4579,16 +7484,55 @@
                       <w:szCs w:val="22"/>
                       <w:color w:val="000000"/>
                     </w:rPr>
-                    <w:t xml:space="preserve">0.617</w:t>
+                    <w:t xml:space="preserve">0.616</w:t>
                   </w:r>
                 </w:p>
               </w:tc>
             </w:tr>
           </w:tbl>
-          <w:bookmarkEnd w:id="22"/>
+          <w:bookmarkEnd w:id="47"/>
         </w:tc>
       </w:tr>
     </w:tbl>
+    <w:p>
+      <w:r>
+        <w:br w:type="page"/>
+      </w:r>
+    </w:p>
+    <w:bookmarkEnd w:id="48"/>
+    <w:bookmarkEnd w:id="49"/>
+    <w:bookmarkStart w:id="53" w:name="references"/>
+    <w:p>
+      <w:pPr>
+        <w:pStyle w:val="Heading1"/>
+      </w:pPr>
+      <w:r>
+        <w:t xml:space="preserve">References</w:t>
+      </w:r>
+    </w:p>
+    <w:bookmarkStart w:id="52" w:name="refs"/>
+    <w:bookmarkStart w:id="50" w:name="ref-vandepol2009"/>
+    <w:p>
+      <w:pPr>
+        <w:pStyle w:val="Bibliography"/>
+      </w:pPr>
+      <w:r>
+        <w:t xml:space="preserve">Pol, M. van de, and J. Wright. 2009. A simple method for distinguishing within- versus between-subject effects using mixed models. Anim Behav 77:753–758.</w:t>
+      </w:r>
+    </w:p>
+    <w:bookmarkEnd w:id="50"/>
+    <w:bookmarkStart w:id="51" w:name="ref-westneat2020"/>
+    <w:p>
+      <w:pPr>
+        <w:pStyle w:val="Bibliography"/>
+      </w:pPr>
+      <w:r>
+        <w:t xml:space="preserve">Westneat, D. F., Y. G. Araya-Ajoy, H. Allegue, B. Class, N. Dingemanse, N. A. Dochtermann, L. Z. Garamszegi, J. G. A. Martin, S. Nakagawa, D. Réale, and H. Schielzeth. 2020. Collision between biological process and statistical analysis revealed by mean centring. J Anim Ecol 89:2813–2824.</w:t>
+      </w:r>
+    </w:p>
+    <w:bookmarkEnd w:id="51"/>
+    <w:bookmarkEnd w:id="52"/>
+    <w:bookmarkEnd w:id="53"/>
     <w:sectPr>
       <w:headerReference r:id="rId10" w:type="even"/>
       <w:headerReference r:id="rId9" w:type="default"/>

</xml_diff>

<commit_message>
Small edits. Major revision is complete.
</commit_message>
<xml_diff>
--- a/2025_fecundity_supp_mat.docx
+++ b/2025_fecundity_supp_mat.docx
@@ -74,13 +74,13 @@
         <w:br w:type="page"/>
       </w:r>
     </w:p>
-    <w:bookmarkStart w:id="36" w:name="withinbetween-multivariate-model"/>
+    <w:bookmarkStart w:id="48" w:name="withinbetween-multivariate-model"/>
     <w:p>
       <w:pPr>
-        <w:pStyle w:val="Heading2"/>
-      </w:pPr>
-      <w:r>
-        <w:t xml:space="preserve">Within–between multivariate model</w:t>
+        <w:pStyle w:val="Heading1"/>
+      </w:pPr>
+      <w:r>
+        <w:t xml:space="preserve">1. Within–between multivariate model</w:t>
       </w:r>
     </w:p>
     <w:p>
@@ -88,7 +88,7 @@
         <w:pStyle w:val="FirstParagraph"/>
       </w:pPr>
       <w:r>
-        <w:t xml:space="preserve">To partition covariance arising from within-female plasticity from covariance attributable to consistent among-female differences, I applied the within–between decomposition of can de Pol and Wright</w:t>
+        <w:t xml:space="preserve">To partition covariance arising from within-female plasticity from covariance attributable to consistent among-female differences, I applied the within–between decomposition of van de Pol and Wright</w:t>
       </w:r>
       <w:r>
         <w:t xml:space="preserve"> </w:t>
@@ -489,7 +489,7 @@
     <w:bookmarkStart w:id="27" w:name="egg-number-submodel"/>
     <w:p>
       <w:pPr>
-        <w:pStyle w:val="Heading3"/>
+        <w:pStyle w:val="Heading2"/>
       </w:pPr>
       <w:r>
         <w:t xml:space="preserve">Egg number submodel</w:t>
@@ -940,7 +940,7 @@
     <w:bookmarkStart w:id="31" w:name="mean-egg-size-submodel"/>
     <w:p>
       <w:pPr>
-        <w:pStyle w:val="Heading3"/>
+        <w:pStyle w:val="Heading2"/>
       </w:pPr>
       <w:r>
         <w:t xml:space="preserve">Mean egg size submodel</w:t>
@@ -1425,7 +1425,7 @@
     <w:bookmarkStart w:id="35" w:name="multivariate-structure"/>
     <w:p>
       <w:pPr>
-        <w:pStyle w:val="Heading3"/>
+        <w:pStyle w:val="Heading2"/>
       </w:pPr>
       <w:r>
         <w:t xml:space="preserve">Multivariate structure</w:t>
@@ -1928,8 +1928,7 @@
       <w:bookmarkEnd w:id="34"/>
     </w:p>
     <w:bookmarkEnd w:id="35"/>
-    <w:bookmarkEnd w:id="36"/>
-    <w:bookmarkStart w:id="49" w:name="X0f816ef2495b00e8a187e8ee26189908fbc39c6"/>
+    <w:bookmarkStart w:id="37" w:name="X0f816ef2495b00e8a187e8ee26189908fbc39c6"/>
     <w:p>
       <w:pPr>
         <w:pStyle w:val="Heading2"/>
@@ -1950,7 +1949,7 @@
       <w:pPr>
         <w:pStyle w:val="BodyText"/>
       </w:pPr>
-      <w:bookmarkStart w:id="37" w:name="eq-cov_partition"/>
+      <w:bookmarkStart w:id="36" w:name="eq-cov_partition"/>
       <m:oMathPara>
         <m:oMathParaPr>
           <m:jc m:val="center"/>
@@ -2079,12 +2078,13 @@
           </m:d>
         </m:oMath>
       </m:oMathPara>
-      <w:bookmarkEnd w:id="37"/>
+      <w:bookmarkEnd w:id="36"/>
     </w:p>
+    <w:bookmarkEnd w:id="37"/>
     <w:bookmarkStart w:id="39" w:name="within-female-covariance"/>
     <w:p>
       <w:pPr>
-        <w:pStyle w:val="Heading3"/>
+        <w:pStyle w:val="Heading2"/>
       </w:pPr>
       <w:r>
         <w:t xml:space="preserve">Within-female covariance</w:t>
@@ -2224,7 +2224,7 @@
     <w:bookmarkStart w:id="43" w:name="among-female-covariance"/>
     <w:p>
       <w:pPr>
-        <w:pStyle w:val="Heading3"/>
+        <w:pStyle w:val="Heading2"/>
       </w:pPr>
       <w:r>
         <w:t xml:space="preserve">Among-female covariance</w:t>
@@ -2596,10 +2596,10 @@
       <w:bookmarkEnd w:id="42"/>
     </w:p>
     <w:bookmarkEnd w:id="43"/>
-    <w:bookmarkStart w:id="48" w:name="total-phenotypic-covariance"/>
+    <w:bookmarkStart w:id="47" w:name="total-phenotypic-covariance"/>
     <w:p>
       <w:pPr>
-        <w:pStyle w:val="Heading3"/>
+        <w:pStyle w:val="Heading2"/>
       </w:pPr>
       <w:r>
         <w:t xml:space="preserve">Total phenotypic covariance</w:t>
@@ -3021,6 +3021,7 @@
                 <w:trHeight w:val="619" w:hRule="auto"/>
                 <w:tblHeader/>
               </w:trPr>
+              header 1
               <w:tc>
                 <w:tcPr>
                   <w:tcBorders>
@@ -3040,6 +3041,7 @@
                 </w:tcPr>
                 <w:p>
                   <w:pPr>
+                    <w:pStyle w:val="Normal"/>
                     <w:jc w:val="left"/>
                     <w:pBdr>
                       <w:bottom w:val="none" w:sz="0" w:space="0" w:color="000000"/>
@@ -3049,16 +3051,6 @@
                     </w:pBdr>
                     <w:spacing w:after="100" w:before="100" w:line="240"/>
                     <w:ind w:left="100" w:right="100" w:firstLine="0" w:firstLineChars="0"/>
-                    <w:rPr>
-                      <w:rFonts w:ascii="Helvetica" w:hAnsi="Helvetica" w:eastAsia="Helvetica" w:cs="Helvetica"/>
-                      <w:i w:val="false"/>
-                      <w:b w:val="false"/>
-                      <w:u w:val="none"/>
-                      <w:strike w:val="false"/>
-                      <w:sz w:val="22"/>
-                      <w:szCs w:val="22"/>
-                      <w:color w:val="000000"/>
-                    </w:rPr>
                   </w:pPr>
                   <w:r xmlns:w="http://schemas.openxmlformats.org/wordprocessingml/2006/main" xmlns:wp="http://schemas.openxmlformats.org/drawingml/2006/wordprocessingDrawing" xmlns:r="http://schemas.openxmlformats.org/officeDocument/2006/relationships" xmlns:w14="http://schemas.microsoft.com/office/word/2010/wordml">
                     <w:rPr>
@@ -3066,7 +3058,6 @@
                       <w:i w:val="false"/>
                       <w:b w:val="false"/>
                       <w:u w:val="none"/>
-                      <w:strike w:val="false"/>
                       <w:sz w:val="22"/>
                       <w:szCs w:val="22"/>
                       <w:color w:val="000000"/>
@@ -3094,6 +3085,7 @@
                 </w:tcPr>
                 <w:p>
                   <w:pPr>
+                    <w:pStyle w:val="Normal"/>
                     <w:jc w:val="right"/>
                     <w:pBdr>
                       <w:bottom w:val="none" w:sz="0" w:space="0" w:color="000000"/>
@@ -3103,16 +3095,6 @@
                     </w:pBdr>
                     <w:spacing w:after="100" w:before="100" w:line="240"/>
                     <w:ind w:left="100" w:right="100" w:firstLine="0" w:firstLineChars="0"/>
-                    <w:rPr>
-                      <w:rFonts w:ascii="Helvetica" w:hAnsi="Helvetica" w:eastAsia="Helvetica" w:cs="Helvetica"/>
-                      <w:i w:val="false"/>
-                      <w:b w:val="false"/>
-                      <w:u w:val="none"/>
-                      <w:strike w:val="false"/>
-                      <w:sz w:val="22"/>
-                      <w:szCs w:val="22"/>
-                      <w:color w:val="000000"/>
-                    </w:rPr>
                   </w:pPr>
                   <w:r xmlns:w="http://schemas.openxmlformats.org/wordprocessingml/2006/main" xmlns:wp="http://schemas.openxmlformats.org/drawingml/2006/wordprocessingDrawing" xmlns:r="http://schemas.openxmlformats.org/officeDocument/2006/relationships" xmlns:w14="http://schemas.microsoft.com/office/word/2010/wordml">
                     <w:rPr>
@@ -3120,7 +3102,6 @@
                       <w:i w:val="false"/>
                       <w:b w:val="false"/>
                       <w:u w:val="none"/>
-                      <w:strike w:val="false"/>
                       <w:sz w:val="22"/>
                       <w:szCs w:val="22"/>
                       <w:color w:val="000000"/>
@@ -3148,6 +3129,7 @@
                 </w:tcPr>
                 <w:p>
                   <w:pPr>
+                    <w:pStyle w:val="Normal"/>
                     <w:jc w:val="right"/>
                     <w:pBdr>
                       <w:bottom w:val="none" w:sz="0" w:space="0" w:color="000000"/>
@@ -3157,16 +3139,6 @@
                     </w:pBdr>
                     <w:spacing w:after="100" w:before="100" w:line="240"/>
                     <w:ind w:left="100" w:right="100" w:firstLine="0" w:firstLineChars="0"/>
-                    <w:rPr>
-                      <w:rFonts w:ascii="Helvetica" w:hAnsi="Helvetica" w:eastAsia="Helvetica" w:cs="Helvetica"/>
-                      <w:i w:val="false"/>
-                      <w:b w:val="false"/>
-                      <w:u w:val="none"/>
-                      <w:strike w:val="false"/>
-                      <w:sz w:val="22"/>
-                      <w:szCs w:val="22"/>
-                      <w:color w:val="000000"/>
-                    </w:rPr>
                   </w:pPr>
                   <w:r xmlns:w="http://schemas.openxmlformats.org/wordprocessingml/2006/main" xmlns:wp="http://schemas.openxmlformats.org/drawingml/2006/wordprocessingDrawing" xmlns:r="http://schemas.openxmlformats.org/officeDocument/2006/relationships" xmlns:w14="http://schemas.microsoft.com/office/word/2010/wordml">
                     <w:rPr>
@@ -3174,7 +3146,6 @@
                       <w:i w:val="false"/>
                       <w:b w:val="false"/>
                       <w:u w:val="none"/>
-                      <w:strike w:val="false"/>
                       <w:sz w:val="22"/>
                       <w:szCs w:val="22"/>
                       <w:color w:val="000000"/>
@@ -3202,6 +3173,7 @@
                 </w:tcPr>
                 <w:p>
                   <w:pPr>
+                    <w:pStyle w:val="Normal"/>
                     <w:jc w:val="right"/>
                     <w:pBdr>
                       <w:bottom w:val="none" w:sz="0" w:space="0" w:color="000000"/>
@@ -3211,16 +3183,6 @@
                     </w:pBdr>
                     <w:spacing w:after="100" w:before="100" w:line="240"/>
                     <w:ind w:left="100" w:right="100" w:firstLine="0" w:firstLineChars="0"/>
-                    <w:rPr>
-                      <w:rFonts w:ascii="Helvetica" w:hAnsi="Helvetica" w:eastAsia="Helvetica" w:cs="Helvetica"/>
-                      <w:i w:val="false"/>
-                      <w:b w:val="false"/>
-                      <w:u w:val="none"/>
-                      <w:strike w:val="false"/>
-                      <w:sz w:val="22"/>
-                      <w:szCs w:val="22"/>
-                      <w:color w:val="000000"/>
-                    </w:rPr>
                   </w:pPr>
                   <w:r xmlns:w="http://schemas.openxmlformats.org/wordprocessingml/2006/main" xmlns:wp="http://schemas.openxmlformats.org/drawingml/2006/wordprocessingDrawing" xmlns:r="http://schemas.openxmlformats.org/officeDocument/2006/relationships" xmlns:w14="http://schemas.microsoft.com/office/word/2010/wordml">
                     <w:rPr>
@@ -3228,7 +3190,6 @@
                       <w:i w:val="false"/>
                       <w:b w:val="false"/>
                       <w:u w:val="none"/>
-                      <w:strike w:val="false"/>
                       <w:sz w:val="22"/>
                       <w:szCs w:val="22"/>
                       <w:color w:val="000000"/>
@@ -3242,6 +3203,7 @@
               <w:trPr>
                 <w:trHeight w:val="620" w:hRule="auto"/>
               </w:trPr>
+              body 1
               <w:tc>
                 <w:tcPr>
                   <w:tcBorders>
@@ -3261,6 +3223,7 @@
                 </w:tcPr>
                 <w:p>
                   <w:pPr>
+                    <w:pStyle w:val="Normal"/>
                     <w:jc w:val="left"/>
                     <w:pBdr>
                       <w:bottom w:val="none" w:sz="0" w:space="0" w:color="000000"/>
@@ -3270,16 +3233,6 @@
                     </w:pBdr>
                     <w:spacing w:after="100" w:before="100" w:line="240"/>
                     <w:ind w:left="100" w:right="100" w:firstLine="0" w:firstLineChars="0"/>
-                    <w:rPr>
-                      <w:rFonts w:ascii="Helvetica" w:hAnsi="Helvetica" w:eastAsia="Helvetica" w:cs="Helvetica"/>
-                      <w:i w:val="false"/>
-                      <w:b w:val="false"/>
-                      <w:u w:val="none"/>
-                      <w:strike w:val="false"/>
-                      <w:sz w:val="22"/>
-                      <w:szCs w:val="22"/>
-                      <w:color w:val="000000"/>
-                    </w:rPr>
                   </w:pPr>
                   <w:r xmlns:w="http://schemas.openxmlformats.org/wordprocessingml/2006/main" xmlns:wp="http://schemas.openxmlformats.org/drawingml/2006/wordprocessingDrawing" xmlns:r="http://schemas.openxmlformats.org/officeDocument/2006/relationships" xmlns:w14="http://schemas.microsoft.com/office/word/2010/wordml">
                     <w:rPr>
@@ -3287,12 +3240,11 @@
                       <w:i w:val="false"/>
                       <w:b w:val="false"/>
                       <w:u w:val="none"/>
-                      <w:strike w:val="false"/>
                       <w:sz w:val="22"/>
                       <w:szCs w:val="22"/>
                       <w:color w:val="000000"/>
                     </w:rPr>
-                    <w:t xml:space="preserve">Egg number: Brood 2 − Brood 1 (log scale)</w:t>
+                    <w:t xml:space="preserve">Egg number: Intercept (Brood 1, log scale)</w:t>
                   </w:r>
                 </w:p>
               </w:tc>
@@ -3315,6 +3267,7 @@
                 </w:tcPr>
                 <w:p>
                   <w:pPr>
+                    <w:pStyle w:val="Normal"/>
                     <w:jc w:val="right"/>
                     <w:pBdr>
                       <w:bottom w:val="none" w:sz="0" w:space="0" w:color="000000"/>
@@ -3324,16 +3277,6 @@
                     </w:pBdr>
                     <w:spacing w:after="100" w:before="100" w:line="240"/>
                     <w:ind w:left="100" w:right="100" w:firstLine="0" w:firstLineChars="0"/>
-                    <w:rPr>
-                      <w:rFonts w:ascii="Helvetica" w:hAnsi="Helvetica" w:eastAsia="Helvetica" w:cs="Helvetica"/>
-                      <w:i w:val="false"/>
-                      <w:b w:val="false"/>
-                      <w:u w:val="none"/>
-                      <w:strike w:val="false"/>
-                      <w:sz w:val="22"/>
-                      <w:szCs w:val="22"/>
-                      <w:color w:val="000000"/>
-                    </w:rPr>
                   </w:pPr>
                   <w:r xmlns:w="http://schemas.openxmlformats.org/wordprocessingml/2006/main" xmlns:wp="http://schemas.openxmlformats.org/drawingml/2006/wordprocessingDrawing" xmlns:r="http://schemas.openxmlformats.org/officeDocument/2006/relationships" xmlns:w14="http://schemas.microsoft.com/office/word/2010/wordml">
                     <w:rPr>
@@ -3341,12 +3284,11 @@
                       <w:i w:val="false"/>
                       <w:b w:val="false"/>
                       <w:u w:val="none"/>
-                      <w:strike w:val="false"/>
                       <w:sz w:val="22"/>
                       <w:szCs w:val="22"/>
                       <w:color w:val="000000"/>
                     </w:rPr>
-                    <w:t xml:space="preserve">-0.413</w:t>
+                    <w:t xml:space="preserve">3.940</w:t>
                   </w:r>
                 </w:p>
               </w:tc>
@@ -3369,6 +3311,7 @@
                 </w:tcPr>
                 <w:p>
                   <w:pPr>
+                    <w:pStyle w:val="Normal"/>
                     <w:jc w:val="right"/>
                     <w:pBdr>
                       <w:bottom w:val="none" w:sz="0" w:space="0" w:color="000000"/>
@@ -3378,16 +3321,6 @@
                     </w:pBdr>
                     <w:spacing w:after="100" w:before="100" w:line="240"/>
                     <w:ind w:left="100" w:right="100" w:firstLine="0" w:firstLineChars="0"/>
-                    <w:rPr>
-                      <w:rFonts w:ascii="Helvetica" w:hAnsi="Helvetica" w:eastAsia="Helvetica" w:cs="Helvetica"/>
-                      <w:i w:val="false"/>
-                      <w:b w:val="false"/>
-                      <w:u w:val="none"/>
-                      <w:strike w:val="false"/>
-                      <w:sz w:val="22"/>
-                      <w:szCs w:val="22"/>
-                      <w:color w:val="000000"/>
-                    </w:rPr>
                   </w:pPr>
                   <w:r xmlns:w="http://schemas.openxmlformats.org/wordprocessingml/2006/main" xmlns:wp="http://schemas.openxmlformats.org/drawingml/2006/wordprocessingDrawing" xmlns:r="http://schemas.openxmlformats.org/officeDocument/2006/relationships" xmlns:w14="http://schemas.microsoft.com/office/word/2010/wordml">
                     <w:rPr>
@@ -3395,12 +3328,11 @@
                       <w:i w:val="false"/>
                       <w:b w:val="false"/>
                       <w:u w:val="none"/>
-                      <w:strike w:val="false"/>
                       <w:sz w:val="22"/>
                       <w:szCs w:val="22"/>
                       <w:color w:val="000000"/>
                     </w:rPr>
-                    <w:t xml:space="preserve">-0.635</w:t>
+                    <w:t xml:space="preserve">3.782</w:t>
                   </w:r>
                 </w:p>
               </w:tc>
@@ -3423,6 +3355,7 @@
                 </w:tcPr>
                 <w:p>
                   <w:pPr>
+                    <w:pStyle w:val="Normal"/>
                     <w:jc w:val="right"/>
                     <w:pBdr>
                       <w:bottom w:val="none" w:sz="0" w:space="0" w:color="000000"/>
@@ -3432,16 +3365,6 @@
                     </w:pBdr>
                     <w:spacing w:after="100" w:before="100" w:line="240"/>
                     <w:ind w:left="100" w:right="100" w:firstLine="0" w:firstLineChars="0"/>
-                    <w:rPr>
-                      <w:rFonts w:ascii="Helvetica" w:hAnsi="Helvetica" w:eastAsia="Helvetica" w:cs="Helvetica"/>
-                      <w:i w:val="false"/>
-                      <w:b w:val="false"/>
-                      <w:u w:val="none"/>
-                      <w:strike w:val="false"/>
-                      <w:sz w:val="22"/>
-                      <w:szCs w:val="22"/>
-                      <w:color w:val="000000"/>
-                    </w:rPr>
                   </w:pPr>
                   <w:r xmlns:w="http://schemas.openxmlformats.org/wordprocessingml/2006/main" xmlns:wp="http://schemas.openxmlformats.org/drawingml/2006/wordprocessingDrawing" xmlns:r="http://schemas.openxmlformats.org/officeDocument/2006/relationships" xmlns:w14="http://schemas.microsoft.com/office/word/2010/wordml">
                     <w:rPr>
@@ -3449,12 +3372,11 @@
                       <w:i w:val="false"/>
                       <w:b w:val="false"/>
                       <w:u w:val="none"/>
-                      <w:strike w:val="false"/>
                       <w:sz w:val="22"/>
                       <w:szCs w:val="22"/>
                       <w:color w:val="000000"/>
                     </w:rPr>
-                    <w:t xml:space="preserve">-0.189</w:t>
+                    <w:t xml:space="preserve">4.107</w:t>
                   </w:r>
                 </w:p>
               </w:tc>
@@ -3463,6 +3385,7 @@
               <w:trPr>
                 <w:trHeight w:val="620" w:hRule="auto"/>
               </w:trPr>
+              body 2
               <w:tc>
                 <w:tcPr>
                   <w:tcBorders>
@@ -3482,6 +3405,7 @@
                 </w:tcPr>
                 <w:p>
                   <w:pPr>
+                    <w:pStyle w:val="Normal"/>
                     <w:jc w:val="left"/>
                     <w:pBdr>
                       <w:bottom w:val="none" w:sz="0" w:space="0" w:color="000000"/>
@@ -3491,16 +3415,6 @@
                     </w:pBdr>
                     <w:spacing w:after="100" w:before="100" w:line="240"/>
                     <w:ind w:left="100" w:right="100" w:firstLine="0" w:firstLineChars="0"/>
-                    <w:rPr>
-                      <w:rFonts w:ascii="Helvetica" w:hAnsi="Helvetica" w:eastAsia="Helvetica" w:cs="Helvetica"/>
-                      <w:i w:val="false"/>
-                      <w:b w:val="false"/>
-                      <w:u w:val="none"/>
-                      <w:strike w:val="false"/>
-                      <w:sz w:val="22"/>
-                      <w:szCs w:val="22"/>
-                      <w:color w:val="000000"/>
-                    </w:rPr>
                   </w:pPr>
                   <w:r xmlns:w="http://schemas.openxmlformats.org/wordprocessingml/2006/main" xmlns:wp="http://schemas.openxmlformats.org/drawingml/2006/wordprocessingDrawing" xmlns:r="http://schemas.openxmlformats.org/officeDocument/2006/relationships" xmlns:w14="http://schemas.microsoft.com/office/word/2010/wordml">
                     <w:rPr>
@@ -3508,12 +3422,11 @@
                       <w:i w:val="false"/>
                       <w:b w:val="false"/>
                       <w:u w:val="none"/>
-                      <w:strike w:val="false"/>
                       <w:sz w:val="22"/>
                       <w:szCs w:val="22"/>
                       <w:color w:val="000000"/>
                     </w:rPr>
-                    <w:t xml:space="preserve">Egg number: Intercept (Brood 1, log scale)</w:t>
+                    <w:t xml:space="preserve">Egg number: Brood 2 − Brood 1 (log scale)</w:t>
                   </w:r>
                 </w:p>
               </w:tc>
@@ -3536,6 +3449,7 @@
                 </w:tcPr>
                 <w:p>
                   <w:pPr>
+                    <w:pStyle w:val="Normal"/>
                     <w:jc w:val="right"/>
                     <w:pBdr>
                       <w:bottom w:val="none" w:sz="0" w:space="0" w:color="000000"/>
@@ -3545,16 +3459,6 @@
                     </w:pBdr>
                     <w:spacing w:after="100" w:before="100" w:line="240"/>
                     <w:ind w:left="100" w:right="100" w:firstLine="0" w:firstLineChars="0"/>
-                    <w:rPr>
-                      <w:rFonts w:ascii="Helvetica" w:hAnsi="Helvetica" w:eastAsia="Helvetica" w:cs="Helvetica"/>
-                      <w:i w:val="false"/>
-                      <w:b w:val="false"/>
-                      <w:u w:val="none"/>
-                      <w:strike w:val="false"/>
-                      <w:sz w:val="22"/>
-                      <w:szCs w:val="22"/>
-                      <w:color w:val="000000"/>
-                    </w:rPr>
                   </w:pPr>
                   <w:r xmlns:w="http://schemas.openxmlformats.org/wordprocessingml/2006/main" xmlns:wp="http://schemas.openxmlformats.org/drawingml/2006/wordprocessingDrawing" xmlns:r="http://schemas.openxmlformats.org/officeDocument/2006/relationships" xmlns:w14="http://schemas.microsoft.com/office/word/2010/wordml">
                     <w:rPr>
@@ -3562,12 +3466,11 @@
                       <w:i w:val="false"/>
                       <w:b w:val="false"/>
                       <w:u w:val="none"/>
-                      <w:strike w:val="false"/>
                       <w:sz w:val="22"/>
                       <w:szCs w:val="22"/>
                       <w:color w:val="000000"/>
                     </w:rPr>
-                    <w:t xml:space="preserve">3.940</w:t>
+                    <w:t xml:space="preserve">-0.413</w:t>
                   </w:r>
                 </w:p>
               </w:tc>
@@ -3590,6 +3493,7 @@
                 </w:tcPr>
                 <w:p>
                   <w:pPr>
+                    <w:pStyle w:val="Normal"/>
                     <w:jc w:val="right"/>
                     <w:pBdr>
                       <w:bottom w:val="none" w:sz="0" w:space="0" w:color="000000"/>
@@ -3599,16 +3503,6 @@
                     </w:pBdr>
                     <w:spacing w:after="100" w:before="100" w:line="240"/>
                     <w:ind w:left="100" w:right="100" w:firstLine="0" w:firstLineChars="0"/>
-                    <w:rPr>
-                      <w:rFonts w:ascii="Helvetica" w:hAnsi="Helvetica" w:eastAsia="Helvetica" w:cs="Helvetica"/>
-                      <w:i w:val="false"/>
-                      <w:b w:val="false"/>
-                      <w:u w:val="none"/>
-                      <w:strike w:val="false"/>
-                      <w:sz w:val="22"/>
-                      <w:szCs w:val="22"/>
-                      <w:color w:val="000000"/>
-                    </w:rPr>
                   </w:pPr>
                   <w:r xmlns:w="http://schemas.openxmlformats.org/wordprocessingml/2006/main" xmlns:wp="http://schemas.openxmlformats.org/drawingml/2006/wordprocessingDrawing" xmlns:r="http://schemas.openxmlformats.org/officeDocument/2006/relationships" xmlns:w14="http://schemas.microsoft.com/office/word/2010/wordml">
                     <w:rPr>
@@ -3616,12 +3510,11 @@
                       <w:i w:val="false"/>
                       <w:b w:val="false"/>
                       <w:u w:val="none"/>
-                      <w:strike w:val="false"/>
                       <w:sz w:val="22"/>
                       <w:szCs w:val="22"/>
                       <w:color w:val="000000"/>
                     </w:rPr>
-                    <w:t xml:space="preserve">3.782</w:t>
+                    <w:t xml:space="preserve">-0.635</w:t>
                   </w:r>
                 </w:p>
               </w:tc>
@@ -3644,6 +3537,7 @@
                 </w:tcPr>
                 <w:p>
                   <w:pPr>
+                    <w:pStyle w:val="Normal"/>
                     <w:jc w:val="right"/>
                     <w:pBdr>
                       <w:bottom w:val="none" w:sz="0" w:space="0" w:color="000000"/>
@@ -3653,16 +3547,6 @@
                     </w:pBdr>
                     <w:spacing w:after="100" w:before="100" w:line="240"/>
                     <w:ind w:left="100" w:right="100" w:firstLine="0" w:firstLineChars="0"/>
-                    <w:rPr>
-                      <w:rFonts w:ascii="Helvetica" w:hAnsi="Helvetica" w:eastAsia="Helvetica" w:cs="Helvetica"/>
-                      <w:i w:val="false"/>
-                      <w:b w:val="false"/>
-                      <w:u w:val="none"/>
-                      <w:strike w:val="false"/>
-                      <w:sz w:val="22"/>
-                      <w:szCs w:val="22"/>
-                      <w:color w:val="000000"/>
-                    </w:rPr>
                   </w:pPr>
                   <w:r xmlns:w="http://schemas.openxmlformats.org/wordprocessingml/2006/main" xmlns:wp="http://schemas.openxmlformats.org/drawingml/2006/wordprocessingDrawing" xmlns:r="http://schemas.openxmlformats.org/officeDocument/2006/relationships" xmlns:w14="http://schemas.microsoft.com/office/word/2010/wordml">
                     <w:rPr>
@@ -3670,20 +3554,20 @@
                       <w:i w:val="false"/>
                       <w:b w:val="false"/>
                       <w:u w:val="none"/>
-                      <w:strike w:val="false"/>
                       <w:sz w:val="22"/>
                       <w:szCs w:val="22"/>
                       <w:color w:val="000000"/>
                     </w:rPr>
-                    <w:t xml:space="preserve">4.107</w:t>
+                    <w:t xml:space="preserve">-0.189</w:t>
                   </w:r>
                 </w:p>
               </w:tc>
             </w:tr>
             <w:tr>
               <w:trPr>
-                <w:trHeight w:val="618" w:hRule="auto"/>
+                <w:trHeight w:val="620" w:hRule="auto"/>
               </w:trPr>
+              body 3
               <w:tc>
                 <w:tcPr>
                   <w:tcBorders>
@@ -3703,6 +3587,7 @@
                 </w:tcPr>
                 <w:p>
                   <w:pPr>
+                    <w:pStyle w:val="Normal"/>
                     <w:jc w:val="left"/>
                     <w:pBdr>
                       <w:bottom w:val="none" w:sz="0" w:space="0" w:color="000000"/>
@@ -3712,16 +3597,6 @@
                     </w:pBdr>
                     <w:spacing w:after="100" w:before="100" w:line="240"/>
                     <w:ind w:left="100" w:right="100" w:firstLine="0" w:firstLineChars="0"/>
-                    <w:rPr>
-                      <w:rFonts w:ascii="Helvetica" w:hAnsi="Helvetica" w:eastAsia="Helvetica" w:cs="Helvetica"/>
-                      <w:i w:val="false"/>
-                      <w:b w:val="false"/>
-                      <w:u w:val="none"/>
-                      <w:strike w:val="false"/>
-                      <w:sz w:val="22"/>
-                      <w:szCs w:val="22"/>
-                      <w:color w:val="000000"/>
-                    </w:rPr>
                   </w:pPr>
                   <w:r xmlns:w="http://schemas.openxmlformats.org/wordprocessingml/2006/main" xmlns:wp="http://schemas.openxmlformats.org/drawingml/2006/wordprocessingDrawing" xmlns:r="http://schemas.openxmlformats.org/officeDocument/2006/relationships" xmlns:w14="http://schemas.microsoft.com/office/word/2010/wordml">
                     <w:rPr>
@@ -3729,7 +3604,188 @@
                       <w:i w:val="false"/>
                       <w:b w:val="false"/>
                       <w:u w:val="none"/>
-                      <w:strike w:val="false"/>
+                      <w:sz w:val="22"/>
+                      <w:szCs w:val="22"/>
+                      <w:color w:val="000000"/>
+                    </w:rPr>
+                    <w:t xml:space="preserve">Egg size: Intercept (Brood 1)</w:t>
+                  </w:r>
+                </w:p>
+              </w:tc>
+              <w:tc>
+                <w:tcPr>
+                  <w:tcBorders>
+                    <w:bottom w:val="none" w:sz="0" w:space="0" w:color="000000"/>
+                    <w:top w:val="none" w:sz="0" w:space="0" w:color="000000"/>
+                    <w:left w:val="none" w:sz="0" w:space="0" w:color="000000"/>
+                    <w:right w:val="none" w:sz="0" w:space="0" w:color="000000"/>
+                  </w:tcBorders>
+                  <w:shd w:val="clear" w:color="auto" w:fill="FFFFFF"/>
+                  <w:tcMar>
+                    <w:top w:w="0" w:type="dxa"/>
+                    <w:bottom w:w="0" w:type="dxa"/>
+                    <w:left w:w="0" w:type="dxa"/>
+                    <w:right w:w="0" w:type="dxa"/>
+                  </w:tcMar>
+                  <w:vAlign w:val="center"/>
+                </w:tcPr>
+                <w:p>
+                  <w:pPr>
+                    <w:pStyle w:val="Normal"/>
+                    <w:jc w:val="right"/>
+                    <w:pBdr>
+                      <w:bottom w:val="none" w:sz="0" w:space="0" w:color="000000"/>
+                      <w:top w:val="none" w:sz="0" w:space="0" w:color="000000"/>
+                      <w:left w:val="none" w:sz="0" w:space="0" w:color="000000"/>
+                      <w:right w:val="none" w:sz="0" w:space="0" w:color="000000"/>
+                    </w:pBdr>
+                    <w:spacing w:after="100" w:before="100" w:line="240"/>
+                    <w:ind w:left="100" w:right="100" w:firstLine="0" w:firstLineChars="0"/>
+                  </w:pPr>
+                  <w:r xmlns:w="http://schemas.openxmlformats.org/wordprocessingml/2006/main" xmlns:wp="http://schemas.openxmlformats.org/drawingml/2006/wordprocessingDrawing" xmlns:r="http://schemas.openxmlformats.org/officeDocument/2006/relationships" xmlns:w14="http://schemas.microsoft.com/office/word/2010/wordml">
+                    <w:rPr>
+                      <w:rFonts w:ascii="Helvetica" w:hAnsi="Helvetica" w:eastAsia="Helvetica" w:cs="Helvetica"/>
+                      <w:i w:val="false"/>
+                      <w:b w:val="false"/>
+                      <w:u w:val="none"/>
+                      <w:sz w:val="22"/>
+                      <w:szCs w:val="22"/>
+                      <w:color w:val="000000"/>
+                    </w:rPr>
+                    <w:t xml:space="preserve">3.543</w:t>
+                  </w:r>
+                </w:p>
+              </w:tc>
+              <w:tc>
+                <w:tcPr>
+                  <w:tcBorders>
+                    <w:bottom w:val="none" w:sz="0" w:space="0" w:color="000000"/>
+                    <w:top w:val="none" w:sz="0" w:space="0" w:color="000000"/>
+                    <w:left w:val="none" w:sz="0" w:space="0" w:color="000000"/>
+                    <w:right w:val="none" w:sz="0" w:space="0" w:color="000000"/>
+                  </w:tcBorders>
+                  <w:shd w:val="clear" w:color="auto" w:fill="FFFFFF"/>
+                  <w:tcMar>
+                    <w:top w:w="0" w:type="dxa"/>
+                    <w:bottom w:w="0" w:type="dxa"/>
+                    <w:left w:w="0" w:type="dxa"/>
+                    <w:right w:w="0" w:type="dxa"/>
+                  </w:tcMar>
+                  <w:vAlign w:val="center"/>
+                </w:tcPr>
+                <w:p>
+                  <w:pPr>
+                    <w:pStyle w:val="Normal"/>
+                    <w:jc w:val="right"/>
+                    <w:pBdr>
+                      <w:bottom w:val="none" w:sz="0" w:space="0" w:color="000000"/>
+                      <w:top w:val="none" w:sz="0" w:space="0" w:color="000000"/>
+                      <w:left w:val="none" w:sz="0" w:space="0" w:color="000000"/>
+                      <w:right w:val="none" w:sz="0" w:space="0" w:color="000000"/>
+                    </w:pBdr>
+                    <w:spacing w:after="100" w:before="100" w:line="240"/>
+                    <w:ind w:left="100" w:right="100" w:firstLine="0" w:firstLineChars="0"/>
+                  </w:pPr>
+                  <w:r xmlns:w="http://schemas.openxmlformats.org/wordprocessingml/2006/main" xmlns:wp="http://schemas.openxmlformats.org/drawingml/2006/wordprocessingDrawing" xmlns:r="http://schemas.openxmlformats.org/officeDocument/2006/relationships" xmlns:w14="http://schemas.microsoft.com/office/word/2010/wordml">
+                    <w:rPr>
+                      <w:rFonts w:ascii="Helvetica" w:hAnsi="Helvetica" w:eastAsia="Helvetica" w:cs="Helvetica"/>
+                      <w:i w:val="false"/>
+                      <w:b w:val="false"/>
+                      <w:u w:val="none"/>
+                      <w:sz w:val="22"/>
+                      <w:szCs w:val="22"/>
+                      <w:color w:val="000000"/>
+                    </w:rPr>
+                    <w:t xml:space="preserve">3.468</w:t>
+                  </w:r>
+                </w:p>
+              </w:tc>
+              <w:tc>
+                <w:tcPr>
+                  <w:tcBorders>
+                    <w:bottom w:val="none" w:sz="0" w:space="0" w:color="000000"/>
+                    <w:top w:val="none" w:sz="0" w:space="0" w:color="000000"/>
+                    <w:left w:val="none" w:sz="0" w:space="0" w:color="000000"/>
+                    <w:right w:val="none" w:sz="0" w:space="0" w:color="000000"/>
+                  </w:tcBorders>
+                  <w:shd w:val="clear" w:color="auto" w:fill="FFFFFF"/>
+                  <w:tcMar>
+                    <w:top w:w="0" w:type="dxa"/>
+                    <w:bottom w:w="0" w:type="dxa"/>
+                    <w:left w:w="0" w:type="dxa"/>
+                    <w:right w:w="0" w:type="dxa"/>
+                  </w:tcMar>
+                  <w:vAlign w:val="center"/>
+                </w:tcPr>
+                <w:p>
+                  <w:pPr>
+                    <w:pStyle w:val="Normal"/>
+                    <w:jc w:val="right"/>
+                    <w:pBdr>
+                      <w:bottom w:val="none" w:sz="0" w:space="0" w:color="000000"/>
+                      <w:top w:val="none" w:sz="0" w:space="0" w:color="000000"/>
+                      <w:left w:val="none" w:sz="0" w:space="0" w:color="000000"/>
+                      <w:right w:val="none" w:sz="0" w:space="0" w:color="000000"/>
+                    </w:pBdr>
+                    <w:spacing w:after="100" w:before="100" w:line="240"/>
+                    <w:ind w:left="100" w:right="100" w:firstLine="0" w:firstLineChars="0"/>
+                  </w:pPr>
+                  <w:r xmlns:w="http://schemas.openxmlformats.org/wordprocessingml/2006/main" xmlns:wp="http://schemas.openxmlformats.org/drawingml/2006/wordprocessingDrawing" xmlns:r="http://schemas.openxmlformats.org/officeDocument/2006/relationships" xmlns:w14="http://schemas.microsoft.com/office/word/2010/wordml">
+                    <w:rPr>
+                      <w:rFonts w:ascii="Helvetica" w:hAnsi="Helvetica" w:eastAsia="Helvetica" w:cs="Helvetica"/>
+                      <w:i w:val="false"/>
+                      <w:b w:val="false"/>
+                      <w:u w:val="none"/>
+                      <w:sz w:val="22"/>
+                      <w:szCs w:val="22"/>
+                      <w:color w:val="000000"/>
+                    </w:rPr>
+                    <w:t xml:space="preserve">3.618</w:t>
+                  </w:r>
+                </w:p>
+              </w:tc>
+            </w:tr>
+            <w:tr>
+              <w:trPr>
+                <w:trHeight w:val="618" w:hRule="auto"/>
+              </w:trPr>
+              body 4
+              <w:tc>
+                <w:tcPr>
+                  <w:tcBorders>
+                    <w:bottom w:val="none" w:sz="0" w:space="0" w:color="000000"/>
+                    <w:top w:val="none" w:sz="0" w:space="0" w:color="000000"/>
+                    <w:left w:val="none" w:sz="0" w:space="0" w:color="000000"/>
+                    <w:right w:val="none" w:sz="0" w:space="0" w:color="000000"/>
+                  </w:tcBorders>
+                  <w:shd w:val="clear" w:color="auto" w:fill="FFFFFF"/>
+                  <w:tcMar>
+                    <w:top w:w="0" w:type="dxa"/>
+                    <w:bottom w:w="0" w:type="dxa"/>
+                    <w:left w:w="0" w:type="dxa"/>
+                    <w:right w:w="0" w:type="dxa"/>
+                  </w:tcMar>
+                  <w:vAlign w:val="center"/>
+                </w:tcPr>
+                <w:p>
+                  <w:pPr>
+                    <w:pStyle w:val="Normal"/>
+                    <w:jc w:val="left"/>
+                    <w:pBdr>
+                      <w:bottom w:val="none" w:sz="0" w:space="0" w:color="000000"/>
+                      <w:top w:val="none" w:sz="0" w:space="0" w:color="000000"/>
+                      <w:left w:val="none" w:sz="0" w:space="0" w:color="000000"/>
+                      <w:right w:val="none" w:sz="0" w:space="0" w:color="000000"/>
+                    </w:pBdr>
+                    <w:spacing w:after="100" w:before="100" w:line="240"/>
+                    <w:ind w:left="100" w:right="100" w:firstLine="0" w:firstLineChars="0"/>
+                  </w:pPr>
+                  <w:r xmlns:w="http://schemas.openxmlformats.org/wordprocessingml/2006/main" xmlns:wp="http://schemas.openxmlformats.org/drawingml/2006/wordprocessingDrawing" xmlns:r="http://schemas.openxmlformats.org/officeDocument/2006/relationships" xmlns:w14="http://schemas.microsoft.com/office/word/2010/wordml">
+                    <w:rPr>
+                      <w:rFonts w:ascii="Helvetica" w:hAnsi="Helvetica" w:eastAsia="Helvetica" w:cs="Helvetica"/>
+                      <w:i w:val="false"/>
+                      <w:b w:val="false"/>
+                      <w:u w:val="none"/>
                       <w:sz w:val="22"/>
                       <w:szCs w:val="22"/>
                       <w:color w:val="000000"/>
@@ -3757,6 +3813,7 @@
                 </w:tcPr>
                 <w:p>
                   <w:pPr>
+                    <w:pStyle w:val="Normal"/>
                     <w:jc w:val="right"/>
                     <w:pBdr>
                       <w:bottom w:val="none" w:sz="0" w:space="0" w:color="000000"/>
@@ -3766,16 +3823,6 @@
                     </w:pBdr>
                     <w:spacing w:after="100" w:before="100" w:line="240"/>
                     <w:ind w:left="100" w:right="100" w:firstLine="0" w:firstLineChars="0"/>
-                    <w:rPr>
-                      <w:rFonts w:ascii="Helvetica" w:hAnsi="Helvetica" w:eastAsia="Helvetica" w:cs="Helvetica"/>
-                      <w:i w:val="false"/>
-                      <w:b w:val="false"/>
-                      <w:u w:val="none"/>
-                      <w:strike w:val="false"/>
-                      <w:sz w:val="22"/>
-                      <w:szCs w:val="22"/>
-                      <w:color w:val="000000"/>
-                    </w:rPr>
                   </w:pPr>
                   <w:r xmlns:w="http://schemas.openxmlformats.org/wordprocessingml/2006/main" xmlns:wp="http://schemas.openxmlformats.org/drawingml/2006/wordprocessingDrawing" xmlns:r="http://schemas.openxmlformats.org/officeDocument/2006/relationships" xmlns:w14="http://schemas.microsoft.com/office/word/2010/wordml">
                     <w:rPr>
@@ -3783,7 +3830,6 @@
                       <w:i w:val="false"/>
                       <w:b w:val="false"/>
                       <w:u w:val="none"/>
-                      <w:strike w:val="false"/>
                       <w:sz w:val="22"/>
                       <w:szCs w:val="22"/>
                       <w:color w:val="000000"/>
@@ -3811,6 +3857,7 @@
                 </w:tcPr>
                 <w:p>
                   <w:pPr>
+                    <w:pStyle w:val="Normal"/>
                     <w:jc w:val="right"/>
                     <w:pBdr>
                       <w:bottom w:val="none" w:sz="0" w:space="0" w:color="000000"/>
@@ -3820,16 +3867,6 @@
                     </w:pBdr>
                     <w:spacing w:after="100" w:before="100" w:line="240"/>
                     <w:ind w:left="100" w:right="100" w:firstLine="0" w:firstLineChars="0"/>
-                    <w:rPr>
-                      <w:rFonts w:ascii="Helvetica" w:hAnsi="Helvetica" w:eastAsia="Helvetica" w:cs="Helvetica"/>
-                      <w:i w:val="false"/>
-                      <w:b w:val="false"/>
-                      <w:u w:val="none"/>
-                      <w:strike w:val="false"/>
-                      <w:sz w:val="22"/>
-                      <w:szCs w:val="22"/>
-                      <w:color w:val="000000"/>
-                    </w:rPr>
                   </w:pPr>
                   <w:r xmlns:w="http://schemas.openxmlformats.org/wordprocessingml/2006/main" xmlns:wp="http://schemas.openxmlformats.org/drawingml/2006/wordprocessingDrawing" xmlns:r="http://schemas.openxmlformats.org/officeDocument/2006/relationships" xmlns:w14="http://schemas.microsoft.com/office/word/2010/wordml">
                     <w:rPr>
@@ -3837,7 +3874,6 @@
                       <w:i w:val="false"/>
                       <w:b w:val="false"/>
                       <w:u w:val="none"/>
-                      <w:strike w:val="false"/>
                       <w:sz w:val="22"/>
                       <w:szCs w:val="22"/>
                       <w:color w:val="000000"/>
@@ -3865,6 +3901,7 @@
                 </w:tcPr>
                 <w:p>
                   <w:pPr>
+                    <w:pStyle w:val="Normal"/>
                     <w:jc w:val="right"/>
                     <w:pBdr>
                       <w:bottom w:val="none" w:sz="0" w:space="0" w:color="000000"/>
@@ -3874,16 +3911,6 @@
                     </w:pBdr>
                     <w:spacing w:after="100" w:before="100" w:line="240"/>
                     <w:ind w:left="100" w:right="100" w:firstLine="0" w:firstLineChars="0"/>
-                    <w:rPr>
-                      <w:rFonts w:ascii="Helvetica" w:hAnsi="Helvetica" w:eastAsia="Helvetica" w:cs="Helvetica"/>
-                      <w:i w:val="false"/>
-                      <w:b w:val="false"/>
-                      <w:u w:val="none"/>
-                      <w:strike w:val="false"/>
-                      <w:sz w:val="22"/>
-                      <w:szCs w:val="22"/>
-                      <w:color w:val="000000"/>
-                    </w:rPr>
                   </w:pPr>
                   <w:r xmlns:w="http://schemas.openxmlformats.org/wordprocessingml/2006/main" xmlns:wp="http://schemas.openxmlformats.org/drawingml/2006/wordprocessingDrawing" xmlns:r="http://schemas.openxmlformats.org/officeDocument/2006/relationships" xmlns:w14="http://schemas.microsoft.com/office/word/2010/wordml">
                     <w:rPr>
@@ -3891,7 +3918,6 @@
                       <w:i w:val="false"/>
                       <w:b w:val="false"/>
                       <w:u w:val="none"/>
-                      <w:strike w:val="false"/>
                       <w:sz w:val="22"/>
                       <w:szCs w:val="22"/>
                       <w:color w:val="000000"/>
@@ -3905,6 +3931,7 @@
               <w:trPr>
                 <w:trHeight w:val="620" w:hRule="auto"/>
               </w:trPr>
+              body 5
               <w:tc>
                 <w:tcPr>
                   <w:tcBorders>
@@ -3924,6 +3951,7 @@
                 </w:tcPr>
                 <w:p>
                   <w:pPr>
+                    <w:pStyle w:val="Normal"/>
                     <w:jc w:val="left"/>
                     <w:pBdr>
                       <w:bottom w:val="none" w:sz="0" w:space="0" w:color="000000"/>
@@ -3933,16 +3961,6 @@
                     </w:pBdr>
                     <w:spacing w:after="100" w:before="100" w:line="240"/>
                     <w:ind w:left="100" w:right="100" w:firstLine="0" w:firstLineChars="0"/>
-                    <w:rPr>
-                      <w:rFonts w:ascii="Helvetica" w:hAnsi="Helvetica" w:eastAsia="Helvetica" w:cs="Helvetica"/>
-                      <w:i w:val="false"/>
-                      <w:b w:val="false"/>
-                      <w:u w:val="none"/>
-                      <w:strike w:val="false"/>
-                      <w:sz w:val="22"/>
-                      <w:szCs w:val="22"/>
-                      <w:color w:val="000000"/>
-                    </w:rPr>
                   </w:pPr>
                   <w:r xmlns:w="http://schemas.openxmlformats.org/wordprocessingml/2006/main" xmlns:wp="http://schemas.openxmlformats.org/drawingml/2006/wordprocessingDrawing" xmlns:r="http://schemas.openxmlformats.org/officeDocument/2006/relationships" xmlns:w14="http://schemas.microsoft.com/office/word/2010/wordml">
                     <w:rPr>
@@ -3950,7 +3968,6 @@
                       <w:i w:val="false"/>
                       <w:b w:val="false"/>
                       <w:u w:val="none"/>
-                      <w:strike w:val="false"/>
                       <w:sz w:val="22"/>
                       <w:szCs w:val="22"/>
                       <w:color w:val="000000"/>
@@ -3978,6 +3995,7 @@
                 </w:tcPr>
                 <w:p>
                   <w:pPr>
+                    <w:pStyle w:val="Normal"/>
                     <w:jc w:val="right"/>
                     <w:pBdr>
                       <w:bottom w:val="none" w:sz="0" w:space="0" w:color="000000"/>
@@ -3987,16 +4005,6 @@
                     </w:pBdr>
                     <w:spacing w:after="100" w:before="100" w:line="240"/>
                     <w:ind w:left="100" w:right="100" w:firstLine="0" w:firstLineChars="0"/>
-                    <w:rPr>
-                      <w:rFonts w:ascii="Helvetica" w:hAnsi="Helvetica" w:eastAsia="Helvetica" w:cs="Helvetica"/>
-                      <w:i w:val="false"/>
-                      <w:b w:val="false"/>
-                      <w:u w:val="none"/>
-                      <w:strike w:val="false"/>
-                      <w:sz w:val="22"/>
-                      <w:szCs w:val="22"/>
-                      <w:color w:val="000000"/>
-                    </w:rPr>
                   </w:pPr>
                   <w:r xmlns:w="http://schemas.openxmlformats.org/wordprocessingml/2006/main" xmlns:wp="http://schemas.openxmlformats.org/drawingml/2006/wordprocessingDrawing" xmlns:r="http://schemas.openxmlformats.org/officeDocument/2006/relationships" xmlns:w14="http://schemas.microsoft.com/office/word/2010/wordml">
                     <w:rPr>
@@ -4004,7 +4012,6 @@
                       <w:i w:val="false"/>
                       <w:b w:val="false"/>
                       <w:u w:val="none"/>
-                      <w:strike w:val="false"/>
                       <w:sz w:val="22"/>
                       <w:szCs w:val="22"/>
                       <w:color w:val="000000"/>
@@ -4032,6 +4039,7 @@
                 </w:tcPr>
                 <w:p>
                   <w:pPr>
+                    <w:pStyle w:val="Normal"/>
                     <w:jc w:val="right"/>
                     <w:pBdr>
                       <w:bottom w:val="none" w:sz="0" w:space="0" w:color="000000"/>
@@ -4041,16 +4049,6 @@
                     </w:pBdr>
                     <w:spacing w:after="100" w:before="100" w:line="240"/>
                     <w:ind w:left="100" w:right="100" w:firstLine="0" w:firstLineChars="0"/>
-                    <w:rPr>
-                      <w:rFonts w:ascii="Helvetica" w:hAnsi="Helvetica" w:eastAsia="Helvetica" w:cs="Helvetica"/>
-                      <w:i w:val="false"/>
-                      <w:b w:val="false"/>
-                      <w:u w:val="none"/>
-                      <w:strike w:val="false"/>
-                      <w:sz w:val="22"/>
-                      <w:szCs w:val="22"/>
-                      <w:color w:val="000000"/>
-                    </w:rPr>
                   </w:pPr>
                   <w:r xmlns:w="http://schemas.openxmlformats.org/wordprocessingml/2006/main" xmlns:wp="http://schemas.openxmlformats.org/drawingml/2006/wordprocessingDrawing" xmlns:r="http://schemas.openxmlformats.org/officeDocument/2006/relationships" xmlns:w14="http://schemas.microsoft.com/office/word/2010/wordml">
                     <w:rPr>
@@ -4058,7 +4056,6 @@
                       <w:i w:val="false"/>
                       <w:b w:val="false"/>
                       <w:u w:val="none"/>
-                      <w:strike w:val="false"/>
                       <w:sz w:val="22"/>
                       <w:szCs w:val="22"/>
                       <w:color w:val="000000"/>
@@ -4086,6 +4083,7 @@
                 </w:tcPr>
                 <w:p>
                   <w:pPr>
+                    <w:pStyle w:val="Normal"/>
                     <w:jc w:val="right"/>
                     <w:pBdr>
                       <w:bottom w:val="none" w:sz="0" w:space="0" w:color="000000"/>
@@ -4095,16 +4093,6 @@
                     </w:pBdr>
                     <w:spacing w:after="100" w:before="100" w:line="240"/>
                     <w:ind w:left="100" w:right="100" w:firstLine="0" w:firstLineChars="0"/>
-                    <w:rPr>
-                      <w:rFonts w:ascii="Helvetica" w:hAnsi="Helvetica" w:eastAsia="Helvetica" w:cs="Helvetica"/>
-                      <w:i w:val="false"/>
-                      <w:b w:val="false"/>
-                      <w:u w:val="none"/>
-                      <w:strike w:val="false"/>
-                      <w:sz w:val="22"/>
-                      <w:szCs w:val="22"/>
-                      <w:color w:val="000000"/>
-                    </w:rPr>
                   </w:pPr>
                   <w:r xmlns:w="http://schemas.openxmlformats.org/wordprocessingml/2006/main" xmlns:wp="http://schemas.openxmlformats.org/drawingml/2006/wordprocessingDrawing" xmlns:r="http://schemas.openxmlformats.org/officeDocument/2006/relationships" xmlns:w14="http://schemas.microsoft.com/office/word/2010/wordml">
                     <w:rPr>
@@ -4112,7 +4100,6 @@
                       <w:i w:val="false"/>
                       <w:b w:val="false"/>
                       <w:u w:val="none"/>
-                      <w:strike w:val="false"/>
                       <w:sz w:val="22"/>
                       <w:szCs w:val="22"/>
                       <w:color w:val="000000"/>
@@ -4126,6 +4113,7 @@
               <w:trPr>
                 <w:trHeight w:val="620" w:hRule="auto"/>
               </w:trPr>
+              body 6
               <w:tc>
                 <w:tcPr>
                   <w:tcBorders>
@@ -4145,6 +4133,7 @@
                 </w:tcPr>
                 <w:p>
                   <w:pPr>
+                    <w:pStyle w:val="Normal"/>
                     <w:jc w:val="left"/>
                     <w:pBdr>
                       <w:bottom w:val="none" w:sz="0" w:space="0" w:color="000000"/>
@@ -4154,16 +4143,6 @@
                     </w:pBdr>
                     <w:spacing w:after="100" w:before="100" w:line="240"/>
                     <w:ind w:left="100" w:right="100" w:firstLine="0" w:firstLineChars="0"/>
-                    <w:rPr>
-                      <w:rFonts w:ascii="Helvetica" w:hAnsi="Helvetica" w:eastAsia="Helvetica" w:cs="Helvetica"/>
-                      <w:i w:val="false"/>
-                      <w:b w:val="false"/>
-                      <w:u w:val="none"/>
-                      <w:strike w:val="false"/>
-                      <w:sz w:val="22"/>
-                      <w:szCs w:val="22"/>
-                      <w:color w:val="000000"/>
-                    </w:rPr>
                   </w:pPr>
                   <w:r xmlns:w="http://schemas.openxmlformats.org/wordprocessingml/2006/main" xmlns:wp="http://schemas.openxmlformats.org/drawingml/2006/wordprocessingDrawing" xmlns:r="http://schemas.openxmlformats.org/officeDocument/2006/relationships" xmlns:w14="http://schemas.microsoft.com/office/word/2010/wordml">
                     <w:rPr>
@@ -4171,7 +4150,6 @@
                       <w:i w:val="false"/>
                       <w:b w:val="false"/>
                       <w:u w:val="none"/>
-                      <w:strike w:val="false"/>
                       <w:sz w:val="22"/>
                       <w:szCs w:val="22"/>
                       <w:color w:val="000000"/>
@@ -4199,6 +4177,7 @@
                 </w:tcPr>
                 <w:p>
                   <w:pPr>
+                    <w:pStyle w:val="Normal"/>
                     <w:jc w:val="right"/>
                     <w:pBdr>
                       <w:bottom w:val="none" w:sz="0" w:space="0" w:color="000000"/>
@@ -4208,16 +4187,6 @@
                     </w:pBdr>
                     <w:spacing w:after="100" w:before="100" w:line="240"/>
                     <w:ind w:left="100" w:right="100" w:firstLine="0" w:firstLineChars="0"/>
-                    <w:rPr>
-                      <w:rFonts w:ascii="Helvetica" w:hAnsi="Helvetica" w:eastAsia="Helvetica" w:cs="Helvetica"/>
-                      <w:i w:val="false"/>
-                      <w:b w:val="false"/>
-                      <w:u w:val="none"/>
-                      <w:strike w:val="false"/>
-                      <w:sz w:val="22"/>
-                      <w:szCs w:val="22"/>
-                      <w:color w:val="000000"/>
-                    </w:rPr>
                   </w:pPr>
                   <w:r xmlns:w="http://schemas.openxmlformats.org/wordprocessingml/2006/main" xmlns:wp="http://schemas.openxmlformats.org/drawingml/2006/wordprocessingDrawing" xmlns:r="http://schemas.openxmlformats.org/officeDocument/2006/relationships" xmlns:w14="http://schemas.microsoft.com/office/word/2010/wordml">
                     <w:rPr>
@@ -4225,7 +4194,6 @@
                       <w:i w:val="false"/>
                       <w:b w:val="false"/>
                       <w:u w:val="none"/>
-                      <w:strike w:val="false"/>
                       <w:sz w:val="22"/>
                       <w:szCs w:val="22"/>
                       <w:color w:val="000000"/>
@@ -4253,6 +4221,7 @@
                 </w:tcPr>
                 <w:p>
                   <w:pPr>
+                    <w:pStyle w:val="Normal"/>
                     <w:jc w:val="right"/>
                     <w:pBdr>
                       <w:bottom w:val="none" w:sz="0" w:space="0" w:color="000000"/>
@@ -4262,16 +4231,6 @@
                     </w:pBdr>
                     <w:spacing w:after="100" w:before="100" w:line="240"/>
                     <w:ind w:left="100" w:right="100" w:firstLine="0" w:firstLineChars="0"/>
-                    <w:rPr>
-                      <w:rFonts w:ascii="Helvetica" w:hAnsi="Helvetica" w:eastAsia="Helvetica" w:cs="Helvetica"/>
-                      <w:i w:val="false"/>
-                      <w:b w:val="false"/>
-                      <w:u w:val="none"/>
-                      <w:strike w:val="false"/>
-                      <w:sz w:val="22"/>
-                      <w:szCs w:val="22"/>
-                      <w:color w:val="000000"/>
-                    </w:rPr>
                   </w:pPr>
                   <w:r xmlns:w="http://schemas.openxmlformats.org/wordprocessingml/2006/main" xmlns:wp="http://schemas.openxmlformats.org/drawingml/2006/wordprocessingDrawing" xmlns:r="http://schemas.openxmlformats.org/officeDocument/2006/relationships" xmlns:w14="http://schemas.microsoft.com/office/word/2010/wordml">
                     <w:rPr>
@@ -4279,7 +4238,6 @@
                       <w:i w:val="false"/>
                       <w:b w:val="false"/>
                       <w:u w:val="none"/>
-                      <w:strike w:val="false"/>
                       <w:sz w:val="22"/>
                       <w:szCs w:val="22"/>
                       <w:color w:val="000000"/>
@@ -4307,6 +4265,7 @@
                 </w:tcPr>
                 <w:p>
                   <w:pPr>
+                    <w:pStyle w:val="Normal"/>
                     <w:jc w:val="right"/>
                     <w:pBdr>
                       <w:bottom w:val="none" w:sz="0" w:space="0" w:color="000000"/>
@@ -4316,16 +4275,6 @@
                     </w:pBdr>
                     <w:spacing w:after="100" w:before="100" w:line="240"/>
                     <w:ind w:left="100" w:right="100" w:firstLine="0" w:firstLineChars="0"/>
-                    <w:rPr>
-                      <w:rFonts w:ascii="Helvetica" w:hAnsi="Helvetica" w:eastAsia="Helvetica" w:cs="Helvetica"/>
-                      <w:i w:val="false"/>
-                      <w:b w:val="false"/>
-                      <w:u w:val="none"/>
-                      <w:strike w:val="false"/>
-                      <w:sz w:val="22"/>
-                      <w:szCs w:val="22"/>
-                      <w:color w:val="000000"/>
-                    </w:rPr>
                   </w:pPr>
                   <w:r xmlns:w="http://schemas.openxmlformats.org/wordprocessingml/2006/main" xmlns:wp="http://schemas.openxmlformats.org/drawingml/2006/wordprocessingDrawing" xmlns:r="http://schemas.openxmlformats.org/officeDocument/2006/relationships" xmlns:w14="http://schemas.microsoft.com/office/word/2010/wordml">
                     <w:rPr>
@@ -4333,7 +4282,6 @@
                       <w:i w:val="false"/>
                       <w:b w:val="false"/>
                       <w:u w:val="none"/>
-                      <w:strike w:val="false"/>
                       <w:sz w:val="22"/>
                       <w:szCs w:val="22"/>
                       <w:color w:val="000000"/>
@@ -4345,8 +4293,9 @@
             </w:tr>
             <w:tr>
               <w:trPr>
-                <w:trHeight w:val="620" w:hRule="auto"/>
+                <w:trHeight w:val="618" w:hRule="auto"/>
               </w:trPr>
+              body 7
               <w:tc>
                 <w:tcPr>
                   <w:tcBorders>
@@ -4366,6 +4315,7 @@
                 </w:tcPr>
                 <w:p>
                   <w:pPr>
+                    <w:pStyle w:val="Normal"/>
                     <w:jc w:val="left"/>
                     <w:pBdr>
                       <w:bottom w:val="none" w:sz="0" w:space="0" w:color="000000"/>
@@ -4375,16 +4325,6 @@
                     </w:pBdr>
                     <w:spacing w:after="100" w:before="100" w:line="240"/>
                     <w:ind w:left="100" w:right="100" w:firstLine="0" w:firstLineChars="0"/>
-                    <w:rPr>
-                      <w:rFonts w:ascii="Helvetica" w:hAnsi="Helvetica" w:eastAsia="Helvetica" w:cs="Helvetica"/>
-                      <w:i w:val="false"/>
-                      <w:b w:val="false"/>
-                      <w:u w:val="none"/>
-                      <w:strike w:val="false"/>
-                      <w:sz w:val="22"/>
-                      <w:szCs w:val="22"/>
-                      <w:color w:val="000000"/>
-                    </w:rPr>
                   </w:pPr>
                   <w:r xmlns:w="http://schemas.openxmlformats.org/wordprocessingml/2006/main" xmlns:wp="http://schemas.openxmlformats.org/drawingml/2006/wordprocessingDrawing" xmlns:r="http://schemas.openxmlformats.org/officeDocument/2006/relationships" xmlns:w14="http://schemas.microsoft.com/office/word/2010/wordml">
                     <w:rPr>
@@ -4392,228 +4332,6 @@
                       <w:i w:val="false"/>
                       <w:b w:val="false"/>
                       <w:u w:val="none"/>
-                      <w:strike w:val="false"/>
-                      <w:sz w:val="22"/>
-                      <w:szCs w:val="22"/>
-                      <w:color w:val="000000"/>
-                    </w:rPr>
-                    <w:t xml:space="preserve">Egg size: Intercept (Brood 1)</w:t>
-                  </w:r>
-                </w:p>
-              </w:tc>
-              <w:tc>
-                <w:tcPr>
-                  <w:tcBorders>
-                    <w:bottom w:val="none" w:sz="0" w:space="0" w:color="000000"/>
-                    <w:top w:val="none" w:sz="0" w:space="0" w:color="000000"/>
-                    <w:left w:val="none" w:sz="0" w:space="0" w:color="000000"/>
-                    <w:right w:val="none" w:sz="0" w:space="0" w:color="000000"/>
-                  </w:tcBorders>
-                  <w:shd w:val="clear" w:color="auto" w:fill="FFFFFF"/>
-                  <w:tcMar>
-                    <w:top w:w="0" w:type="dxa"/>
-                    <w:bottom w:w="0" w:type="dxa"/>
-                    <w:left w:w="0" w:type="dxa"/>
-                    <w:right w:w="0" w:type="dxa"/>
-                  </w:tcMar>
-                  <w:vAlign w:val="center"/>
-                </w:tcPr>
-                <w:p>
-                  <w:pPr>
-                    <w:jc w:val="right"/>
-                    <w:pBdr>
-                      <w:bottom w:val="none" w:sz="0" w:space="0" w:color="000000"/>
-                      <w:top w:val="none" w:sz="0" w:space="0" w:color="000000"/>
-                      <w:left w:val="none" w:sz="0" w:space="0" w:color="000000"/>
-                      <w:right w:val="none" w:sz="0" w:space="0" w:color="000000"/>
-                    </w:pBdr>
-                    <w:spacing w:after="100" w:before="100" w:line="240"/>
-                    <w:ind w:left="100" w:right="100" w:firstLine="0" w:firstLineChars="0"/>
-                    <w:rPr>
-                      <w:rFonts w:ascii="Helvetica" w:hAnsi="Helvetica" w:eastAsia="Helvetica" w:cs="Helvetica"/>
-                      <w:i w:val="false"/>
-                      <w:b w:val="false"/>
-                      <w:u w:val="none"/>
-                      <w:strike w:val="false"/>
-                      <w:sz w:val="22"/>
-                      <w:szCs w:val="22"/>
-                      <w:color w:val="000000"/>
-                    </w:rPr>
-                  </w:pPr>
-                  <w:r xmlns:w="http://schemas.openxmlformats.org/wordprocessingml/2006/main" xmlns:wp="http://schemas.openxmlformats.org/drawingml/2006/wordprocessingDrawing" xmlns:r="http://schemas.openxmlformats.org/officeDocument/2006/relationships" xmlns:w14="http://schemas.microsoft.com/office/word/2010/wordml">
-                    <w:rPr>
-                      <w:rFonts w:ascii="Helvetica" w:hAnsi="Helvetica" w:eastAsia="Helvetica" w:cs="Helvetica"/>
-                      <w:i w:val="false"/>
-                      <w:b w:val="false"/>
-                      <w:u w:val="none"/>
-                      <w:strike w:val="false"/>
-                      <w:sz w:val="22"/>
-                      <w:szCs w:val="22"/>
-                      <w:color w:val="000000"/>
-                    </w:rPr>
-                    <w:t xml:space="preserve">3.543</w:t>
-                  </w:r>
-                </w:p>
-              </w:tc>
-              <w:tc>
-                <w:tcPr>
-                  <w:tcBorders>
-                    <w:bottom w:val="none" w:sz="0" w:space="0" w:color="000000"/>
-                    <w:top w:val="none" w:sz="0" w:space="0" w:color="000000"/>
-                    <w:left w:val="none" w:sz="0" w:space="0" w:color="000000"/>
-                    <w:right w:val="none" w:sz="0" w:space="0" w:color="000000"/>
-                  </w:tcBorders>
-                  <w:shd w:val="clear" w:color="auto" w:fill="FFFFFF"/>
-                  <w:tcMar>
-                    <w:top w:w="0" w:type="dxa"/>
-                    <w:bottom w:w="0" w:type="dxa"/>
-                    <w:left w:w="0" w:type="dxa"/>
-                    <w:right w:w="0" w:type="dxa"/>
-                  </w:tcMar>
-                  <w:vAlign w:val="center"/>
-                </w:tcPr>
-                <w:p>
-                  <w:pPr>
-                    <w:jc w:val="right"/>
-                    <w:pBdr>
-                      <w:bottom w:val="none" w:sz="0" w:space="0" w:color="000000"/>
-                      <w:top w:val="none" w:sz="0" w:space="0" w:color="000000"/>
-                      <w:left w:val="none" w:sz="0" w:space="0" w:color="000000"/>
-                      <w:right w:val="none" w:sz="0" w:space="0" w:color="000000"/>
-                    </w:pBdr>
-                    <w:spacing w:after="100" w:before="100" w:line="240"/>
-                    <w:ind w:left="100" w:right="100" w:firstLine="0" w:firstLineChars="0"/>
-                    <w:rPr>
-                      <w:rFonts w:ascii="Helvetica" w:hAnsi="Helvetica" w:eastAsia="Helvetica" w:cs="Helvetica"/>
-                      <w:i w:val="false"/>
-                      <w:b w:val="false"/>
-                      <w:u w:val="none"/>
-                      <w:strike w:val="false"/>
-                      <w:sz w:val="22"/>
-                      <w:szCs w:val="22"/>
-                      <w:color w:val="000000"/>
-                    </w:rPr>
-                  </w:pPr>
-                  <w:r xmlns:w="http://schemas.openxmlformats.org/wordprocessingml/2006/main" xmlns:wp="http://schemas.openxmlformats.org/drawingml/2006/wordprocessingDrawing" xmlns:r="http://schemas.openxmlformats.org/officeDocument/2006/relationships" xmlns:w14="http://schemas.microsoft.com/office/word/2010/wordml">
-                    <w:rPr>
-                      <w:rFonts w:ascii="Helvetica" w:hAnsi="Helvetica" w:eastAsia="Helvetica" w:cs="Helvetica"/>
-                      <w:i w:val="false"/>
-                      <w:b w:val="false"/>
-                      <w:u w:val="none"/>
-                      <w:strike w:val="false"/>
-                      <w:sz w:val="22"/>
-                      <w:szCs w:val="22"/>
-                      <w:color w:val="000000"/>
-                    </w:rPr>
-                    <w:t xml:space="preserve">3.468</w:t>
-                  </w:r>
-                </w:p>
-              </w:tc>
-              <w:tc>
-                <w:tcPr>
-                  <w:tcBorders>
-                    <w:bottom w:val="none" w:sz="0" w:space="0" w:color="000000"/>
-                    <w:top w:val="none" w:sz="0" w:space="0" w:color="000000"/>
-                    <w:left w:val="none" w:sz="0" w:space="0" w:color="000000"/>
-                    <w:right w:val="none" w:sz="0" w:space="0" w:color="000000"/>
-                  </w:tcBorders>
-                  <w:shd w:val="clear" w:color="auto" w:fill="FFFFFF"/>
-                  <w:tcMar>
-                    <w:top w:w="0" w:type="dxa"/>
-                    <w:bottom w:w="0" w:type="dxa"/>
-                    <w:left w:w="0" w:type="dxa"/>
-                    <w:right w:w="0" w:type="dxa"/>
-                  </w:tcMar>
-                  <w:vAlign w:val="center"/>
-                </w:tcPr>
-                <w:p>
-                  <w:pPr>
-                    <w:jc w:val="right"/>
-                    <w:pBdr>
-                      <w:bottom w:val="none" w:sz="0" w:space="0" w:color="000000"/>
-                      <w:top w:val="none" w:sz="0" w:space="0" w:color="000000"/>
-                      <w:left w:val="none" w:sz="0" w:space="0" w:color="000000"/>
-                      <w:right w:val="none" w:sz="0" w:space="0" w:color="000000"/>
-                    </w:pBdr>
-                    <w:spacing w:after="100" w:before="100" w:line="240"/>
-                    <w:ind w:left="100" w:right="100" w:firstLine="0" w:firstLineChars="0"/>
-                    <w:rPr>
-                      <w:rFonts w:ascii="Helvetica" w:hAnsi="Helvetica" w:eastAsia="Helvetica" w:cs="Helvetica"/>
-                      <w:i w:val="false"/>
-                      <w:b w:val="false"/>
-                      <w:u w:val="none"/>
-                      <w:strike w:val="false"/>
-                      <w:sz w:val="22"/>
-                      <w:szCs w:val="22"/>
-                      <w:color w:val="000000"/>
-                    </w:rPr>
-                  </w:pPr>
-                  <w:r xmlns:w="http://schemas.openxmlformats.org/wordprocessingml/2006/main" xmlns:wp="http://schemas.openxmlformats.org/drawingml/2006/wordprocessingDrawing" xmlns:r="http://schemas.openxmlformats.org/officeDocument/2006/relationships" xmlns:w14="http://schemas.microsoft.com/office/word/2010/wordml">
-                    <w:rPr>
-                      <w:rFonts w:ascii="Helvetica" w:hAnsi="Helvetica" w:eastAsia="Helvetica" w:cs="Helvetica"/>
-                      <w:i w:val="false"/>
-                      <w:b w:val="false"/>
-                      <w:u w:val="none"/>
-                      <w:strike w:val="false"/>
-                      <w:sz w:val="22"/>
-                      <w:szCs w:val="22"/>
-                      <w:color w:val="000000"/>
-                    </w:rPr>
-                    <w:t xml:space="preserve">3.618</w:t>
-                  </w:r>
-                </w:p>
-              </w:tc>
-            </w:tr>
-            <w:tr>
-              <w:trPr>
-                <w:trHeight w:val="618" w:hRule="auto"/>
-              </w:trPr>
-              <w:tc>
-                <w:tcPr>
-                  <w:tcBorders>
-                    <w:bottom w:val="none" w:sz="0" w:space="0" w:color="000000"/>
-                    <w:top w:val="none" w:sz="0" w:space="0" w:color="000000"/>
-                    <w:left w:val="none" w:sz="0" w:space="0" w:color="000000"/>
-                    <w:right w:val="none" w:sz="0" w:space="0" w:color="000000"/>
-                  </w:tcBorders>
-                  <w:shd w:val="clear" w:color="auto" w:fill="FFFFFF"/>
-                  <w:tcMar>
-                    <w:top w:w="0" w:type="dxa"/>
-                    <w:bottom w:w="0" w:type="dxa"/>
-                    <w:left w:w="0" w:type="dxa"/>
-                    <w:right w:w="0" w:type="dxa"/>
-                  </w:tcMar>
-                  <w:vAlign w:val="center"/>
-                </w:tcPr>
-                <w:p>
-                  <w:pPr>
-                    <w:jc w:val="left"/>
-                    <w:pBdr>
-                      <w:bottom w:val="none" w:sz="0" w:space="0" w:color="000000"/>
-                      <w:top w:val="none" w:sz="0" w:space="0" w:color="000000"/>
-                      <w:left w:val="none" w:sz="0" w:space="0" w:color="000000"/>
-                      <w:right w:val="none" w:sz="0" w:space="0" w:color="000000"/>
-                    </w:pBdr>
-                    <w:spacing w:after="100" w:before="100" w:line="240"/>
-                    <w:ind w:left="100" w:right="100" w:firstLine="0" w:firstLineChars="0"/>
-                    <w:rPr>
-                      <w:rFonts w:ascii="Helvetica" w:hAnsi="Helvetica" w:eastAsia="Helvetica" w:cs="Helvetica"/>
-                      <w:i w:val="false"/>
-                      <w:b w:val="false"/>
-                      <w:u w:val="none"/>
-                      <w:strike w:val="false"/>
-                      <w:sz w:val="22"/>
-                      <w:szCs w:val="22"/>
-                      <w:color w:val="000000"/>
-                    </w:rPr>
-                  </w:pPr>
-                  <w:r xmlns:w="http://schemas.openxmlformats.org/wordprocessingml/2006/main" xmlns:wp="http://schemas.openxmlformats.org/drawingml/2006/wordprocessingDrawing" xmlns:r="http://schemas.openxmlformats.org/officeDocument/2006/relationships" xmlns:w14="http://schemas.microsoft.com/office/word/2010/wordml">
-                    <w:rPr>
-                      <w:rFonts w:ascii="Helvetica" w:hAnsi="Helvetica" w:eastAsia="Helvetica" w:cs="Helvetica"/>
-                      <w:i w:val="false"/>
-                      <w:b w:val="false"/>
-                      <w:u w:val="none"/>
-                      <w:strike w:val="false"/>
                       <w:sz w:val="22"/>
                       <w:szCs w:val="22"/>
                       <w:color w:val="000000"/>
@@ -4641,6 +4359,7 @@
                 </w:tcPr>
                 <w:p>
                   <w:pPr>
+                    <w:pStyle w:val="Normal"/>
                     <w:jc w:val="right"/>
                     <w:pBdr>
                       <w:bottom w:val="none" w:sz="0" w:space="0" w:color="000000"/>
@@ -4650,16 +4369,6 @@
                     </w:pBdr>
                     <w:spacing w:after="100" w:before="100" w:line="240"/>
                     <w:ind w:left="100" w:right="100" w:firstLine="0" w:firstLineChars="0"/>
-                    <w:rPr>
-                      <w:rFonts w:ascii="Helvetica" w:hAnsi="Helvetica" w:eastAsia="Helvetica" w:cs="Helvetica"/>
-                      <w:i w:val="false"/>
-                      <w:b w:val="false"/>
-                      <w:u w:val="none"/>
-                      <w:strike w:val="false"/>
-                      <w:sz w:val="22"/>
-                      <w:szCs w:val="22"/>
-                      <w:color w:val="000000"/>
-                    </w:rPr>
                   </w:pPr>
                   <w:r xmlns:w="http://schemas.openxmlformats.org/wordprocessingml/2006/main" xmlns:wp="http://schemas.openxmlformats.org/drawingml/2006/wordprocessingDrawing" xmlns:r="http://schemas.openxmlformats.org/officeDocument/2006/relationships" xmlns:w14="http://schemas.microsoft.com/office/word/2010/wordml">
                     <w:rPr>
@@ -4667,7 +4376,6 @@
                       <w:i w:val="false"/>
                       <w:b w:val="false"/>
                       <w:u w:val="none"/>
-                      <w:strike w:val="false"/>
                       <w:sz w:val="22"/>
                       <w:szCs w:val="22"/>
                       <w:color w:val="000000"/>
@@ -4695,6 +4403,7 @@
                 </w:tcPr>
                 <w:p>
                   <w:pPr>
+                    <w:pStyle w:val="Normal"/>
                     <w:jc w:val="right"/>
                     <w:pBdr>
                       <w:bottom w:val="none" w:sz="0" w:space="0" w:color="000000"/>
@@ -4704,16 +4413,6 @@
                     </w:pBdr>
                     <w:spacing w:after="100" w:before="100" w:line="240"/>
                     <w:ind w:left="100" w:right="100" w:firstLine="0" w:firstLineChars="0"/>
-                    <w:rPr>
-                      <w:rFonts w:ascii="Helvetica" w:hAnsi="Helvetica" w:eastAsia="Helvetica" w:cs="Helvetica"/>
-                      <w:i w:val="false"/>
-                      <w:b w:val="false"/>
-                      <w:u w:val="none"/>
-                      <w:strike w:val="false"/>
-                      <w:sz w:val="22"/>
-                      <w:szCs w:val="22"/>
-                      <w:color w:val="000000"/>
-                    </w:rPr>
                   </w:pPr>
                   <w:r xmlns:w="http://schemas.openxmlformats.org/wordprocessingml/2006/main" xmlns:wp="http://schemas.openxmlformats.org/drawingml/2006/wordprocessingDrawing" xmlns:r="http://schemas.openxmlformats.org/officeDocument/2006/relationships" xmlns:w14="http://schemas.microsoft.com/office/word/2010/wordml">
                     <w:rPr>
@@ -4721,7 +4420,6 @@
                       <w:i w:val="false"/>
                       <w:b w:val="false"/>
                       <w:u w:val="none"/>
-                      <w:strike w:val="false"/>
                       <w:sz w:val="22"/>
                       <w:szCs w:val="22"/>
                       <w:color w:val="000000"/>
@@ -4749,6 +4447,7 @@
                 </w:tcPr>
                 <w:p>
                   <w:pPr>
+                    <w:pStyle w:val="Normal"/>
                     <w:jc w:val="right"/>
                     <w:pBdr>
                       <w:bottom w:val="none" w:sz="0" w:space="0" w:color="000000"/>
@@ -4758,16 +4457,6 @@
                     </w:pBdr>
                     <w:spacing w:after="100" w:before="100" w:line="240"/>
                     <w:ind w:left="100" w:right="100" w:firstLine="0" w:firstLineChars="0"/>
-                    <w:rPr>
-                      <w:rFonts w:ascii="Helvetica" w:hAnsi="Helvetica" w:eastAsia="Helvetica" w:cs="Helvetica"/>
-                      <w:i w:val="false"/>
-                      <w:b w:val="false"/>
-                      <w:u w:val="none"/>
-                      <w:strike w:val="false"/>
-                      <w:sz w:val="22"/>
-                      <w:szCs w:val="22"/>
-                      <w:color w:val="000000"/>
-                    </w:rPr>
                   </w:pPr>
                   <w:r xmlns:w="http://schemas.openxmlformats.org/wordprocessingml/2006/main" xmlns:wp="http://schemas.openxmlformats.org/drawingml/2006/wordprocessingDrawing" xmlns:r="http://schemas.openxmlformats.org/officeDocument/2006/relationships" xmlns:w14="http://schemas.microsoft.com/office/word/2010/wordml">
                     <w:rPr>
@@ -4775,7 +4464,6 @@
                       <w:i w:val="false"/>
                       <w:b w:val="false"/>
                       <w:u w:val="none"/>
-                      <w:strike w:val="false"/>
                       <w:sz w:val="22"/>
                       <w:szCs w:val="22"/>
                       <w:color w:val="000000"/>
@@ -4789,6 +4477,7 @@
               <w:trPr>
                 <w:trHeight w:val="621" w:hRule="auto"/>
               </w:trPr>
+              body 8
               <w:tc>
                 <w:tcPr>
                   <w:tcBorders>
@@ -4808,6 +4497,7 @@
                 </w:tcPr>
                 <w:p>
                   <w:pPr>
+                    <w:pStyle w:val="Normal"/>
                     <w:jc w:val="left"/>
                     <w:pBdr>
                       <w:bottom w:val="none" w:sz="0" w:space="0" w:color="000000"/>
@@ -4817,16 +4507,6 @@
                     </w:pBdr>
                     <w:spacing w:after="100" w:before="100" w:line="240"/>
                     <w:ind w:left="100" w:right="100" w:firstLine="0" w:firstLineChars="0"/>
-                    <w:rPr>
-                      <w:rFonts w:ascii="Helvetica" w:hAnsi="Helvetica" w:eastAsia="Helvetica" w:cs="Helvetica"/>
-                      <w:i w:val="false"/>
-                      <w:b w:val="false"/>
-                      <w:u w:val="none"/>
-                      <w:strike w:val="false"/>
-                      <w:sz w:val="22"/>
-                      <w:szCs w:val="22"/>
-                      <w:color w:val="000000"/>
-                    </w:rPr>
                   </w:pPr>
                   <w:r xmlns:w="http://schemas.openxmlformats.org/wordprocessingml/2006/main" xmlns:wp="http://schemas.openxmlformats.org/drawingml/2006/wordprocessingDrawing" xmlns:r="http://schemas.openxmlformats.org/officeDocument/2006/relationships" xmlns:w14="http://schemas.microsoft.com/office/word/2010/wordml">
                     <w:rPr>
@@ -4834,7 +4514,6 @@
                       <w:i w:val="false"/>
                       <w:b w:val="false"/>
                       <w:u w:val="none"/>
-                      <w:strike w:val="false"/>
                       <w:sz w:val="22"/>
                       <w:szCs w:val="22"/>
                       <w:color w:val="000000"/>
@@ -4862,6 +4541,7 @@
                 </w:tcPr>
                 <w:p>
                   <w:pPr>
+                    <w:pStyle w:val="Normal"/>
                     <w:jc w:val="right"/>
                     <w:pBdr>
                       <w:bottom w:val="none" w:sz="0" w:space="0" w:color="000000"/>
@@ -4871,16 +4551,6 @@
                     </w:pBdr>
                     <w:spacing w:after="100" w:before="100" w:line="240"/>
                     <w:ind w:left="100" w:right="100" w:firstLine="0" w:firstLineChars="0"/>
-                    <w:rPr>
-                      <w:rFonts w:ascii="Helvetica" w:hAnsi="Helvetica" w:eastAsia="Helvetica" w:cs="Helvetica"/>
-                      <w:i w:val="false"/>
-                      <w:b w:val="false"/>
-                      <w:u w:val="none"/>
-                      <w:strike w:val="false"/>
-                      <w:sz w:val="22"/>
-                      <w:szCs w:val="22"/>
-                      <w:color w:val="000000"/>
-                    </w:rPr>
                   </w:pPr>
                   <w:r xmlns:w="http://schemas.openxmlformats.org/wordprocessingml/2006/main" xmlns:wp="http://schemas.openxmlformats.org/drawingml/2006/wordprocessingDrawing" xmlns:r="http://schemas.openxmlformats.org/officeDocument/2006/relationships" xmlns:w14="http://schemas.microsoft.com/office/word/2010/wordml">
                     <w:rPr>
@@ -4888,7 +4558,6 @@
                       <w:i w:val="false"/>
                       <w:b w:val="false"/>
                       <w:u w:val="none"/>
-                      <w:strike w:val="false"/>
                       <w:sz w:val="22"/>
                       <w:szCs w:val="22"/>
                       <w:color w:val="000000"/>
@@ -4916,6 +4585,7 @@
                 </w:tcPr>
                 <w:p>
                   <w:pPr>
+                    <w:pStyle w:val="Normal"/>
                     <w:jc w:val="right"/>
                     <w:pBdr>
                       <w:bottom w:val="none" w:sz="0" w:space="0" w:color="000000"/>
@@ -4925,16 +4595,6 @@
                     </w:pBdr>
                     <w:spacing w:after="100" w:before="100" w:line="240"/>
                     <w:ind w:left="100" w:right="100" w:firstLine="0" w:firstLineChars="0"/>
-                    <w:rPr>
-                      <w:rFonts w:ascii="Helvetica" w:hAnsi="Helvetica" w:eastAsia="Helvetica" w:cs="Helvetica"/>
-                      <w:i w:val="false"/>
-                      <w:b w:val="false"/>
-                      <w:u w:val="none"/>
-                      <w:strike w:val="false"/>
-                      <w:sz w:val="22"/>
-                      <w:szCs w:val="22"/>
-                      <w:color w:val="000000"/>
-                    </w:rPr>
                   </w:pPr>
                   <w:r xmlns:w="http://schemas.openxmlformats.org/wordprocessingml/2006/main" xmlns:wp="http://schemas.openxmlformats.org/drawingml/2006/wordprocessingDrawing" xmlns:r="http://schemas.openxmlformats.org/officeDocument/2006/relationships" xmlns:w14="http://schemas.microsoft.com/office/word/2010/wordml">
                     <w:rPr>
@@ -4942,7 +4602,6 @@
                       <w:i w:val="false"/>
                       <w:b w:val="false"/>
                       <w:u w:val="none"/>
-                      <w:strike w:val="false"/>
                       <w:sz w:val="22"/>
                       <w:szCs w:val="22"/>
                       <w:color w:val="000000"/>
@@ -4970,6 +4629,7 @@
                 </w:tcPr>
                 <w:p>
                   <w:pPr>
+                    <w:pStyle w:val="Normal"/>
                     <w:jc w:val="right"/>
                     <w:pBdr>
                       <w:bottom w:val="none" w:sz="0" w:space="0" w:color="000000"/>
@@ -4979,16 +4639,6 @@
                     </w:pBdr>
                     <w:spacing w:after="100" w:before="100" w:line="240"/>
                     <w:ind w:left="100" w:right="100" w:firstLine="0" w:firstLineChars="0"/>
-                    <w:rPr>
-                      <w:rFonts w:ascii="Helvetica" w:hAnsi="Helvetica" w:eastAsia="Helvetica" w:cs="Helvetica"/>
-                      <w:i w:val="false"/>
-                      <w:b w:val="false"/>
-                      <w:u w:val="none"/>
-                      <w:strike w:val="false"/>
-                      <w:sz w:val="22"/>
-                      <w:szCs w:val="22"/>
-                      <w:color w:val="000000"/>
-                    </w:rPr>
                   </w:pPr>
                   <w:r xmlns:w="http://schemas.openxmlformats.org/wordprocessingml/2006/main" xmlns:wp="http://schemas.openxmlformats.org/drawingml/2006/wordprocessingDrawing" xmlns:r="http://schemas.openxmlformats.org/officeDocument/2006/relationships" xmlns:w14="http://schemas.microsoft.com/office/word/2010/wordml">
                     <w:rPr>
@@ -4996,7 +4646,6 @@
                       <w:i w:val="false"/>
                       <w:b w:val="false"/>
                       <w:u w:val="none"/>
-                      <w:strike w:val="false"/>
                       <w:sz w:val="22"/>
                       <w:szCs w:val="22"/>
                       <w:color w:val="000000"/>
@@ -5010,6 +4659,7 @@
               <w:trPr>
                 <w:trHeight w:val="621" w:hRule="auto"/>
               </w:trPr>
+              body 9
               <w:tc>
                 <w:tcPr>
                   <w:tcBorders>
@@ -5029,6 +4679,7 @@
                 </w:tcPr>
                 <w:p>
                   <w:pPr>
+                    <w:pStyle w:val="Normal"/>
                     <w:jc w:val="left"/>
                     <w:pBdr>
                       <w:bottom w:val="none" w:sz="0" w:space="0" w:color="000000"/>
@@ -5038,16 +4689,6 @@
                     </w:pBdr>
                     <w:spacing w:after="100" w:before="100" w:line="240"/>
                     <w:ind w:left="100" w:right="100" w:firstLine="0" w:firstLineChars="0"/>
-                    <w:rPr>
-                      <w:rFonts w:ascii="Helvetica" w:hAnsi="Helvetica" w:eastAsia="Helvetica" w:cs="Helvetica"/>
-                      <w:i w:val="false"/>
-                      <w:b w:val="false"/>
-                      <w:u w:val="none"/>
-                      <w:strike w:val="false"/>
-                      <w:sz w:val="22"/>
-                      <w:szCs w:val="22"/>
-                      <w:color w:val="000000"/>
-                    </w:rPr>
                   </w:pPr>
                   <w:r xmlns:w="http://schemas.openxmlformats.org/wordprocessingml/2006/main" xmlns:wp="http://schemas.openxmlformats.org/drawingml/2006/wordprocessingDrawing" xmlns:r="http://schemas.openxmlformats.org/officeDocument/2006/relationships" xmlns:w14="http://schemas.microsoft.com/office/word/2010/wordml">
                     <w:rPr>
@@ -5055,7 +4696,6 @@
                       <w:i w:val="false"/>
                       <w:b w:val="false"/>
                       <w:u w:val="none"/>
-                      <w:strike w:val="false"/>
                       <w:sz w:val="22"/>
                       <w:szCs w:val="22"/>
                       <w:color w:val="000000"/>
@@ -5083,6 +4723,7 @@
                 </w:tcPr>
                 <w:p>
                   <w:pPr>
+                    <w:pStyle w:val="Normal"/>
                     <w:jc w:val="right"/>
                     <w:pBdr>
                       <w:bottom w:val="none" w:sz="0" w:space="0" w:color="000000"/>
@@ -5092,16 +4733,6 @@
                     </w:pBdr>
                     <w:spacing w:after="100" w:before="100" w:line="240"/>
                     <w:ind w:left="100" w:right="100" w:firstLine="0" w:firstLineChars="0"/>
-                    <w:rPr>
-                      <w:rFonts w:ascii="Helvetica" w:hAnsi="Helvetica" w:eastAsia="Helvetica" w:cs="Helvetica"/>
-                      <w:i w:val="false"/>
-                      <w:b w:val="false"/>
-                      <w:u w:val="none"/>
-                      <w:strike w:val="false"/>
-                      <w:sz w:val="22"/>
-                      <w:szCs w:val="22"/>
-                      <w:color w:val="000000"/>
-                    </w:rPr>
                   </w:pPr>
                   <w:r xmlns:w="http://schemas.openxmlformats.org/wordprocessingml/2006/main" xmlns:wp="http://schemas.openxmlformats.org/drawingml/2006/wordprocessingDrawing" xmlns:r="http://schemas.openxmlformats.org/officeDocument/2006/relationships" xmlns:w14="http://schemas.microsoft.com/office/word/2010/wordml">
                     <w:rPr>
@@ -5109,7 +4740,6 @@
                       <w:i w:val="false"/>
                       <w:b w:val="false"/>
                       <w:u w:val="none"/>
-                      <w:strike w:val="false"/>
                       <w:sz w:val="22"/>
                       <w:szCs w:val="22"/>
                       <w:color w:val="000000"/>
@@ -5137,6 +4767,7 @@
                 </w:tcPr>
                 <w:p>
                   <w:pPr>
+                    <w:pStyle w:val="Normal"/>
                     <w:jc w:val="right"/>
                     <w:pBdr>
                       <w:bottom w:val="none" w:sz="0" w:space="0" w:color="000000"/>
@@ -5146,16 +4777,6 @@
                     </w:pBdr>
                     <w:spacing w:after="100" w:before="100" w:line="240"/>
                     <w:ind w:left="100" w:right="100" w:firstLine="0" w:firstLineChars="0"/>
-                    <w:rPr>
-                      <w:rFonts w:ascii="Helvetica" w:hAnsi="Helvetica" w:eastAsia="Helvetica" w:cs="Helvetica"/>
-                      <w:i w:val="false"/>
-                      <w:b w:val="false"/>
-                      <w:u w:val="none"/>
-                      <w:strike w:val="false"/>
-                      <w:sz w:val="22"/>
-                      <w:szCs w:val="22"/>
-                      <w:color w:val="000000"/>
-                    </w:rPr>
                   </w:pPr>
                   <w:r xmlns:w="http://schemas.openxmlformats.org/wordprocessingml/2006/main" xmlns:wp="http://schemas.openxmlformats.org/drawingml/2006/wordprocessingDrawing" xmlns:r="http://schemas.openxmlformats.org/officeDocument/2006/relationships" xmlns:w14="http://schemas.microsoft.com/office/word/2010/wordml">
                     <w:rPr>
@@ -5163,7 +4784,6 @@
                       <w:i w:val="false"/>
                       <w:b w:val="false"/>
                       <w:u w:val="none"/>
-                      <w:strike w:val="false"/>
                       <w:sz w:val="22"/>
                       <w:szCs w:val="22"/>
                       <w:color w:val="000000"/>
@@ -5191,6 +4811,7 @@
                 </w:tcPr>
                 <w:p>
                   <w:pPr>
+                    <w:pStyle w:val="Normal"/>
                     <w:jc w:val="right"/>
                     <w:pBdr>
                       <w:bottom w:val="none" w:sz="0" w:space="0" w:color="000000"/>
@@ -5200,16 +4821,6 @@
                     </w:pBdr>
                     <w:spacing w:after="100" w:before="100" w:line="240"/>
                     <w:ind w:left="100" w:right="100" w:firstLine="0" w:firstLineChars="0"/>
-                    <w:rPr>
-                      <w:rFonts w:ascii="Helvetica" w:hAnsi="Helvetica" w:eastAsia="Helvetica" w:cs="Helvetica"/>
-                      <w:i w:val="false"/>
-                      <w:b w:val="false"/>
-                      <w:u w:val="none"/>
-                      <w:strike w:val="false"/>
-                      <w:sz w:val="22"/>
-                      <w:szCs w:val="22"/>
-                      <w:color w:val="000000"/>
-                    </w:rPr>
                   </w:pPr>
                   <w:r xmlns:w="http://schemas.openxmlformats.org/wordprocessingml/2006/main" xmlns:wp="http://schemas.openxmlformats.org/drawingml/2006/wordprocessingDrawing" xmlns:r="http://schemas.openxmlformats.org/officeDocument/2006/relationships" xmlns:w14="http://schemas.microsoft.com/office/word/2010/wordml">
                     <w:rPr>
@@ -5217,7 +4828,6 @@
                       <w:i w:val="false"/>
                       <w:b w:val="false"/>
                       <w:u w:val="none"/>
-                      <w:strike w:val="false"/>
                       <w:sz w:val="22"/>
                       <w:szCs w:val="22"/>
                       <w:color w:val="000000"/>
@@ -5231,6 +4841,7 @@
               <w:trPr>
                 <w:trHeight w:val="621" w:hRule="auto"/>
               </w:trPr>
+              body10
               <w:tc>
                 <w:tcPr>
                   <w:tcBorders>
@@ -5250,6 +4861,7 @@
                 </w:tcPr>
                 <w:p>
                   <w:pPr>
+                    <w:pStyle w:val="Normal"/>
                     <w:jc w:val="left"/>
                     <w:pBdr>
                       <w:bottom w:val="none" w:sz="0" w:space="0" w:color="000000"/>
@@ -5259,16 +4871,6 @@
                     </w:pBdr>
                     <w:spacing w:after="100" w:before="100" w:line="240"/>
                     <w:ind w:left="100" w:right="100" w:firstLine="0" w:firstLineChars="0"/>
-                    <w:rPr>
-                      <w:rFonts w:ascii="Helvetica" w:hAnsi="Helvetica" w:eastAsia="Helvetica" w:cs="Helvetica"/>
-                      <w:i w:val="false"/>
-                      <w:b w:val="false"/>
-                      <w:u w:val="none"/>
-                      <w:strike w:val="false"/>
-                      <w:sz w:val="22"/>
-                      <w:szCs w:val="22"/>
-                      <w:color w:val="000000"/>
-                    </w:rPr>
                   </w:pPr>
                   <w:r xmlns:w="http://schemas.openxmlformats.org/wordprocessingml/2006/main" xmlns:wp="http://schemas.openxmlformats.org/drawingml/2006/wordprocessingDrawing" xmlns:r="http://schemas.openxmlformats.org/officeDocument/2006/relationships" xmlns:w14="http://schemas.microsoft.com/office/word/2010/wordml">
                     <w:rPr>
@@ -5276,7 +4878,6 @@
                       <w:i w:val="false"/>
                       <w:b w:val="false"/>
                       <w:u w:val="none"/>
-                      <w:strike w:val="false"/>
                       <w:sz w:val="22"/>
                       <w:szCs w:val="22"/>
                       <w:color w:val="000000"/>
@@ -5304,6 +4905,7 @@
                 </w:tcPr>
                 <w:p>
                   <w:pPr>
+                    <w:pStyle w:val="Normal"/>
                     <w:jc w:val="right"/>
                     <w:pBdr>
                       <w:bottom w:val="none" w:sz="0" w:space="0" w:color="000000"/>
@@ -5313,16 +4915,6 @@
                     </w:pBdr>
                     <w:spacing w:after="100" w:before="100" w:line="240"/>
                     <w:ind w:left="100" w:right="100" w:firstLine="0" w:firstLineChars="0"/>
-                    <w:rPr>
-                      <w:rFonts w:ascii="Helvetica" w:hAnsi="Helvetica" w:eastAsia="Helvetica" w:cs="Helvetica"/>
-                      <w:i w:val="false"/>
-                      <w:b w:val="false"/>
-                      <w:u w:val="none"/>
-                      <w:strike w:val="false"/>
-                      <w:sz w:val="22"/>
-                      <w:szCs w:val="22"/>
-                      <w:color w:val="000000"/>
-                    </w:rPr>
                   </w:pPr>
                   <w:r xmlns:w="http://schemas.openxmlformats.org/wordprocessingml/2006/main" xmlns:wp="http://schemas.openxmlformats.org/drawingml/2006/wordprocessingDrawing" xmlns:r="http://schemas.openxmlformats.org/officeDocument/2006/relationships" xmlns:w14="http://schemas.microsoft.com/office/word/2010/wordml">
                     <w:rPr>
@@ -5330,7 +4922,6 @@
                       <w:i w:val="false"/>
                       <w:b w:val="false"/>
                       <w:u w:val="none"/>
-                      <w:strike w:val="false"/>
                       <w:sz w:val="22"/>
                       <w:szCs w:val="22"/>
                       <w:color w:val="000000"/>
@@ -5358,6 +4949,7 @@
                 </w:tcPr>
                 <w:p>
                   <w:pPr>
+                    <w:pStyle w:val="Normal"/>
                     <w:jc w:val="right"/>
                     <w:pBdr>
                       <w:bottom w:val="none" w:sz="0" w:space="0" w:color="000000"/>
@@ -5367,16 +4959,6 @@
                     </w:pBdr>
                     <w:spacing w:after="100" w:before="100" w:line="240"/>
                     <w:ind w:left="100" w:right="100" w:firstLine="0" w:firstLineChars="0"/>
-                    <w:rPr>
-                      <w:rFonts w:ascii="Helvetica" w:hAnsi="Helvetica" w:eastAsia="Helvetica" w:cs="Helvetica"/>
-                      <w:i w:val="false"/>
-                      <w:b w:val="false"/>
-                      <w:u w:val="none"/>
-                      <w:strike w:val="false"/>
-                      <w:sz w:val="22"/>
-                      <w:szCs w:val="22"/>
-                      <w:color w:val="000000"/>
-                    </w:rPr>
                   </w:pPr>
                   <w:r xmlns:w="http://schemas.openxmlformats.org/wordprocessingml/2006/main" xmlns:wp="http://schemas.openxmlformats.org/drawingml/2006/wordprocessingDrawing" xmlns:r="http://schemas.openxmlformats.org/officeDocument/2006/relationships" xmlns:w14="http://schemas.microsoft.com/office/word/2010/wordml">
                     <w:rPr>
@@ -5384,7 +4966,6 @@
                       <w:i w:val="false"/>
                       <w:b w:val="false"/>
                       <w:u w:val="none"/>
-                      <w:strike w:val="false"/>
                       <w:sz w:val="22"/>
                       <w:szCs w:val="22"/>
                       <w:color w:val="000000"/>
@@ -5412,6 +4993,7 @@
                 </w:tcPr>
                 <w:p>
                   <w:pPr>
+                    <w:pStyle w:val="Normal"/>
                     <w:jc w:val="right"/>
                     <w:pBdr>
                       <w:bottom w:val="none" w:sz="0" w:space="0" w:color="000000"/>
@@ -5421,16 +5003,6 @@
                     </w:pBdr>
                     <w:spacing w:after="100" w:before="100" w:line="240"/>
                     <w:ind w:left="100" w:right="100" w:firstLine="0" w:firstLineChars="0"/>
-                    <w:rPr>
-                      <w:rFonts w:ascii="Helvetica" w:hAnsi="Helvetica" w:eastAsia="Helvetica" w:cs="Helvetica"/>
-                      <w:i w:val="false"/>
-                      <w:b w:val="false"/>
-                      <w:u w:val="none"/>
-                      <w:strike w:val="false"/>
-                      <w:sz w:val="22"/>
-                      <w:szCs w:val="22"/>
-                      <w:color w:val="000000"/>
-                    </w:rPr>
                   </w:pPr>
                   <w:r xmlns:w="http://schemas.openxmlformats.org/wordprocessingml/2006/main" xmlns:wp="http://schemas.openxmlformats.org/drawingml/2006/wordprocessingDrawing" xmlns:r="http://schemas.openxmlformats.org/officeDocument/2006/relationships" xmlns:w14="http://schemas.microsoft.com/office/word/2010/wordml">
                     <w:rPr>
@@ -5438,7 +5010,6 @@
                       <w:i w:val="false"/>
                       <w:b w:val="false"/>
                       <w:u w:val="none"/>
-                      <w:strike w:val="false"/>
                       <w:sz w:val="22"/>
                       <w:szCs w:val="22"/>
                       <w:color w:val="000000"/>
@@ -5452,6 +5023,7 @@
               <w:trPr>
                 <w:trHeight w:val="620" w:hRule="auto"/>
               </w:trPr>
+              body11
               <w:tc>
                 <w:tcPr>
                   <w:tcBorders>
@@ -5471,6 +5043,7 @@
                 </w:tcPr>
                 <w:p>
                   <w:pPr>
+                    <w:pStyle w:val="Normal"/>
                     <w:jc w:val="left"/>
                     <w:pBdr>
                       <w:bottom w:val="none" w:sz="0" w:space="0" w:color="000000"/>
@@ -5480,16 +5053,6 @@
                     </w:pBdr>
                     <w:spacing w:after="100" w:before="100" w:line="240"/>
                     <w:ind w:left="100" w:right="100" w:firstLine="0" w:firstLineChars="0"/>
-                    <w:rPr>
-                      <w:rFonts w:ascii="Helvetica" w:hAnsi="Helvetica" w:eastAsia="Helvetica" w:cs="Helvetica"/>
-                      <w:i w:val="false"/>
-                      <w:b w:val="false"/>
-                      <w:u w:val="none"/>
-                      <w:strike w:val="false"/>
-                      <w:sz w:val="22"/>
-                      <w:szCs w:val="22"/>
-                      <w:color w:val="000000"/>
-                    </w:rPr>
                   </w:pPr>
                   <w:r xmlns:w="http://schemas.openxmlformats.org/wordprocessingml/2006/main" xmlns:wp="http://schemas.openxmlformats.org/drawingml/2006/wordprocessingDrawing" xmlns:r="http://schemas.openxmlformats.org/officeDocument/2006/relationships" xmlns:w14="http://schemas.microsoft.com/office/word/2010/wordml">
                     <w:rPr>
@@ -5497,7 +5060,6 @@
                       <w:i w:val="false"/>
                       <w:b w:val="false"/>
                       <w:u w:val="none"/>
-                      <w:strike w:val="false"/>
                       <w:sz w:val="22"/>
                       <w:szCs w:val="22"/>
                       <w:color w:val="000000"/>
@@ -5525,6 +5087,7 @@
                 </w:tcPr>
                 <w:p>
                   <w:pPr>
+                    <w:pStyle w:val="Normal"/>
                     <w:jc w:val="right"/>
                     <w:pBdr>
                       <w:bottom w:val="none" w:sz="0" w:space="0" w:color="000000"/>
@@ -5534,16 +5097,6 @@
                     </w:pBdr>
                     <w:spacing w:after="100" w:before="100" w:line="240"/>
                     <w:ind w:left="100" w:right="100" w:firstLine="0" w:firstLineChars="0"/>
-                    <w:rPr>
-                      <w:rFonts w:ascii="Helvetica" w:hAnsi="Helvetica" w:eastAsia="Helvetica" w:cs="Helvetica"/>
-                      <w:i w:val="false"/>
-                      <w:b w:val="false"/>
-                      <w:u w:val="none"/>
-                      <w:strike w:val="false"/>
-                      <w:sz w:val="22"/>
-                      <w:szCs w:val="22"/>
-                      <w:color w:val="000000"/>
-                    </w:rPr>
                   </w:pPr>
                   <w:r xmlns:w="http://schemas.openxmlformats.org/wordprocessingml/2006/main" xmlns:wp="http://schemas.openxmlformats.org/drawingml/2006/wordprocessingDrawing" xmlns:r="http://schemas.openxmlformats.org/officeDocument/2006/relationships" xmlns:w14="http://schemas.microsoft.com/office/word/2010/wordml">
                     <w:rPr>
@@ -5551,7 +5104,6 @@
                       <w:i w:val="false"/>
                       <w:b w:val="false"/>
                       <w:u w:val="none"/>
-                      <w:strike w:val="false"/>
                       <w:sz w:val="22"/>
                       <w:szCs w:val="22"/>
                       <w:color w:val="000000"/>
@@ -5579,6 +5131,7 @@
                 </w:tcPr>
                 <w:p>
                   <w:pPr>
+                    <w:pStyle w:val="Normal"/>
                     <w:jc w:val="right"/>
                     <w:pBdr>
                       <w:bottom w:val="none" w:sz="0" w:space="0" w:color="000000"/>
@@ -5588,16 +5141,6 @@
                     </w:pBdr>
                     <w:spacing w:after="100" w:before="100" w:line="240"/>
                     <w:ind w:left="100" w:right="100" w:firstLine="0" w:firstLineChars="0"/>
-                    <w:rPr>
-                      <w:rFonts w:ascii="Helvetica" w:hAnsi="Helvetica" w:eastAsia="Helvetica" w:cs="Helvetica"/>
-                      <w:i w:val="false"/>
-                      <w:b w:val="false"/>
-                      <w:u w:val="none"/>
-                      <w:strike w:val="false"/>
-                      <w:sz w:val="22"/>
-                      <w:szCs w:val="22"/>
-                      <w:color w:val="000000"/>
-                    </w:rPr>
                   </w:pPr>
                   <w:r xmlns:w="http://schemas.openxmlformats.org/wordprocessingml/2006/main" xmlns:wp="http://schemas.openxmlformats.org/drawingml/2006/wordprocessingDrawing" xmlns:r="http://schemas.openxmlformats.org/officeDocument/2006/relationships" xmlns:w14="http://schemas.microsoft.com/office/word/2010/wordml">
                     <w:rPr>
@@ -5605,7 +5148,6 @@
                       <w:i w:val="false"/>
                       <w:b w:val="false"/>
                       <w:u w:val="none"/>
-                      <w:strike w:val="false"/>
                       <w:sz w:val="22"/>
                       <w:szCs w:val="22"/>
                       <w:color w:val="000000"/>
@@ -5633,6 +5175,7 @@
                 </w:tcPr>
                 <w:p>
                   <w:pPr>
+                    <w:pStyle w:val="Normal"/>
                     <w:jc w:val="right"/>
                     <w:pBdr>
                       <w:bottom w:val="none" w:sz="0" w:space="0" w:color="000000"/>
@@ -5642,16 +5185,6 @@
                     </w:pBdr>
                     <w:spacing w:after="100" w:before="100" w:line="240"/>
                     <w:ind w:left="100" w:right="100" w:firstLine="0" w:firstLineChars="0"/>
-                    <w:rPr>
-                      <w:rFonts w:ascii="Helvetica" w:hAnsi="Helvetica" w:eastAsia="Helvetica" w:cs="Helvetica"/>
-                      <w:i w:val="false"/>
-                      <w:b w:val="false"/>
-                      <w:u w:val="none"/>
-                      <w:strike w:val="false"/>
-                      <w:sz w:val="22"/>
-                      <w:szCs w:val="22"/>
-                      <w:color w:val="000000"/>
-                    </w:rPr>
                   </w:pPr>
                   <w:r xmlns:w="http://schemas.openxmlformats.org/wordprocessingml/2006/main" xmlns:wp="http://schemas.openxmlformats.org/drawingml/2006/wordprocessingDrawing" xmlns:r="http://schemas.openxmlformats.org/officeDocument/2006/relationships" xmlns:w14="http://schemas.microsoft.com/office/word/2010/wordml">
                     <w:rPr>
@@ -5659,7 +5192,6 @@
                       <w:i w:val="false"/>
                       <w:b w:val="false"/>
                       <w:u w:val="none"/>
-                      <w:strike w:val="false"/>
                       <w:sz w:val="22"/>
                       <w:szCs w:val="22"/>
                       <w:color w:val="000000"/>
@@ -5681,6 +5213,1383 @@
         </w:sectPr>
       </w:pPr>
     </w:p>
+    <w:bookmarkEnd w:id="47"/>
+    <w:bookmarkEnd w:id="48"/>
+    <w:bookmarkStart w:id="54" w:name="Xa1d38ba755028b448e0b7f415201f4bb4160237"/>
+    <w:p>
+      <w:pPr>
+        <w:pStyle w:val="Heading1"/>
+      </w:pPr>
+      <w:r>
+        <w:t xml:space="preserve">2. Clutch-Specific Hierarchical Model of Egg Size</w:t>
+      </w:r>
+    </w:p>
+    <w:bookmarkStart w:id="49" w:name="statistical-model"/>
+    <w:p>
+      <w:pPr>
+        <w:pStyle w:val="Heading2"/>
+      </w:pPr>
+      <w:r>
+        <w:t xml:space="preserve">Statistical Model</w:t>
+      </w:r>
+    </w:p>
+    <w:p>
+      <w:pPr>
+        <w:pStyle w:val="FirstParagraph"/>
+      </w:pPr>
+      <w:r>
+        <w:t xml:space="preserve">Egg perimeter was standardized prior to analysis (mean = 0, SD = 1).</w:t>
+      </w:r>
+    </w:p>
+    <w:p>
+      <w:pPr>
+        <w:pStyle w:val="BodyText"/>
+      </w:pPr>
+      <w:r>
+        <w:t xml:space="preserve">For female</w:t>
+      </w:r>
+      <w:r>
+        <w:t xml:space="preserve"> </w:t>
+      </w:r>
+      <m:oMath>
+        <m:r>
+          <m:t>i</m:t>
+        </m:r>
+      </m:oMath>
+      <w:r>
+        <w:t xml:space="preserve">, egg</w:t>
+      </w:r>
+      <w:r>
+        <w:t xml:space="preserve"> </w:t>
+      </w:r>
+      <m:oMath>
+        <m:r>
+          <m:t>j</m:t>
+        </m:r>
+      </m:oMath>
+      <w:r>
+        <w:t xml:space="preserve">, and brood</w:t>
+      </w:r>
+      <w:r>
+        <w:t xml:space="preserve"> </w:t>
+      </w:r>
+      <m:oMath>
+        <m:r>
+          <m:t>b</m:t>
+        </m:r>
+        <m:r>
+          <m:rPr>
+            <m:sty m:val="p"/>
+          </m:rPr>
+          <m:t>∈</m:t>
+        </m:r>
+        <m:r>
+          <m:rPr>
+            <m:sty m:val="p"/>
+          </m:rPr>
+          <m:t>{</m:t>
+        </m:r>
+        <m:r>
+          <m:t>1</m:t>
+        </m:r>
+        <m:r>
+          <m:rPr>
+            <m:sty m:val="p"/>
+          </m:rPr>
+          <m:t>,</m:t>
+        </m:r>
+        <m:r>
+          <m:t>2</m:t>
+        </m:r>
+        <m:r>
+          <m:rPr>
+            <m:sty m:val="p"/>
+          </m:rPr>
+          <m:t>}</m:t>
+        </m:r>
+      </m:oMath>
+      <w:r>
+        <w:t xml:space="preserve">, standardized egg size</w:t>
+      </w:r>
+      <w:r>
+        <w:t xml:space="preserve"> </w:t>
+      </w:r>
+      <m:oMath>
+        <m:sSub>
+          <m:e>
+            <m:r>
+              <m:t>y</m:t>
+            </m:r>
+          </m:e>
+          <m:sub>
+            <m:r>
+              <m:t>i</m:t>
+            </m:r>
+            <m:r>
+              <m:t>j</m:t>
+            </m:r>
+            <m:r>
+              <m:t>b</m:t>
+            </m:r>
+          </m:sub>
+        </m:sSub>
+      </m:oMath>
+      <w:r>
+        <w:t xml:space="preserve"> </w:t>
+      </w:r>
+      <w:r>
+        <w:t xml:space="preserve">was modeled as:</w:t>
+      </w:r>
+    </w:p>
+    <w:p>
+      <w:pPr>
+        <w:pStyle w:val="BodyText"/>
+      </w:pPr>
+      <m:oMathPara>
+        <m:oMathParaPr>
+          <m:jc m:val="center"/>
+        </m:oMathParaPr>
+        <m:oMath>
+          <m:sSub>
+            <m:e>
+              <m:r>
+                <m:t>y</m:t>
+              </m:r>
+            </m:e>
+            <m:sub>
+              <m:r>
+                <m:t>i</m:t>
+              </m:r>
+              <m:r>
+                <m:t>j</m:t>
+              </m:r>
+              <m:r>
+                <m:t>b</m:t>
+              </m:r>
+            </m:sub>
+          </m:sSub>
+          <m:r>
+            <m:rPr>
+              <m:sty m:val="p"/>
+            </m:rPr>
+            <m:t>∼</m:t>
+          </m:r>
+          <m:r>
+            <m:rPr>
+              <m:sty m:val="p"/>
+              <m:scr m:val="script"/>
+            </m:rPr>
+            <m:t>N</m:t>
+          </m:r>
+          <m:d>
+            <m:dPr>
+              <m:begChr m:val="("/>
+              <m:sepChr m:val=""/>
+              <m:endChr m:val=")"/>
+              <m:grow/>
+            </m:dPr>
+            <m:e>
+              <m:sSub>
+                <m:e>
+                  <m:r>
+                    <m:t>μ</m:t>
+                  </m:r>
+                </m:e>
+                <m:sub>
+                  <m:r>
+                    <m:t>i</m:t>
+                  </m:r>
+                  <m:r>
+                    <m:t>j</m:t>
+                  </m:r>
+                  <m:r>
+                    <m:t>b</m:t>
+                  </m:r>
+                </m:sub>
+              </m:sSub>
+              <m:r>
+                <m:rPr>
+                  <m:sty m:val="p"/>
+                </m:rPr>
+                <m:t>,</m:t>
+              </m:r>
+              <m:sSubSup>
+                <m:e>
+                  <m:r>
+                    <m:t>σ</m:t>
+                  </m:r>
+                </m:e>
+                <m:sub>
+                  <m:r>
+                    <m:t>b</m:t>
+                  </m:r>
+                </m:sub>
+                <m:sup>
+                  <m:r>
+                    <m:t>2</m:t>
+                  </m:r>
+                </m:sup>
+              </m:sSubSup>
+            </m:e>
+          </m:d>
+        </m:oMath>
+      </m:oMathPara>
+    </w:p>
+    <w:p>
+      <w:pPr>
+        <w:pStyle w:val="FirstParagraph"/>
+      </w:pPr>
+      <w:r>
+        <w:t xml:space="preserve">The conditional mean structure was:</w:t>
+      </w:r>
+    </w:p>
+    <w:p>
+      <w:pPr>
+        <w:pStyle w:val="BodyText"/>
+      </w:pPr>
+      <m:oMathPara>
+        <m:oMathParaPr>
+          <m:jc m:val="center"/>
+        </m:oMathParaPr>
+        <m:oMath>
+          <m:sSub>
+            <m:e>
+              <m:r>
+                <m:t>μ</m:t>
+              </m:r>
+            </m:e>
+            <m:sub>
+              <m:r>
+                <m:t>i</m:t>
+              </m:r>
+              <m:r>
+                <m:t>j</m:t>
+              </m:r>
+              <m:r>
+                <m:t>b</m:t>
+              </m:r>
+            </m:sub>
+          </m:sSub>
+          <m:r>
+            <m:rPr>
+              <m:sty m:val="p"/>
+            </m:rPr>
+            <m:t>=</m:t>
+          </m:r>
+          <m:sSub>
+            <m:e>
+              <m:r>
+                <m:t>β</m:t>
+              </m:r>
+            </m:e>
+            <m:sub>
+              <m:r>
+                <m:t>0</m:t>
+              </m:r>
+            </m:sub>
+          </m:sSub>
+          <m:r>
+            <m:rPr>
+              <m:sty m:val="p"/>
+            </m:rPr>
+            <m:t>+</m:t>
+          </m:r>
+          <m:sSub>
+            <m:e>
+              <m:r>
+                <m:t>β</m:t>
+              </m:r>
+            </m:e>
+            <m:sub>
+              <m:r>
+                <m:t>1</m:t>
+              </m:r>
+            </m:sub>
+          </m:sSub>
+          <m:r>
+            <m:t>I</m:t>
+          </m:r>
+          <m:d>
+            <m:dPr>
+              <m:begChr m:val="("/>
+              <m:sepChr m:val=""/>
+              <m:endChr m:val=")"/>
+              <m:grow/>
+            </m:dPr>
+            <m:e>
+              <m:r>
+                <m:t>b</m:t>
+              </m:r>
+              <m:r>
+                <m:rPr>
+                  <m:sty m:val="p"/>
+                </m:rPr>
+                <m:t>=</m:t>
+              </m:r>
+              <m:r>
+                <m:t>2</m:t>
+              </m:r>
+            </m:e>
+          </m:d>
+          <m:r>
+            <m:rPr>
+              <m:sty m:val="p"/>
+            </m:rPr>
+            <m:t>+</m:t>
+          </m:r>
+          <m:sSub>
+            <m:e>
+              <m:r>
+                <m:t>u</m:t>
+              </m:r>
+            </m:e>
+            <m:sub>
+              <m:r>
+                <m:t>i</m:t>
+              </m:r>
+              <m:r>
+                <m:t>b</m:t>
+              </m:r>
+            </m:sub>
+          </m:sSub>
+        </m:oMath>
+      </m:oMathPara>
+    </w:p>
+    <w:p>
+      <w:pPr>
+        <w:pStyle w:val="FirstParagraph"/>
+      </w:pPr>
+      <w:r>
+        <w:t xml:space="preserve">where:</w:t>
+      </w:r>
+    </w:p>
+    <w:p>
+      <w:pPr>
+        <w:pStyle w:val="Compact"/>
+        <w:numPr>
+          <w:ilvl w:val="0"/>
+          <w:numId w:val="1001"/>
+        </w:numPr>
+      </w:pPr>
+      <m:oMath>
+        <m:sSub>
+          <m:e>
+            <m:r>
+              <m:t>β</m:t>
+            </m:r>
+          </m:e>
+          <m:sub>
+            <m:r>
+              <m:t>0</m:t>
+            </m:r>
+          </m:sub>
+        </m:sSub>
+      </m:oMath>
+      <w:r>
+        <w:t xml:space="preserve"> </w:t>
+      </w:r>
+      <w:r>
+        <w:t xml:space="preserve">is the mean egg size in clutch 1 (reference level),</w:t>
+      </w:r>
+      <w:r>
+        <w:br/>
+      </w:r>
+    </w:p>
+    <w:p>
+      <w:pPr>
+        <w:pStyle w:val="Compact"/>
+        <w:numPr>
+          <w:ilvl w:val="0"/>
+          <w:numId w:val="1001"/>
+        </w:numPr>
+      </w:pPr>
+      <m:oMath>
+        <m:sSub>
+          <m:e>
+            <m:r>
+              <m:t>β</m:t>
+            </m:r>
+          </m:e>
+          <m:sub>
+            <m:r>
+              <m:t>1</m:t>
+            </m:r>
+          </m:sub>
+        </m:sSub>
+      </m:oMath>
+      <w:r>
+        <w:t xml:space="preserve"> </w:t>
+      </w:r>
+      <w:r>
+        <w:t xml:space="preserve">is the fixed difference between clutch 2 and clutch 1,</w:t>
+      </w:r>
+      <w:r>
+        <w:br/>
+      </w:r>
+    </w:p>
+    <w:p>
+      <w:pPr>
+        <w:pStyle w:val="Compact"/>
+        <w:numPr>
+          <w:ilvl w:val="0"/>
+          <w:numId w:val="1001"/>
+        </w:numPr>
+      </w:pPr>
+      <m:oMath>
+        <m:sSub>
+          <m:e>
+            <m:r>
+              <m:t>u</m:t>
+            </m:r>
+          </m:e>
+          <m:sub>
+            <m:r>
+              <m:t>i</m:t>
+            </m:r>
+            <m:r>
+              <m:t>b</m:t>
+            </m:r>
+          </m:sub>
+        </m:sSub>
+      </m:oMath>
+      <w:r>
+        <w:t xml:space="preserve"> </w:t>
+      </w:r>
+      <w:r>
+        <w:t xml:space="preserve">is the female-specific deviation for clutch</w:t>
+      </w:r>
+      <w:r>
+        <w:t xml:space="preserve"> </w:t>
+      </w:r>
+      <m:oMath>
+        <m:r>
+          <m:t>b</m:t>
+        </m:r>
+      </m:oMath>
+      <w:r>
+        <w:t xml:space="preserve">.</w:t>
+      </w:r>
+    </w:p>
+    <w:bookmarkEnd w:id="49"/>
+    <w:bookmarkStart w:id="50" w:name="random-effects-structure"/>
+    <w:p>
+      <w:pPr>
+        <w:pStyle w:val="Heading2"/>
+      </w:pPr>
+      <w:r>
+        <w:t xml:space="preserve">Random Effects Structure</w:t>
+      </w:r>
+    </w:p>
+    <w:p>
+      <w:pPr>
+        <w:pStyle w:val="FirstParagraph"/>
+      </w:pPr>
+      <w:r>
+        <w:t xml:space="preserve">Clutch-specific female deviations were modeled as a correlated bivariate normal vector:</w:t>
+      </w:r>
+    </w:p>
+    <w:p>
+      <w:pPr>
+        <w:pStyle w:val="BodyText"/>
+      </w:pPr>
+      <m:oMathPara>
+        <m:oMathParaPr>
+          <m:jc m:val="center"/>
+        </m:oMathParaPr>
+        <m:oMath>
+          <m:sSub>
+            <m:e>
+              <m:r>
+                <m:rPr>
+                  <m:sty m:val="b"/>
+                </m:rPr>
+                <m:t>u</m:t>
+              </m:r>
+            </m:e>
+            <m:sub>
+              <m:r>
+                <m:t>i</m:t>
+              </m:r>
+            </m:sub>
+          </m:sSub>
+          <m:r>
+            <m:rPr>
+              <m:sty m:val="p"/>
+            </m:rPr>
+            <m:t>=</m:t>
+          </m:r>
+          <m:d>
+            <m:dPr>
+              <m:begChr m:val="("/>
+              <m:sepChr m:val=""/>
+              <m:endChr m:val=")"/>
+              <m:grow/>
+            </m:dPr>
+            <m:e>
+              <m:m>
+                <m:mPr>
+                  <m:baseJc m:val="center"/>
+                  <m:plcHide m:val="on"/>
+                  <m:mcs>
+                    <m:mc>
+                      <m:mcPr>
+                        <m:mcJc m:val="center"/>
+                        <m:count m:val="1"/>
+                      </m:mcPr>
+                    </m:mc>
+                  </m:mcs>
+                </m:mPr>
+                <m:mr>
+                  <m:e>
+                    <m:sSub>
+                      <m:e>
+                        <m:r>
+                          <m:t>u</m:t>
+                        </m:r>
+                      </m:e>
+                      <m:sub>
+                        <m:r>
+                          <m:t>i</m:t>
+                        </m:r>
+                        <m:r>
+                          <m:t>1</m:t>
+                        </m:r>
+                      </m:sub>
+                    </m:sSub>
+                  </m:e>
+                </m:mr>
+                <m:mr>
+                  <m:e>
+                    <m:sSub>
+                      <m:e>
+                        <m:r>
+                          <m:t>u</m:t>
+                        </m:r>
+                      </m:e>
+                      <m:sub>
+                        <m:r>
+                          <m:t>i</m:t>
+                        </m:r>
+                        <m:r>
+                          <m:t>2</m:t>
+                        </m:r>
+                      </m:sub>
+                    </m:sSub>
+                  </m:e>
+                </m:mr>
+              </m:m>
+            </m:e>
+          </m:d>
+          <m:r>
+            <m:rPr>
+              <m:sty m:val="p"/>
+            </m:rPr>
+            <m:t>∼</m:t>
+          </m:r>
+          <m:r>
+            <m:rPr>
+              <m:sty m:val="p"/>
+              <m:scr m:val="script"/>
+            </m:rPr>
+            <m:t>M</m:t>
+          </m:r>
+          <m:r>
+            <m:rPr>
+              <m:sty m:val="p"/>
+              <m:scr m:val="script"/>
+            </m:rPr>
+            <m:t>V</m:t>
+          </m:r>
+          <m:r>
+            <m:rPr>
+              <m:sty m:val="p"/>
+              <m:scr m:val="script"/>
+            </m:rPr>
+            <m:t>N</m:t>
+          </m:r>
+          <m:d>
+            <m:dPr>
+              <m:begChr m:val="("/>
+              <m:sepChr m:val=""/>
+              <m:endChr m:val=")"/>
+              <m:grow/>
+            </m:dPr>
+            <m:e>
+              <m:d>
+                <m:dPr>
+                  <m:begChr m:val="("/>
+                  <m:sepChr m:val=""/>
+                  <m:endChr m:val=")"/>
+                  <m:grow/>
+                </m:dPr>
+                <m:e>
+                  <m:m>
+                    <m:mPr>
+                      <m:baseJc m:val="center"/>
+                      <m:plcHide m:val="on"/>
+                      <m:mcs>
+                        <m:mc>
+                          <m:mcPr>
+                            <m:mcJc m:val="center"/>
+                            <m:count m:val="1"/>
+                          </m:mcPr>
+                        </m:mc>
+                      </m:mcs>
+                    </m:mPr>
+                    <m:mr>
+                      <m:e>
+                        <m:r>
+                          <m:t>0</m:t>
+                        </m:r>
+                      </m:e>
+                    </m:mr>
+                    <m:mr>
+                      <m:e>
+                        <m:r>
+                          <m:t>0</m:t>
+                        </m:r>
+                      </m:e>
+                    </m:mr>
+                  </m:m>
+                </m:e>
+              </m:d>
+              <m:r>
+                <m:rPr>
+                  <m:sty m:val="p"/>
+                </m:rPr>
+                <m:t>,</m:t>
+              </m:r>
+              <m:r>
+                <m:t>Σ</m:t>
+              </m:r>
+            </m:e>
+          </m:d>
+        </m:oMath>
+      </m:oMathPara>
+    </w:p>
+    <w:p>
+      <w:pPr>
+        <w:pStyle w:val="FirstParagraph"/>
+      </w:pPr>
+      <w:r>
+        <w:t xml:space="preserve">with variance–covariance matrix:</w:t>
+      </w:r>
+    </w:p>
+    <w:p>
+      <w:pPr>
+        <w:pStyle w:val="BodyText"/>
+      </w:pPr>
+      <m:oMathPara>
+        <m:oMathParaPr>
+          <m:jc m:val="center"/>
+        </m:oMathParaPr>
+        <m:oMath>
+          <m:r>
+            <m:t>Σ</m:t>
+          </m:r>
+          <m:r>
+            <m:rPr>
+              <m:sty m:val="p"/>
+            </m:rPr>
+            <m:t>=</m:t>
+          </m:r>
+          <m:d>
+            <m:dPr>
+              <m:begChr m:val="("/>
+              <m:sepChr m:val=""/>
+              <m:endChr m:val=")"/>
+              <m:grow/>
+            </m:dPr>
+            <m:e>
+              <m:m>
+                <m:mPr>
+                  <m:baseJc m:val="center"/>
+                  <m:plcHide m:val="on"/>
+                  <m:mcs>
+                    <m:mc>
+                      <m:mcPr>
+                        <m:mcJc m:val="center"/>
+                        <m:count m:val="1"/>
+                      </m:mcPr>
+                    </m:mc>
+                    <m:mc>
+                      <m:mcPr>
+                        <m:mcJc m:val="center"/>
+                        <m:count m:val="1"/>
+                      </m:mcPr>
+                    </m:mc>
+                  </m:mcs>
+                </m:mPr>
+                <m:mr>
+                  <m:e>
+                    <m:sSubSup>
+                      <m:e>
+                        <m:r>
+                          <m:t>τ</m:t>
+                        </m:r>
+                      </m:e>
+                      <m:sub>
+                        <m:r>
+                          <m:t>1</m:t>
+                        </m:r>
+                      </m:sub>
+                      <m:sup>
+                        <m:r>
+                          <m:t>2</m:t>
+                        </m:r>
+                      </m:sup>
+                    </m:sSubSup>
+                  </m:e>
+                  <m:e>
+                    <m:r>
+                      <m:t>ρ</m:t>
+                    </m:r>
+                    <m:sSub>
+                      <m:e>
+                        <m:r>
+                          <m:t>τ</m:t>
+                        </m:r>
+                      </m:e>
+                      <m:sub>
+                        <m:r>
+                          <m:t>1</m:t>
+                        </m:r>
+                      </m:sub>
+                    </m:sSub>
+                    <m:sSub>
+                      <m:e>
+                        <m:r>
+                          <m:t>τ</m:t>
+                        </m:r>
+                      </m:e>
+                      <m:sub>
+                        <m:r>
+                          <m:t>2</m:t>
+                        </m:r>
+                      </m:sub>
+                    </m:sSub>
+                  </m:e>
+                </m:mr>
+                <m:mr>
+                  <m:e>
+                    <m:r>
+                      <m:t>ρ</m:t>
+                    </m:r>
+                    <m:sSub>
+                      <m:e>
+                        <m:r>
+                          <m:t>τ</m:t>
+                        </m:r>
+                      </m:e>
+                      <m:sub>
+                        <m:r>
+                          <m:t>1</m:t>
+                        </m:r>
+                      </m:sub>
+                    </m:sSub>
+                    <m:sSub>
+                      <m:e>
+                        <m:r>
+                          <m:t>τ</m:t>
+                        </m:r>
+                      </m:e>
+                      <m:sub>
+                        <m:r>
+                          <m:t>2</m:t>
+                        </m:r>
+                      </m:sub>
+                    </m:sSub>
+                  </m:e>
+                  <m:e>
+                    <m:sSubSup>
+                      <m:e>
+                        <m:r>
+                          <m:t>τ</m:t>
+                        </m:r>
+                      </m:e>
+                      <m:sub>
+                        <m:r>
+                          <m:t>2</m:t>
+                        </m:r>
+                      </m:sub>
+                      <m:sup>
+                        <m:r>
+                          <m:t>2</m:t>
+                        </m:r>
+                      </m:sup>
+                    </m:sSubSup>
+                  </m:e>
+                </m:mr>
+              </m:m>
+            </m:e>
+          </m:d>
+        </m:oMath>
+      </m:oMathPara>
+    </w:p>
+    <w:p>
+      <w:pPr>
+        <w:pStyle w:val="FirstParagraph"/>
+      </w:pPr>
+      <w:r>
+        <w:t xml:space="preserve">Here:</w:t>
+      </w:r>
+    </w:p>
+    <w:p>
+      <w:pPr>
+        <w:pStyle w:val="Compact"/>
+        <w:numPr>
+          <w:ilvl w:val="0"/>
+          <w:numId w:val="1002"/>
+        </w:numPr>
+      </w:pPr>
+      <m:oMath>
+        <m:sSubSup>
+          <m:e>
+            <m:r>
+              <m:t>τ</m:t>
+            </m:r>
+          </m:e>
+          <m:sub>
+            <m:r>
+              <m:t>1</m:t>
+            </m:r>
+          </m:sub>
+          <m:sup>
+            <m:r>
+              <m:t>2</m:t>
+            </m:r>
+          </m:sup>
+        </m:sSubSup>
+      </m:oMath>
+      <w:r>
+        <w:t xml:space="preserve"> </w:t>
+      </w:r>
+      <w:r>
+        <w:t xml:space="preserve">and</w:t>
+      </w:r>
+      <w:r>
+        <w:t xml:space="preserve"> </w:t>
+      </w:r>
+      <m:oMath>
+        <m:sSubSup>
+          <m:e>
+            <m:r>
+              <m:t>τ</m:t>
+            </m:r>
+          </m:e>
+          <m:sub>
+            <m:r>
+              <m:t>2</m:t>
+            </m:r>
+          </m:sub>
+          <m:sup>
+            <m:r>
+              <m:t>2</m:t>
+            </m:r>
+          </m:sup>
+        </m:sSubSup>
+      </m:oMath>
+      <w:r>
+        <w:t xml:space="preserve"> </w:t>
+      </w:r>
+      <w:r>
+        <w:t xml:space="preserve">are the among-female variances in clutches 1 and 2, respectively,</w:t>
+      </w:r>
+      <w:r>
+        <w:br/>
+      </w:r>
+    </w:p>
+    <w:p>
+      <w:pPr>
+        <w:pStyle w:val="Compact"/>
+        <w:numPr>
+          <w:ilvl w:val="0"/>
+          <w:numId w:val="1002"/>
+        </w:numPr>
+      </w:pPr>
+      <m:oMath>
+        <m:r>
+          <m:t>ρ</m:t>
+        </m:r>
+        <m:r>
+          <m:rPr>
+            <m:sty m:val="p"/>
+          </m:rPr>
+          <m:t>=</m:t>
+        </m:r>
+        <m:r>
+          <m:rPr>
+            <m:sty m:val="p"/>
+          </m:rPr>
+          <m:t>C</m:t>
+        </m:r>
+        <m:r>
+          <m:rPr>
+            <m:sty m:val="p"/>
+          </m:rPr>
+          <m:t>o</m:t>
+        </m:r>
+        <m:r>
+          <m:rPr>
+            <m:sty m:val="p"/>
+          </m:rPr>
+          <m:t>r</m:t>
+        </m:r>
+        <m:r>
+          <m:rPr>
+            <m:sty m:val="p"/>
+          </m:rPr>
+          <m:t>r</m:t>
+        </m:r>
+        <m:d>
+          <m:dPr>
+            <m:begChr m:val="("/>
+            <m:sepChr m:val=""/>
+            <m:endChr m:val=")"/>
+            <m:grow/>
+          </m:dPr>
+          <m:e>
+            <m:sSub>
+              <m:e>
+                <m:r>
+                  <m:t>u</m:t>
+                </m:r>
+              </m:e>
+              <m:sub>
+                <m:r>
+                  <m:t>i</m:t>
+                </m:r>
+                <m:r>
+                  <m:t>1</m:t>
+                </m:r>
+              </m:sub>
+            </m:sSub>
+            <m:r>
+              <m:rPr>
+                <m:sty m:val="p"/>
+              </m:rPr>
+              <m:t>,</m:t>
+            </m:r>
+            <m:sSub>
+              <m:e>
+                <m:r>
+                  <m:t>u</m:t>
+                </m:r>
+              </m:e>
+              <m:sub>
+                <m:r>
+                  <m:t>i</m:t>
+                </m:r>
+                <m:r>
+                  <m:t>2</m:t>
+                </m:r>
+              </m:sub>
+            </m:sSub>
+          </m:e>
+        </m:d>
+      </m:oMath>
+      <w:r>
+        <w:t xml:space="preserve"> </w:t>
+      </w:r>
+      <w:r>
+        <w:t xml:space="preserve">is the correlation between female deviations across clutches.</w:t>
+      </w:r>
+    </w:p>
+    <w:p>
+      <w:pPr>
+        <w:pStyle w:val="FirstParagraph"/>
+      </w:pPr>
+      <w:r>
+        <w:t xml:space="preserve">Importantly, no clutch-independent random intercept was estimated. The model includes only clutch-specific female deviations (i.e., random slopes of clutch within female), corresponding to the specification</w:t>
+      </w:r>
+      <w:r>
+        <w:t xml:space="preserve"> </w:t>
+      </w:r>
+      <w:r>
+        <w:rPr>
+          <w:rStyle w:val="VerbatimChar"/>
+        </w:rPr>
+        <w:t xml:space="preserve">(0 + brood_factor | id)</w:t>
+      </w:r>
+      <w:r>
+        <w:t xml:space="preserve"> </w:t>
+      </w:r>
+      <w:r>
+        <w:t xml:space="preserve">in</w:t>
+      </w:r>
+      <w:r>
+        <w:t xml:space="preserve"> </w:t>
+      </w:r>
+      <w:r>
+        <w:rPr>
+          <w:rStyle w:val="VerbatimChar"/>
+        </w:rPr>
+        <w:t xml:space="preserve">brms</w:t>
+      </w:r>
+      <w:r>
+        <w:t xml:space="preserve">.</w:t>
+      </w:r>
+    </w:p>
+    <w:bookmarkEnd w:id="50"/>
+    <w:bookmarkStart w:id="51" w:name="residual-variance-model"/>
+    <w:p>
+      <w:pPr>
+        <w:pStyle w:val="Heading2"/>
+      </w:pPr>
+      <w:r>
+        <w:t xml:space="preserve">Residual Variance Model</w:t>
+      </w:r>
+    </w:p>
+    <w:p>
+      <w:pPr>
+        <w:pStyle w:val="FirstParagraph"/>
+      </w:pPr>
+      <w:r>
+        <w:t xml:space="preserve">Residual variance was allowed to differ between clutches:</w:t>
+      </w:r>
+    </w:p>
+    <w:p>
+      <w:pPr>
+        <w:pStyle w:val="BodyText"/>
+      </w:pPr>
+      <m:oMathPara>
+        <m:oMathParaPr>
+          <m:jc m:val="center"/>
+        </m:oMathParaPr>
+        <m:oMath>
+          <m:r>
+            <m:rPr>
+              <m:sty m:val="p"/>
+            </m:rPr>
+            <m:t>log</m:t>
+          </m:r>
+          <m:d>
+            <m:dPr>
+              <m:begChr m:val="("/>
+              <m:sepChr m:val=""/>
+              <m:endChr m:val=")"/>
+              <m:grow/>
+            </m:dPr>
+            <m:e>
+              <m:sSub>
+                <m:e>
+                  <m:r>
+                    <m:t>σ</m:t>
+                  </m:r>
+                </m:e>
+                <m:sub>
+                  <m:r>
+                    <m:t>b</m:t>
+                  </m:r>
+                </m:sub>
+              </m:sSub>
+            </m:e>
+          </m:d>
+          <m:r>
+            <m:rPr>
+              <m:sty m:val="p"/>
+            </m:rPr>
+            <m:t>=</m:t>
+          </m:r>
+          <m:sSub>
+            <m:e>
+              <m:r>
+                <m:t>α</m:t>
+              </m:r>
+            </m:e>
+            <m:sub>
+              <m:r>
+                <m:t>0</m:t>
+              </m:r>
+            </m:sub>
+          </m:sSub>
+          <m:r>
+            <m:rPr>
+              <m:sty m:val="p"/>
+            </m:rPr>
+            <m:t>+</m:t>
+          </m:r>
+          <m:sSub>
+            <m:e>
+              <m:r>
+                <m:t>α</m:t>
+              </m:r>
+            </m:e>
+            <m:sub>
+              <m:r>
+                <m:t>1</m:t>
+              </m:r>
+            </m:sub>
+          </m:sSub>
+          <m:r>
+            <m:t>I</m:t>
+          </m:r>
+          <m:d>
+            <m:dPr>
+              <m:begChr m:val="("/>
+              <m:sepChr m:val=""/>
+              <m:endChr m:val=")"/>
+              <m:grow/>
+            </m:dPr>
+            <m:e>
+              <m:r>
+                <m:t>b</m:t>
+              </m:r>
+              <m:r>
+                <m:rPr>
+                  <m:sty m:val="p"/>
+                </m:rPr>
+                <m:t>=</m:t>
+              </m:r>
+              <m:r>
+                <m:t>2</m:t>
+              </m:r>
+            </m:e>
+          </m:d>
+        </m:oMath>
+      </m:oMathPara>
+    </w:p>
+    <w:p>
+      <w:pPr>
+        <w:pStyle w:val="FirstParagraph"/>
+      </w:pPr>
+      <w:r>
+        <w:t xml:space="preserve">where:</w:t>
+      </w:r>
+    </w:p>
+    <w:p>
+      <w:pPr>
+        <w:pStyle w:val="Compact"/>
+        <w:numPr>
+          <w:ilvl w:val="0"/>
+          <w:numId w:val="1003"/>
+        </w:numPr>
+      </w:pPr>
+      <m:oMath>
+        <m:sSubSup>
+          <m:e>
+            <m:r>
+              <m:t>σ</m:t>
+            </m:r>
+          </m:e>
+          <m:sub>
+            <m:r>
+              <m:t>1</m:t>
+            </m:r>
+          </m:sub>
+          <m:sup>
+            <m:r>
+              <m:t>2</m:t>
+            </m:r>
+          </m:sup>
+        </m:sSubSup>
+      </m:oMath>
+      <w:r>
+        <w:t xml:space="preserve"> </w:t>
+      </w:r>
+      <w:r>
+        <w:t xml:space="preserve">is the residual variance in clutch 1,</w:t>
+      </w:r>
+      <w:r>
+        <w:br/>
+      </w:r>
+    </w:p>
+    <w:p>
+      <w:pPr>
+        <w:pStyle w:val="Compact"/>
+        <w:numPr>
+          <w:ilvl w:val="0"/>
+          <w:numId w:val="1003"/>
+        </w:numPr>
+      </w:pPr>
+      <m:oMath>
+        <m:sSubSup>
+          <m:e>
+            <m:r>
+              <m:t>σ</m:t>
+            </m:r>
+          </m:e>
+          <m:sub>
+            <m:r>
+              <m:t>2</m:t>
+            </m:r>
+          </m:sub>
+          <m:sup>
+            <m:r>
+              <m:t>2</m:t>
+            </m:r>
+          </m:sup>
+        </m:sSubSup>
+      </m:oMath>
+      <w:r>
+        <w:t xml:space="preserve"> </w:t>
+      </w:r>
+      <w:r>
+        <w:t xml:space="preserve">is the residual variance in clutch 2.</w:t>
+      </w:r>
+    </w:p>
+    <w:p>
+      <w:pPr>
+        <w:pStyle w:val="FirstParagraph"/>
+      </w:pPr>
+      <w:r>
+        <w:t xml:space="preserve">The log link ensures that residual standard deviations remain positive.</w:t>
+      </w:r>
+    </w:p>
+    <w:bookmarkEnd w:id="51"/>
+    <w:bookmarkStart w:id="53" w:name="corresponding-brms-specification"/>
+    <w:p>
+      <w:pPr>
+        <w:pStyle w:val="Heading2"/>
+      </w:pPr>
+      <w:r>
+        <w:t xml:space="preserve">Corresponding</w:t>
+      </w:r>
+      <w:r>
+        <w:t xml:space="preserve"> </w:t>
+      </w:r>
+      <w:r>
+        <w:rPr>
+          <w:i/>
+          <w:iCs/>
+        </w:rPr>
+        <w:t xml:space="preserve">brms</w:t>
+      </w:r>
+      <w:r>
+        <w:t xml:space="preserve"> </w:t>
+      </w:r>
+      <w:r>
+        <w:t xml:space="preserve">Specification</w:t>
+      </w:r>
+    </w:p>
+    <w:p>
+      <w:pPr>
+        <w:pStyle w:val="SourceCode"/>
+      </w:pPr>
+      <w:r>
+        <w:rPr>
+          <w:rStyle w:val="FunctionTok"/>
+        </w:rPr>
+        <w:t xml:space="preserve">bf</w:t>
+      </w:r>
+      <w:r>
+        <w:rPr>
+          <w:rStyle w:val="NormalTok"/>
+        </w:rPr>
+        <w:t xml:space="preserve">(</w:t>
+      </w:r>
+      <w:r>
+        <w:br/>
+      </w:r>
+      <w:r>
+        <w:rPr>
+          <w:rStyle w:val="NormalTok"/>
+        </w:rPr>
+        <w:t xml:space="preserve">  </w:t>
+      </w:r>
+      <w:r>
+        <w:rPr>
+          <w:rStyle w:val="FunctionTok"/>
+        </w:rPr>
+        <w:t xml:space="preserve">scale</w:t>
+      </w:r>
+      <w:r>
+        <w:rPr>
+          <w:rStyle w:val="NormalTok"/>
+        </w:rPr>
+        <w:t xml:space="preserve">(mean.perim) </w:t>
+      </w:r>
+      <w:r>
+        <w:rPr>
+          <w:rStyle w:val="SpecialCharTok"/>
+        </w:rPr>
+        <w:t xml:space="preserve">~</w:t>
+      </w:r>
+      <w:r>
+        <w:rPr>
+          <w:rStyle w:val="NormalTok"/>
+        </w:rPr>
+        <w:t xml:space="preserve"> brood_factor </w:t>
+      </w:r>
+      <w:r>
+        <w:rPr>
+          <w:rStyle w:val="SpecialCharTok"/>
+        </w:rPr>
+        <w:t xml:space="preserve">+</w:t>
+      </w:r>
+      <w:r>
+        <w:rPr>
+          <w:rStyle w:val="NormalTok"/>
+        </w:rPr>
+        <w:t xml:space="preserve"> (</w:t>
+      </w:r>
+      <w:r>
+        <w:rPr>
+          <w:rStyle w:val="DecValTok"/>
+        </w:rPr>
+        <w:t xml:space="preserve">0</w:t>
+      </w:r>
+      <w:r>
+        <w:rPr>
+          <w:rStyle w:val="NormalTok"/>
+        </w:rPr>
+        <w:t xml:space="preserve"> </w:t>
+      </w:r>
+      <w:r>
+        <w:rPr>
+          <w:rStyle w:val="SpecialCharTok"/>
+        </w:rPr>
+        <w:t xml:space="preserve">+</w:t>
+      </w:r>
+      <w:r>
+        <w:rPr>
+          <w:rStyle w:val="NormalTok"/>
+        </w:rPr>
+        <w:t xml:space="preserve"> brood_factor </w:t>
+      </w:r>
+      <w:r>
+        <w:rPr>
+          <w:rStyle w:val="SpecialCharTok"/>
+        </w:rPr>
+        <w:t xml:space="preserve">|</w:t>
+      </w:r>
+      <w:r>
+        <w:rPr>
+          <w:rStyle w:val="NormalTok"/>
+        </w:rPr>
+        <w:t xml:space="preserve"> id),</w:t>
+      </w:r>
+      <w:r>
+        <w:br/>
+      </w:r>
+      <w:r>
+        <w:rPr>
+          <w:rStyle w:val="NormalTok"/>
+        </w:rPr>
+        <w:t xml:space="preserve">  sigma </w:t>
+      </w:r>
+      <w:r>
+        <w:rPr>
+          <w:rStyle w:val="SpecialCharTok"/>
+        </w:rPr>
+        <w:t xml:space="preserve">~</w:t>
+      </w:r>
+      <w:r>
+        <w:rPr>
+          <w:rStyle w:val="NormalTok"/>
+        </w:rPr>
+        <w:t xml:space="preserve"> brood_factor</w:t>
+      </w:r>
+      <w:r>
+        <w:br/>
+      </w:r>
+      <w:r>
+        <w:rPr>
+          <w:rStyle w:val="NormalTok"/>
+        </w:rPr>
+        <w:t xml:space="preserve">)</w:t>
+      </w:r>
+    </w:p>
     <w:tbl>
       <w:tblPr>
         <w:tblStyle w:val="Table"/>
@@ -5694,7 +6603,7 @@
       <w:tr>
         <w:tc>
           <w:tcPr/>
-          <w:bookmarkStart w:id="47" w:name="tbl-two"/>
+          <w:bookmarkStart w:id="52" w:name="tbl-two"/>
           <w:p>
             <w:pPr>
               <w:jc w:val="center"/>
@@ -5725,6 +6634,7 @@
                 <w:trHeight w:val="619" w:hRule="auto"/>
                 <w:tblHeader/>
               </w:trPr>
+              header1
               <w:tc>
                 <w:tcPr>
                   <w:tcBorders>
@@ -5744,6 +6654,7 @@
                 </w:tcPr>
                 <w:p>
                   <w:pPr>
+                    <w:pStyle w:val="Normal"/>
                     <w:jc w:val="left"/>
                     <w:pBdr>
                       <w:bottom w:val="none" w:sz="0" w:space="0" w:color="000000"/>
@@ -5753,16 +6664,6 @@
                     </w:pBdr>
                     <w:spacing w:after="100" w:before="100" w:line="240"/>
                     <w:ind w:left="100" w:right="100" w:firstLine="0" w:firstLineChars="0"/>
-                    <w:rPr>
-                      <w:rFonts w:ascii="Helvetica" w:hAnsi="Helvetica" w:eastAsia="Helvetica" w:cs="Helvetica"/>
-                      <w:i w:val="false"/>
-                      <w:b w:val="false"/>
-                      <w:u w:val="none"/>
-                      <w:strike w:val="false"/>
-                      <w:sz w:val="22"/>
-                      <w:szCs w:val="22"/>
-                      <w:color w:val="000000"/>
-                    </w:rPr>
                   </w:pPr>
                   <w:r xmlns:w="http://schemas.openxmlformats.org/wordprocessingml/2006/main" xmlns:wp="http://schemas.openxmlformats.org/drawingml/2006/wordprocessingDrawing" xmlns:r="http://schemas.openxmlformats.org/officeDocument/2006/relationships" xmlns:w14="http://schemas.microsoft.com/office/word/2010/wordml">
                     <w:rPr>
@@ -5770,7 +6671,6 @@
                       <w:i w:val="false"/>
                       <w:b w:val="false"/>
                       <w:u w:val="none"/>
-                      <w:strike w:val="false"/>
                       <w:sz w:val="22"/>
                       <w:szCs w:val="22"/>
                       <w:color w:val="000000"/>
@@ -5798,6 +6698,7 @@
                 </w:tcPr>
                 <w:p>
                   <w:pPr>
+                    <w:pStyle w:val="Normal"/>
                     <w:jc w:val="right"/>
                     <w:pBdr>
                       <w:bottom w:val="none" w:sz="0" w:space="0" w:color="000000"/>
@@ -5807,16 +6708,6 @@
                     </w:pBdr>
                     <w:spacing w:after="100" w:before="100" w:line="240"/>
                     <w:ind w:left="100" w:right="100" w:firstLine="0" w:firstLineChars="0"/>
-                    <w:rPr>
-                      <w:rFonts w:ascii="Helvetica" w:hAnsi="Helvetica" w:eastAsia="Helvetica" w:cs="Helvetica"/>
-                      <w:i w:val="false"/>
-                      <w:b w:val="false"/>
-                      <w:u w:val="none"/>
-                      <w:strike w:val="false"/>
-                      <w:sz w:val="22"/>
-                      <w:szCs w:val="22"/>
-                      <w:color w:val="000000"/>
-                    </w:rPr>
                   </w:pPr>
                   <w:r xmlns:w="http://schemas.openxmlformats.org/wordprocessingml/2006/main" xmlns:wp="http://schemas.openxmlformats.org/drawingml/2006/wordprocessingDrawing" xmlns:r="http://schemas.openxmlformats.org/officeDocument/2006/relationships" xmlns:w14="http://schemas.microsoft.com/office/word/2010/wordml">
                     <w:rPr>
@@ -5824,7 +6715,6 @@
                       <w:i w:val="false"/>
                       <w:b w:val="false"/>
                       <w:u w:val="none"/>
-                      <w:strike w:val="false"/>
                       <w:sz w:val="22"/>
                       <w:szCs w:val="22"/>
                       <w:color w:val="000000"/>
@@ -5852,6 +6742,7 @@
                 </w:tcPr>
                 <w:p>
                   <w:pPr>
+                    <w:pStyle w:val="Normal"/>
                     <w:jc w:val="right"/>
                     <w:pBdr>
                       <w:bottom w:val="none" w:sz="0" w:space="0" w:color="000000"/>
@@ -5861,16 +6752,6 @@
                     </w:pBdr>
                     <w:spacing w:after="100" w:before="100" w:line="240"/>
                     <w:ind w:left="100" w:right="100" w:firstLine="0" w:firstLineChars="0"/>
-                    <w:rPr>
-                      <w:rFonts w:ascii="Helvetica" w:hAnsi="Helvetica" w:eastAsia="Helvetica" w:cs="Helvetica"/>
-                      <w:i w:val="false"/>
-                      <w:b w:val="false"/>
-                      <w:u w:val="none"/>
-                      <w:strike w:val="false"/>
-                      <w:sz w:val="22"/>
-                      <w:szCs w:val="22"/>
-                      <w:color w:val="000000"/>
-                    </w:rPr>
                   </w:pPr>
                   <w:r xmlns:w="http://schemas.openxmlformats.org/wordprocessingml/2006/main" xmlns:wp="http://schemas.openxmlformats.org/drawingml/2006/wordprocessingDrawing" xmlns:r="http://schemas.openxmlformats.org/officeDocument/2006/relationships" xmlns:w14="http://schemas.microsoft.com/office/word/2010/wordml">
                     <w:rPr>
@@ -5878,7 +6759,6 @@
                       <w:i w:val="false"/>
                       <w:b w:val="false"/>
                       <w:u w:val="none"/>
-                      <w:strike w:val="false"/>
                       <w:sz w:val="22"/>
                       <w:szCs w:val="22"/>
                       <w:color w:val="000000"/>
@@ -5906,6 +6786,7 @@
                 </w:tcPr>
                 <w:p>
                   <w:pPr>
+                    <w:pStyle w:val="Normal"/>
                     <w:jc w:val="right"/>
                     <w:pBdr>
                       <w:bottom w:val="none" w:sz="0" w:space="0" w:color="000000"/>
@@ -5915,16 +6796,6 @@
                     </w:pBdr>
                     <w:spacing w:after="100" w:before="100" w:line="240"/>
                     <w:ind w:left="100" w:right="100" w:firstLine="0" w:firstLineChars="0"/>
-                    <w:rPr>
-                      <w:rFonts w:ascii="Helvetica" w:hAnsi="Helvetica" w:eastAsia="Helvetica" w:cs="Helvetica"/>
-                      <w:i w:val="false"/>
-                      <w:b w:val="false"/>
-                      <w:u w:val="none"/>
-                      <w:strike w:val="false"/>
-                      <w:sz w:val="22"/>
-                      <w:szCs w:val="22"/>
-                      <w:color w:val="000000"/>
-                    </w:rPr>
                   </w:pPr>
                   <w:r xmlns:w="http://schemas.openxmlformats.org/wordprocessingml/2006/main" xmlns:wp="http://schemas.openxmlformats.org/drawingml/2006/wordprocessingDrawing" xmlns:r="http://schemas.openxmlformats.org/officeDocument/2006/relationships" xmlns:w14="http://schemas.microsoft.com/office/word/2010/wordml">
                     <w:rPr>
@@ -5932,7 +6803,6 @@
                       <w:i w:val="false"/>
                       <w:b w:val="false"/>
                       <w:u w:val="none"/>
-                      <w:strike w:val="false"/>
                       <w:sz w:val="22"/>
                       <w:szCs w:val="22"/>
                       <w:color w:val="000000"/>
@@ -5944,8 +6814,9 @@
             </w:tr>
             <w:tr>
               <w:trPr>
-                <w:trHeight w:val="573" w:hRule="auto"/>
+                <w:trHeight w:val="616" w:hRule="auto"/>
               </w:trPr>
+              body1
               <w:tc>
                 <w:tcPr>
                   <w:tcBorders>
@@ -5965,6 +6836,7 @@
                 </w:tcPr>
                 <w:p>
                   <w:pPr>
+                    <w:pStyle w:val="Normal"/>
                     <w:jc w:val="left"/>
                     <w:pBdr>
                       <w:bottom w:val="none" w:sz="0" w:space="0" w:color="000000"/>
@@ -5974,16 +6846,6 @@
                     </w:pBdr>
                     <w:spacing w:after="100" w:before="100" w:line="240"/>
                     <w:ind w:left="100" w:right="100" w:firstLine="0" w:firstLineChars="0"/>
-                    <w:rPr>
-                      <w:rFonts w:ascii="Helvetica" w:hAnsi="Helvetica" w:eastAsia="Helvetica" w:cs="Helvetica"/>
-                      <w:i w:val="false"/>
-                      <w:b w:val="false"/>
-                      <w:u w:val="none"/>
-                      <w:strike w:val="false"/>
-                      <w:sz w:val="22"/>
-                      <w:szCs w:val="22"/>
-                      <w:color w:val="000000"/>
-                    </w:rPr>
                   </w:pPr>
                   <w:r xmlns:w="http://schemas.openxmlformats.org/wordprocessingml/2006/main" xmlns:wp="http://schemas.openxmlformats.org/drawingml/2006/wordprocessingDrawing" xmlns:r="http://schemas.openxmlformats.org/officeDocument/2006/relationships" xmlns:w14="http://schemas.microsoft.com/office/word/2010/wordml">
                     <w:rPr>
@@ -5991,12 +6853,11 @@
                       <w:i w:val="false"/>
                       <w:b w:val="false"/>
                       <w:u w:val="none"/>
-                      <w:strike w:val="false"/>
                       <w:sz w:val="22"/>
                       <w:szCs w:val="22"/>
                       <w:color w:val="000000"/>
                     </w:rPr>
-                    <w:t xml:space="preserve">Brood 2 − Brood 1</w:t>
+                    <w:t xml:space="preserve">Mean (Brood 1)</w:t>
                   </w:r>
                 </w:p>
               </w:tc>
@@ -6019,6 +6880,7 @@
                 </w:tcPr>
                 <w:p>
                   <w:pPr>
+                    <w:pStyle w:val="Normal"/>
                     <w:jc w:val="right"/>
                     <w:pBdr>
                       <w:bottom w:val="none" w:sz="0" w:space="0" w:color="000000"/>
@@ -6028,16 +6890,6 @@
                     </w:pBdr>
                     <w:spacing w:after="100" w:before="100" w:line="240"/>
                     <w:ind w:left="100" w:right="100" w:firstLine="0" w:firstLineChars="0"/>
-                    <w:rPr>
-                      <w:rFonts w:ascii="Helvetica" w:hAnsi="Helvetica" w:eastAsia="Helvetica" w:cs="Helvetica"/>
-                      <w:i w:val="false"/>
-                      <w:b w:val="false"/>
-                      <w:u w:val="none"/>
-                      <w:strike w:val="false"/>
-                      <w:sz w:val="22"/>
-                      <w:szCs w:val="22"/>
-                      <w:color w:val="000000"/>
-                    </w:rPr>
                   </w:pPr>
                   <w:r xmlns:w="http://schemas.openxmlformats.org/wordprocessingml/2006/main" xmlns:wp="http://schemas.openxmlformats.org/drawingml/2006/wordprocessingDrawing" xmlns:r="http://schemas.openxmlformats.org/officeDocument/2006/relationships" xmlns:w14="http://schemas.microsoft.com/office/word/2010/wordml">
                     <w:rPr>
@@ -6045,12 +6897,11 @@
                       <w:i w:val="false"/>
                       <w:b w:val="false"/>
                       <w:u w:val="none"/>
-                      <w:strike w:val="false"/>
                       <w:sz w:val="22"/>
                       <w:szCs w:val="22"/>
                       <w:color w:val="000000"/>
                     </w:rPr>
-                    <w:t xml:space="preserve">-0.535</w:t>
+                    <w:t xml:space="preserve">0.283</w:t>
                   </w:r>
                 </w:p>
               </w:tc>
@@ -6073,6 +6924,7 @@
                 </w:tcPr>
                 <w:p>
                   <w:pPr>
+                    <w:pStyle w:val="Normal"/>
                     <w:jc w:val="right"/>
                     <w:pBdr>
                       <w:bottom w:val="none" w:sz="0" w:space="0" w:color="000000"/>
@@ -6082,16 +6934,6 @@
                     </w:pBdr>
                     <w:spacing w:after="100" w:before="100" w:line="240"/>
                     <w:ind w:left="100" w:right="100" w:firstLine="0" w:firstLineChars="0"/>
-                    <w:rPr>
-                      <w:rFonts w:ascii="Helvetica" w:hAnsi="Helvetica" w:eastAsia="Helvetica" w:cs="Helvetica"/>
-                      <w:i w:val="false"/>
-                      <w:b w:val="false"/>
-                      <w:u w:val="none"/>
-                      <w:strike w:val="false"/>
-                      <w:sz w:val="22"/>
-                      <w:szCs w:val="22"/>
-                      <w:color w:val="000000"/>
-                    </w:rPr>
                   </w:pPr>
                   <w:r xmlns:w="http://schemas.openxmlformats.org/wordprocessingml/2006/main" xmlns:wp="http://schemas.openxmlformats.org/drawingml/2006/wordprocessingDrawing" xmlns:r="http://schemas.openxmlformats.org/officeDocument/2006/relationships" xmlns:w14="http://schemas.microsoft.com/office/word/2010/wordml">
                     <w:rPr>
@@ -6099,12 +6941,11 @@
                       <w:i w:val="false"/>
                       <w:b w:val="false"/>
                       <w:u w:val="none"/>
-                      <w:strike w:val="false"/>
                       <w:sz w:val="22"/>
                       <w:szCs w:val="22"/>
                       <w:color w:val="000000"/>
                     </w:rPr>
-                    <w:t xml:space="preserve">-0.827</w:t>
+                    <w:t xml:space="preserve">0.050</w:t>
                   </w:r>
                 </w:p>
               </w:tc>
@@ -6127,6 +6968,7 @@
                 </w:tcPr>
                 <w:p>
                   <w:pPr>
+                    <w:pStyle w:val="Normal"/>
                     <w:jc w:val="right"/>
                     <w:pBdr>
                       <w:bottom w:val="none" w:sz="0" w:space="0" w:color="000000"/>
@@ -6136,16 +6978,6 @@
                     </w:pBdr>
                     <w:spacing w:after="100" w:before="100" w:line="240"/>
                     <w:ind w:left="100" w:right="100" w:firstLine="0" w:firstLineChars="0"/>
-                    <w:rPr>
-                      <w:rFonts w:ascii="Helvetica" w:hAnsi="Helvetica" w:eastAsia="Helvetica" w:cs="Helvetica"/>
-                      <w:i w:val="false"/>
-                      <w:b w:val="false"/>
-                      <w:u w:val="none"/>
-                      <w:strike w:val="false"/>
-                      <w:sz w:val="22"/>
-                      <w:szCs w:val="22"/>
-                      <w:color w:val="000000"/>
-                    </w:rPr>
                   </w:pPr>
                   <w:r xmlns:w="http://schemas.openxmlformats.org/wordprocessingml/2006/main" xmlns:wp="http://schemas.openxmlformats.org/drawingml/2006/wordprocessingDrawing" xmlns:r="http://schemas.openxmlformats.org/officeDocument/2006/relationships" xmlns:w14="http://schemas.microsoft.com/office/word/2010/wordml">
                     <w:rPr>
@@ -6153,20 +6985,20 @@
                       <w:i w:val="false"/>
                       <w:b w:val="false"/>
                       <w:u w:val="none"/>
-                      <w:strike w:val="false"/>
                       <w:sz w:val="22"/>
                       <w:szCs w:val="22"/>
                       <w:color w:val="000000"/>
                     </w:rPr>
-                    <w:t xml:space="preserve">-0.246</w:t>
+                    <w:t xml:space="preserve">0.530</w:t>
                   </w:r>
                 </w:p>
               </w:tc>
             </w:tr>
             <w:tr>
               <w:trPr>
-                <w:trHeight w:val="616" w:hRule="auto"/>
+                <w:trHeight w:val="573" w:hRule="auto"/>
               </w:trPr>
+              body2
               <w:tc>
                 <w:tcPr>
                   <w:tcBorders>
@@ -6186,6 +7018,7 @@
                 </w:tcPr>
                 <w:p>
                   <w:pPr>
+                    <w:pStyle w:val="Normal"/>
                     <w:jc w:val="left"/>
                     <w:pBdr>
                       <w:bottom w:val="none" w:sz="0" w:space="0" w:color="000000"/>
@@ -6195,16 +7028,6 @@
                     </w:pBdr>
                     <w:spacing w:after="100" w:before="100" w:line="240"/>
                     <w:ind w:left="100" w:right="100" w:firstLine="0" w:firstLineChars="0"/>
-                    <w:rPr>
-                      <w:rFonts w:ascii="Helvetica" w:hAnsi="Helvetica" w:eastAsia="Helvetica" w:cs="Helvetica"/>
-                      <w:i w:val="false"/>
-                      <w:b w:val="false"/>
-                      <w:u w:val="none"/>
-                      <w:strike w:val="false"/>
-                      <w:sz w:val="22"/>
-                      <w:szCs w:val="22"/>
-                      <w:color w:val="000000"/>
-                    </w:rPr>
                   </w:pPr>
                   <w:r xmlns:w="http://schemas.openxmlformats.org/wordprocessingml/2006/main" xmlns:wp="http://schemas.openxmlformats.org/drawingml/2006/wordprocessingDrawing" xmlns:r="http://schemas.openxmlformats.org/officeDocument/2006/relationships" xmlns:w14="http://schemas.microsoft.com/office/word/2010/wordml">
                     <w:rPr>
@@ -6212,12 +7035,11 @@
                       <w:i w:val="false"/>
                       <w:b w:val="false"/>
                       <w:u w:val="none"/>
-                      <w:strike w:val="false"/>
                       <w:sz w:val="22"/>
                       <w:szCs w:val="22"/>
                       <w:color w:val="000000"/>
                     </w:rPr>
-                    <w:t xml:space="preserve">Mean (Brood 1)</w:t>
+                    <w:t xml:space="preserve">Brood 2 − Brood 1</w:t>
                   </w:r>
                 </w:p>
               </w:tc>
@@ -6240,6 +7062,7 @@
                 </w:tcPr>
                 <w:p>
                   <w:pPr>
+                    <w:pStyle w:val="Normal"/>
                     <w:jc w:val="right"/>
                     <w:pBdr>
                       <w:bottom w:val="none" w:sz="0" w:space="0" w:color="000000"/>
@@ -6249,16 +7072,6 @@
                     </w:pBdr>
                     <w:spacing w:after="100" w:before="100" w:line="240"/>
                     <w:ind w:left="100" w:right="100" w:firstLine="0" w:firstLineChars="0"/>
-                    <w:rPr>
-                      <w:rFonts w:ascii="Helvetica" w:hAnsi="Helvetica" w:eastAsia="Helvetica" w:cs="Helvetica"/>
-                      <w:i w:val="false"/>
-                      <w:b w:val="false"/>
-                      <w:u w:val="none"/>
-                      <w:strike w:val="false"/>
-                      <w:sz w:val="22"/>
-                      <w:szCs w:val="22"/>
-                      <w:color w:val="000000"/>
-                    </w:rPr>
                   </w:pPr>
                   <w:r xmlns:w="http://schemas.openxmlformats.org/wordprocessingml/2006/main" xmlns:wp="http://schemas.openxmlformats.org/drawingml/2006/wordprocessingDrawing" xmlns:r="http://schemas.openxmlformats.org/officeDocument/2006/relationships" xmlns:w14="http://schemas.microsoft.com/office/word/2010/wordml">
                     <w:rPr>
@@ -6266,12 +7079,11 @@
                       <w:i w:val="false"/>
                       <w:b w:val="false"/>
                       <w:u w:val="none"/>
-                      <w:strike w:val="false"/>
                       <w:sz w:val="22"/>
                       <w:szCs w:val="22"/>
                       <w:color w:val="000000"/>
                     </w:rPr>
-                    <w:t xml:space="preserve">0.283</w:t>
+                    <w:t xml:space="preserve">-0.535</w:t>
                   </w:r>
                 </w:p>
               </w:tc>
@@ -6294,6 +7106,7 @@
                 </w:tcPr>
                 <w:p>
                   <w:pPr>
+                    <w:pStyle w:val="Normal"/>
                     <w:jc w:val="right"/>
                     <w:pBdr>
                       <w:bottom w:val="none" w:sz="0" w:space="0" w:color="000000"/>
@@ -6303,16 +7116,6 @@
                     </w:pBdr>
                     <w:spacing w:after="100" w:before="100" w:line="240"/>
                     <w:ind w:left="100" w:right="100" w:firstLine="0" w:firstLineChars="0"/>
-                    <w:rPr>
-                      <w:rFonts w:ascii="Helvetica" w:hAnsi="Helvetica" w:eastAsia="Helvetica" w:cs="Helvetica"/>
-                      <w:i w:val="false"/>
-                      <w:b w:val="false"/>
-                      <w:u w:val="none"/>
-                      <w:strike w:val="false"/>
-                      <w:sz w:val="22"/>
-                      <w:szCs w:val="22"/>
-                      <w:color w:val="000000"/>
-                    </w:rPr>
                   </w:pPr>
                   <w:r xmlns:w="http://schemas.openxmlformats.org/wordprocessingml/2006/main" xmlns:wp="http://schemas.openxmlformats.org/drawingml/2006/wordprocessingDrawing" xmlns:r="http://schemas.openxmlformats.org/officeDocument/2006/relationships" xmlns:w14="http://schemas.microsoft.com/office/word/2010/wordml">
                     <w:rPr>
@@ -6320,12 +7123,11 @@
                       <w:i w:val="false"/>
                       <w:b w:val="false"/>
                       <w:u w:val="none"/>
-                      <w:strike w:val="false"/>
                       <w:sz w:val="22"/>
                       <w:szCs w:val="22"/>
                       <w:color w:val="000000"/>
                     </w:rPr>
-                    <w:t xml:space="preserve">0.050</w:t>
+                    <w:t xml:space="preserve">-0.827</w:t>
                   </w:r>
                 </w:p>
               </w:tc>
@@ -6348,6 +7150,7 @@
                 </w:tcPr>
                 <w:p>
                   <w:pPr>
+                    <w:pStyle w:val="Normal"/>
                     <w:jc w:val="right"/>
                     <w:pBdr>
                       <w:bottom w:val="none" w:sz="0" w:space="0" w:color="000000"/>
@@ -6357,16 +7160,6 @@
                     </w:pBdr>
                     <w:spacing w:after="100" w:before="100" w:line="240"/>
                     <w:ind w:left="100" w:right="100" w:firstLine="0" w:firstLineChars="0"/>
-                    <w:rPr>
-                      <w:rFonts w:ascii="Helvetica" w:hAnsi="Helvetica" w:eastAsia="Helvetica" w:cs="Helvetica"/>
-                      <w:i w:val="false"/>
-                      <w:b w:val="false"/>
-                      <w:u w:val="none"/>
-                      <w:strike w:val="false"/>
-                      <w:sz w:val="22"/>
-                      <w:szCs w:val="22"/>
-                      <w:color w:val="000000"/>
-                    </w:rPr>
                   </w:pPr>
                   <w:r xmlns:w="http://schemas.openxmlformats.org/wordprocessingml/2006/main" xmlns:wp="http://schemas.openxmlformats.org/drawingml/2006/wordprocessingDrawing" xmlns:r="http://schemas.openxmlformats.org/officeDocument/2006/relationships" xmlns:w14="http://schemas.microsoft.com/office/word/2010/wordml">
                     <w:rPr>
@@ -6374,12 +7167,11 @@
                       <w:i w:val="false"/>
                       <w:b w:val="false"/>
                       <w:u w:val="none"/>
-                      <w:strike w:val="false"/>
                       <w:sz w:val="22"/>
                       <w:szCs w:val="22"/>
                       <w:color w:val="000000"/>
                     </w:rPr>
-                    <w:t xml:space="preserve">0.530</w:t>
+                    <w:t xml:space="preserve">-0.246</w:t>
                   </w:r>
                 </w:p>
               </w:tc>
@@ -6388,6 +7180,7 @@
               <w:trPr>
                 <w:trHeight w:val="618" w:hRule="auto"/>
               </w:trPr>
+              body3
               <w:tc>
                 <w:tcPr>
                   <w:tcBorders>
@@ -6407,6 +7200,7 @@
                 </w:tcPr>
                 <w:p>
                   <w:pPr>
+                    <w:pStyle w:val="Normal"/>
                     <w:jc w:val="left"/>
                     <w:pBdr>
                       <w:bottom w:val="none" w:sz="0" w:space="0" w:color="000000"/>
@@ -6416,16 +7210,6 @@
                     </w:pBdr>
                     <w:spacing w:after="100" w:before="100" w:line="240"/>
                     <w:ind w:left="100" w:right="100" w:firstLine="0" w:firstLineChars="0"/>
-                    <w:rPr>
-                      <w:rFonts w:ascii="Helvetica" w:hAnsi="Helvetica" w:eastAsia="Helvetica" w:cs="Helvetica"/>
-                      <w:i w:val="false"/>
-                      <w:b w:val="false"/>
-                      <w:u w:val="none"/>
-                      <w:strike w:val="false"/>
-                      <w:sz w:val="22"/>
-                      <w:szCs w:val="22"/>
-                      <w:color w:val="000000"/>
-                    </w:rPr>
                   </w:pPr>
                   <w:r xmlns:w="http://schemas.openxmlformats.org/wordprocessingml/2006/main" xmlns:wp="http://schemas.openxmlformats.org/drawingml/2006/wordprocessingDrawing" xmlns:r="http://schemas.openxmlformats.org/officeDocument/2006/relationships" xmlns:w14="http://schemas.microsoft.com/office/word/2010/wordml">
                     <w:rPr>
@@ -6433,7 +7217,6 @@
                       <w:i w:val="false"/>
                       <w:b w:val="false"/>
                       <w:u w:val="none"/>
-                      <w:strike w:val="false"/>
                       <w:sz w:val="22"/>
                       <w:szCs w:val="22"/>
                       <w:color w:val="000000"/>
@@ -6461,6 +7244,7 @@
                 </w:tcPr>
                 <w:p>
                   <w:pPr>
+                    <w:pStyle w:val="Normal"/>
                     <w:jc w:val="right"/>
                     <w:pBdr>
                       <w:bottom w:val="none" w:sz="0" w:space="0" w:color="000000"/>
@@ -6470,16 +7254,6 @@
                     </w:pBdr>
                     <w:spacing w:after="100" w:before="100" w:line="240"/>
                     <w:ind w:left="100" w:right="100" w:firstLine="0" w:firstLineChars="0"/>
-                    <w:rPr>
-                      <w:rFonts w:ascii="Helvetica" w:hAnsi="Helvetica" w:eastAsia="Helvetica" w:cs="Helvetica"/>
-                      <w:i w:val="false"/>
-                      <w:b w:val="false"/>
-                      <w:u w:val="none"/>
-                      <w:strike w:val="false"/>
-                      <w:sz w:val="22"/>
-                      <w:szCs w:val="22"/>
-                      <w:color w:val="000000"/>
-                    </w:rPr>
                   </w:pPr>
                   <w:r xmlns:w="http://schemas.openxmlformats.org/wordprocessingml/2006/main" xmlns:wp="http://schemas.openxmlformats.org/drawingml/2006/wordprocessingDrawing" xmlns:r="http://schemas.openxmlformats.org/officeDocument/2006/relationships" xmlns:w14="http://schemas.microsoft.com/office/word/2010/wordml">
                     <w:rPr>
@@ -6487,7 +7261,6 @@
                       <w:i w:val="false"/>
                       <w:b w:val="false"/>
                       <w:u w:val="none"/>
-                      <w:strike w:val="false"/>
                       <w:sz w:val="22"/>
                       <w:szCs w:val="22"/>
                       <w:color w:val="000000"/>
@@ -6515,6 +7288,7 @@
                 </w:tcPr>
                 <w:p>
                   <w:pPr>
+                    <w:pStyle w:val="Normal"/>
                     <w:jc w:val="right"/>
                     <w:pBdr>
                       <w:bottom w:val="none" w:sz="0" w:space="0" w:color="000000"/>
@@ -6524,16 +7298,6 @@
                     </w:pBdr>
                     <w:spacing w:after="100" w:before="100" w:line="240"/>
                     <w:ind w:left="100" w:right="100" w:firstLine="0" w:firstLineChars="0"/>
-                    <w:rPr>
-                      <w:rFonts w:ascii="Helvetica" w:hAnsi="Helvetica" w:eastAsia="Helvetica" w:cs="Helvetica"/>
-                      <w:i w:val="false"/>
-                      <w:b w:val="false"/>
-                      <w:u w:val="none"/>
-                      <w:strike w:val="false"/>
-                      <w:sz w:val="22"/>
-                      <w:szCs w:val="22"/>
-                      <w:color w:val="000000"/>
-                    </w:rPr>
                   </w:pPr>
                   <w:r xmlns:w="http://schemas.openxmlformats.org/wordprocessingml/2006/main" xmlns:wp="http://schemas.openxmlformats.org/drawingml/2006/wordprocessingDrawing" xmlns:r="http://schemas.openxmlformats.org/officeDocument/2006/relationships" xmlns:w14="http://schemas.microsoft.com/office/word/2010/wordml">
                     <w:rPr>
@@ -6541,7 +7305,6 @@
                       <w:i w:val="false"/>
                       <w:b w:val="false"/>
                       <w:u w:val="none"/>
-                      <w:strike w:val="false"/>
                       <w:sz w:val="22"/>
                       <w:szCs w:val="22"/>
                       <w:color w:val="000000"/>
@@ -6569,6 +7332,7 @@
                 </w:tcPr>
                 <w:p>
                   <w:pPr>
+                    <w:pStyle w:val="Normal"/>
                     <w:jc w:val="right"/>
                     <w:pBdr>
                       <w:bottom w:val="none" w:sz="0" w:space="0" w:color="000000"/>
@@ -6578,16 +7342,6 @@
                     </w:pBdr>
                     <w:spacing w:after="100" w:before="100" w:line="240"/>
                     <w:ind w:left="100" w:right="100" w:firstLine="0" w:firstLineChars="0"/>
-                    <w:rPr>
-                      <w:rFonts w:ascii="Helvetica" w:hAnsi="Helvetica" w:eastAsia="Helvetica" w:cs="Helvetica"/>
-                      <w:i w:val="false"/>
-                      <w:b w:val="false"/>
-                      <w:u w:val="none"/>
-                      <w:strike w:val="false"/>
-                      <w:sz w:val="22"/>
-                      <w:szCs w:val="22"/>
-                      <w:color w:val="000000"/>
-                    </w:rPr>
                   </w:pPr>
                   <w:r xmlns:w="http://schemas.openxmlformats.org/wordprocessingml/2006/main" xmlns:wp="http://schemas.openxmlformats.org/drawingml/2006/wordprocessingDrawing" xmlns:r="http://schemas.openxmlformats.org/officeDocument/2006/relationships" xmlns:w14="http://schemas.microsoft.com/office/word/2010/wordml">
                     <w:rPr>
@@ -6595,7 +7349,6 @@
                       <w:i w:val="false"/>
                       <w:b w:val="false"/>
                       <w:u w:val="none"/>
-                      <w:strike w:val="false"/>
                       <w:sz w:val="22"/>
                       <w:szCs w:val="22"/>
                       <w:color w:val="000000"/>
@@ -6609,6 +7362,7 @@
               <w:trPr>
                 <w:trHeight w:val="618" w:hRule="auto"/>
               </w:trPr>
+              body4
               <w:tc>
                 <w:tcPr>
                   <w:tcBorders>
@@ -6628,6 +7382,7 @@
                 </w:tcPr>
                 <w:p>
                   <w:pPr>
+                    <w:pStyle w:val="Normal"/>
                     <w:jc w:val="left"/>
                     <w:pBdr>
                       <w:bottom w:val="none" w:sz="0" w:space="0" w:color="000000"/>
@@ -6637,16 +7392,6 @@
                     </w:pBdr>
                     <w:spacing w:after="100" w:before="100" w:line="240"/>
                     <w:ind w:left="100" w:right="100" w:firstLine="0" w:firstLineChars="0"/>
-                    <w:rPr>
-                      <w:rFonts w:ascii="Helvetica" w:hAnsi="Helvetica" w:eastAsia="Helvetica" w:cs="Helvetica"/>
-                      <w:i w:val="false"/>
-                      <w:b w:val="false"/>
-                      <w:u w:val="none"/>
-                      <w:strike w:val="false"/>
-                      <w:sz w:val="22"/>
-                      <w:szCs w:val="22"/>
-                      <w:color w:val="000000"/>
-                    </w:rPr>
                   </w:pPr>
                   <w:r xmlns:w="http://schemas.openxmlformats.org/wordprocessingml/2006/main" xmlns:wp="http://schemas.openxmlformats.org/drawingml/2006/wordprocessingDrawing" xmlns:r="http://schemas.openxmlformats.org/officeDocument/2006/relationships" xmlns:w14="http://schemas.microsoft.com/office/word/2010/wordml">
                     <w:rPr>
@@ -6654,7 +7399,6 @@
                       <w:i w:val="false"/>
                       <w:b w:val="false"/>
                       <w:u w:val="none"/>
-                      <w:strike w:val="false"/>
                       <w:sz w:val="22"/>
                       <w:szCs w:val="22"/>
                       <w:color w:val="000000"/>
@@ -6682,6 +7426,7 @@
                 </w:tcPr>
                 <w:p>
                   <w:pPr>
+                    <w:pStyle w:val="Normal"/>
                     <w:jc w:val="right"/>
                     <w:pBdr>
                       <w:bottom w:val="none" w:sz="0" w:space="0" w:color="000000"/>
@@ -6691,16 +7436,6 @@
                     </w:pBdr>
                     <w:spacing w:after="100" w:before="100" w:line="240"/>
                     <w:ind w:left="100" w:right="100" w:firstLine="0" w:firstLineChars="0"/>
-                    <w:rPr>
-                      <w:rFonts w:ascii="Helvetica" w:hAnsi="Helvetica" w:eastAsia="Helvetica" w:cs="Helvetica"/>
-                      <w:i w:val="false"/>
-                      <w:b w:val="false"/>
-                      <w:u w:val="none"/>
-                      <w:strike w:val="false"/>
-                      <w:sz w:val="22"/>
-                      <w:szCs w:val="22"/>
-                      <w:color w:val="000000"/>
-                    </w:rPr>
                   </w:pPr>
                   <w:r xmlns:w="http://schemas.openxmlformats.org/wordprocessingml/2006/main" xmlns:wp="http://schemas.openxmlformats.org/drawingml/2006/wordprocessingDrawing" xmlns:r="http://schemas.openxmlformats.org/officeDocument/2006/relationships" xmlns:w14="http://schemas.microsoft.com/office/word/2010/wordml">
                     <w:rPr>
@@ -6708,7 +7443,6 @@
                       <w:i w:val="false"/>
                       <w:b w:val="false"/>
                       <w:u w:val="none"/>
-                      <w:strike w:val="false"/>
                       <w:sz w:val="22"/>
                       <w:szCs w:val="22"/>
                       <w:color w:val="000000"/>
@@ -6736,6 +7470,7 @@
                 </w:tcPr>
                 <w:p>
                   <w:pPr>
+                    <w:pStyle w:val="Normal"/>
                     <w:jc w:val="right"/>
                     <w:pBdr>
                       <w:bottom w:val="none" w:sz="0" w:space="0" w:color="000000"/>
@@ -6745,16 +7480,6 @@
                     </w:pBdr>
                     <w:spacing w:after="100" w:before="100" w:line="240"/>
                     <w:ind w:left="100" w:right="100" w:firstLine="0" w:firstLineChars="0"/>
-                    <w:rPr>
-                      <w:rFonts w:ascii="Helvetica" w:hAnsi="Helvetica" w:eastAsia="Helvetica" w:cs="Helvetica"/>
-                      <w:i w:val="false"/>
-                      <w:b w:val="false"/>
-                      <w:u w:val="none"/>
-                      <w:strike w:val="false"/>
-                      <w:sz w:val="22"/>
-                      <w:szCs w:val="22"/>
-                      <w:color w:val="000000"/>
-                    </w:rPr>
                   </w:pPr>
                   <w:r xmlns:w="http://schemas.openxmlformats.org/wordprocessingml/2006/main" xmlns:wp="http://schemas.openxmlformats.org/drawingml/2006/wordprocessingDrawing" xmlns:r="http://schemas.openxmlformats.org/officeDocument/2006/relationships" xmlns:w14="http://schemas.microsoft.com/office/word/2010/wordml">
                     <w:rPr>
@@ -6762,7 +7487,6 @@
                       <w:i w:val="false"/>
                       <w:b w:val="false"/>
                       <w:u w:val="none"/>
-                      <w:strike w:val="false"/>
                       <w:sz w:val="22"/>
                       <w:szCs w:val="22"/>
                       <w:color w:val="000000"/>
@@ -6790,6 +7514,7 @@
                 </w:tcPr>
                 <w:p>
                   <w:pPr>
+                    <w:pStyle w:val="Normal"/>
                     <w:jc w:val="right"/>
                     <w:pBdr>
                       <w:bottom w:val="none" w:sz="0" w:space="0" w:color="000000"/>
@@ -6799,16 +7524,6 @@
                     </w:pBdr>
                     <w:spacing w:after="100" w:before="100" w:line="240"/>
                     <w:ind w:left="100" w:right="100" w:firstLine="0" w:firstLineChars="0"/>
-                    <w:rPr>
-                      <w:rFonts w:ascii="Helvetica" w:hAnsi="Helvetica" w:eastAsia="Helvetica" w:cs="Helvetica"/>
-                      <w:i w:val="false"/>
-                      <w:b w:val="false"/>
-                      <w:u w:val="none"/>
-                      <w:strike w:val="false"/>
-                      <w:sz w:val="22"/>
-                      <w:szCs w:val="22"/>
-                      <w:color w:val="000000"/>
-                    </w:rPr>
                   </w:pPr>
                   <w:r xmlns:w="http://schemas.openxmlformats.org/wordprocessingml/2006/main" xmlns:wp="http://schemas.openxmlformats.org/drawingml/2006/wordprocessingDrawing" xmlns:r="http://schemas.openxmlformats.org/officeDocument/2006/relationships" xmlns:w14="http://schemas.microsoft.com/office/word/2010/wordml">
                     <w:rPr>
@@ -6816,7 +7531,6 @@
                       <w:i w:val="false"/>
                       <w:b w:val="false"/>
                       <w:u w:val="none"/>
-                      <w:strike w:val="false"/>
                       <w:sz w:val="22"/>
                       <w:szCs w:val="22"/>
                       <w:color w:val="000000"/>
@@ -6830,6 +7544,7 @@
               <w:trPr>
                 <w:trHeight w:val="618" w:hRule="auto"/>
               </w:trPr>
+              body5
               <w:tc>
                 <w:tcPr>
                   <w:tcBorders>
@@ -6849,6 +7564,7 @@
                 </w:tcPr>
                 <w:p>
                   <w:pPr>
+                    <w:pStyle w:val="Normal"/>
                     <w:jc w:val="left"/>
                     <w:pBdr>
                       <w:bottom w:val="none" w:sz="0" w:space="0" w:color="000000"/>
@@ -6858,16 +7574,6 @@
                     </w:pBdr>
                     <w:spacing w:after="100" w:before="100" w:line="240"/>
                     <w:ind w:left="100" w:right="100" w:firstLine="0" w:firstLineChars="0"/>
-                    <w:rPr>
-                      <w:rFonts w:ascii="Helvetica" w:hAnsi="Helvetica" w:eastAsia="Helvetica" w:cs="Helvetica"/>
-                      <w:i w:val="false"/>
-                      <w:b w:val="false"/>
-                      <w:u w:val="none"/>
-                      <w:strike w:val="false"/>
-                      <w:sz w:val="22"/>
-                      <w:szCs w:val="22"/>
-                      <w:color w:val="000000"/>
-                    </w:rPr>
                   </w:pPr>
                   <w:r xmlns:w="http://schemas.openxmlformats.org/wordprocessingml/2006/main" xmlns:wp="http://schemas.openxmlformats.org/drawingml/2006/wordprocessingDrawing" xmlns:r="http://schemas.openxmlformats.org/officeDocument/2006/relationships" xmlns:w14="http://schemas.microsoft.com/office/word/2010/wordml">
                     <w:rPr>
@@ -6875,7 +7581,6 @@
                       <w:i w:val="false"/>
                       <w:b w:val="false"/>
                       <w:u w:val="none"/>
-                      <w:strike w:val="false"/>
                       <w:sz w:val="22"/>
                       <w:szCs w:val="22"/>
                       <w:color w:val="000000"/>
@@ -6903,6 +7608,7 @@
                 </w:tcPr>
                 <w:p>
                   <w:pPr>
+                    <w:pStyle w:val="Normal"/>
                     <w:jc w:val="right"/>
                     <w:pBdr>
                       <w:bottom w:val="none" w:sz="0" w:space="0" w:color="000000"/>
@@ -6912,16 +7618,6 @@
                     </w:pBdr>
                     <w:spacing w:after="100" w:before="100" w:line="240"/>
                     <w:ind w:left="100" w:right="100" w:firstLine="0" w:firstLineChars="0"/>
-                    <w:rPr>
-                      <w:rFonts w:ascii="Helvetica" w:hAnsi="Helvetica" w:eastAsia="Helvetica" w:cs="Helvetica"/>
-                      <w:i w:val="false"/>
-                      <w:b w:val="false"/>
-                      <w:u w:val="none"/>
-                      <w:strike w:val="false"/>
-                      <w:sz w:val="22"/>
-                      <w:szCs w:val="22"/>
-                      <w:color w:val="000000"/>
-                    </w:rPr>
                   </w:pPr>
                   <w:r xmlns:w="http://schemas.openxmlformats.org/wordprocessingml/2006/main" xmlns:wp="http://schemas.openxmlformats.org/drawingml/2006/wordprocessingDrawing" xmlns:r="http://schemas.openxmlformats.org/officeDocument/2006/relationships" xmlns:w14="http://schemas.microsoft.com/office/word/2010/wordml">
                     <w:rPr>
@@ -6929,7 +7625,6 @@
                       <w:i w:val="false"/>
                       <w:b w:val="false"/>
                       <w:u w:val="none"/>
-                      <w:strike w:val="false"/>
                       <w:sz w:val="22"/>
                       <w:szCs w:val="22"/>
                       <w:color w:val="000000"/>
@@ -6957,6 +7652,7 @@
                 </w:tcPr>
                 <w:p>
                   <w:pPr>
+                    <w:pStyle w:val="Normal"/>
                     <w:jc w:val="right"/>
                     <w:pBdr>
                       <w:bottom w:val="none" w:sz="0" w:space="0" w:color="000000"/>
@@ -6966,16 +7662,6 @@
                     </w:pBdr>
                     <w:spacing w:after="100" w:before="100" w:line="240"/>
                     <w:ind w:left="100" w:right="100" w:firstLine="0" w:firstLineChars="0"/>
-                    <w:rPr>
-                      <w:rFonts w:ascii="Helvetica" w:hAnsi="Helvetica" w:eastAsia="Helvetica" w:cs="Helvetica"/>
-                      <w:i w:val="false"/>
-                      <w:b w:val="false"/>
-                      <w:u w:val="none"/>
-                      <w:strike w:val="false"/>
-                      <w:sz w:val="22"/>
-                      <w:szCs w:val="22"/>
-                      <w:color w:val="000000"/>
-                    </w:rPr>
                   </w:pPr>
                   <w:r xmlns:w="http://schemas.openxmlformats.org/wordprocessingml/2006/main" xmlns:wp="http://schemas.openxmlformats.org/drawingml/2006/wordprocessingDrawing" xmlns:r="http://schemas.openxmlformats.org/officeDocument/2006/relationships" xmlns:w14="http://schemas.microsoft.com/office/word/2010/wordml">
                     <w:rPr>
@@ -6983,7 +7669,6 @@
                       <w:i w:val="false"/>
                       <w:b w:val="false"/>
                       <w:u w:val="none"/>
-                      <w:strike w:val="false"/>
                       <w:sz w:val="22"/>
                       <w:szCs w:val="22"/>
                       <w:color w:val="000000"/>
@@ -7011,6 +7696,7 @@
                 </w:tcPr>
                 <w:p>
                   <w:pPr>
+                    <w:pStyle w:val="Normal"/>
                     <w:jc w:val="right"/>
                     <w:pBdr>
                       <w:bottom w:val="none" w:sz="0" w:space="0" w:color="000000"/>
@@ -7020,16 +7706,6 @@
                     </w:pBdr>
                     <w:spacing w:after="100" w:before="100" w:line="240"/>
                     <w:ind w:left="100" w:right="100" w:firstLine="0" w:firstLineChars="0"/>
-                    <w:rPr>
-                      <w:rFonts w:ascii="Helvetica" w:hAnsi="Helvetica" w:eastAsia="Helvetica" w:cs="Helvetica"/>
-                      <w:i w:val="false"/>
-                      <w:b w:val="false"/>
-                      <w:u w:val="none"/>
-                      <w:strike w:val="false"/>
-                      <w:sz w:val="22"/>
-                      <w:szCs w:val="22"/>
-                      <w:color w:val="000000"/>
-                    </w:rPr>
                   </w:pPr>
                   <w:r xmlns:w="http://schemas.openxmlformats.org/wordprocessingml/2006/main" xmlns:wp="http://schemas.openxmlformats.org/drawingml/2006/wordprocessingDrawing" xmlns:r="http://schemas.openxmlformats.org/officeDocument/2006/relationships" xmlns:w14="http://schemas.microsoft.com/office/word/2010/wordml">
                     <w:rPr>
@@ -7037,7 +7713,6 @@
                       <w:i w:val="false"/>
                       <w:b w:val="false"/>
                       <w:u w:val="none"/>
-                      <w:strike w:val="false"/>
                       <w:sz w:val="22"/>
                       <w:szCs w:val="22"/>
                       <w:color w:val="000000"/>
@@ -7051,6 +7726,7 @@
               <w:trPr>
                 <w:trHeight w:val="618" w:hRule="auto"/>
               </w:trPr>
+              body6
               <w:tc>
                 <w:tcPr>
                   <w:tcBorders>
@@ -7070,6 +7746,7 @@
                 </w:tcPr>
                 <w:p>
                   <w:pPr>
+                    <w:pStyle w:val="Normal"/>
                     <w:jc w:val="left"/>
                     <w:pBdr>
                       <w:bottom w:val="none" w:sz="0" w:space="0" w:color="000000"/>
@@ -7079,16 +7756,6 @@
                     </w:pBdr>
                     <w:spacing w:after="100" w:before="100" w:line="240"/>
                     <w:ind w:left="100" w:right="100" w:firstLine="0" w:firstLineChars="0"/>
-                    <w:rPr>
-                      <w:rFonts w:ascii="Helvetica" w:hAnsi="Helvetica" w:eastAsia="Helvetica" w:cs="Helvetica"/>
-                      <w:i w:val="false"/>
-                      <w:b w:val="false"/>
-                      <w:u w:val="none"/>
-                      <w:strike w:val="false"/>
-                      <w:sz w:val="22"/>
-                      <w:szCs w:val="22"/>
-                      <w:color w:val="000000"/>
-                    </w:rPr>
                   </w:pPr>
                   <w:r xmlns:w="http://schemas.openxmlformats.org/wordprocessingml/2006/main" xmlns:wp="http://schemas.openxmlformats.org/drawingml/2006/wordprocessingDrawing" xmlns:r="http://schemas.openxmlformats.org/officeDocument/2006/relationships" xmlns:w14="http://schemas.microsoft.com/office/word/2010/wordml">
                     <w:rPr>
@@ -7096,7 +7763,6 @@
                       <w:i w:val="false"/>
                       <w:b w:val="false"/>
                       <w:u w:val="none"/>
-                      <w:strike w:val="false"/>
                       <w:sz w:val="22"/>
                       <w:szCs w:val="22"/>
                       <w:color w:val="000000"/>
@@ -7124,6 +7790,7 @@
                 </w:tcPr>
                 <w:p>
                   <w:pPr>
+                    <w:pStyle w:val="Normal"/>
                     <w:jc w:val="right"/>
                     <w:pBdr>
                       <w:bottom w:val="none" w:sz="0" w:space="0" w:color="000000"/>
@@ -7133,16 +7800,6 @@
                     </w:pBdr>
                     <w:spacing w:after="100" w:before="100" w:line="240"/>
                     <w:ind w:left="100" w:right="100" w:firstLine="0" w:firstLineChars="0"/>
-                    <w:rPr>
-                      <w:rFonts w:ascii="Helvetica" w:hAnsi="Helvetica" w:eastAsia="Helvetica" w:cs="Helvetica"/>
-                      <w:i w:val="false"/>
-                      <w:b w:val="false"/>
-                      <w:u w:val="none"/>
-                      <w:strike w:val="false"/>
-                      <w:sz w:val="22"/>
-                      <w:szCs w:val="22"/>
-                      <w:color w:val="000000"/>
-                    </w:rPr>
                   </w:pPr>
                   <w:r xmlns:w="http://schemas.openxmlformats.org/wordprocessingml/2006/main" xmlns:wp="http://schemas.openxmlformats.org/drawingml/2006/wordprocessingDrawing" xmlns:r="http://schemas.openxmlformats.org/officeDocument/2006/relationships" xmlns:w14="http://schemas.microsoft.com/office/word/2010/wordml">
                     <w:rPr>
@@ -7150,7 +7807,6 @@
                       <w:i w:val="false"/>
                       <w:b w:val="false"/>
                       <w:u w:val="none"/>
-                      <w:strike w:val="false"/>
                       <w:sz w:val="22"/>
                       <w:szCs w:val="22"/>
                       <w:color w:val="000000"/>
@@ -7178,6 +7834,7 @@
                 </w:tcPr>
                 <w:p>
                   <w:pPr>
+                    <w:pStyle w:val="Normal"/>
                     <w:jc w:val="right"/>
                     <w:pBdr>
                       <w:bottom w:val="none" w:sz="0" w:space="0" w:color="000000"/>
@@ -7187,16 +7844,6 @@
                     </w:pBdr>
                     <w:spacing w:after="100" w:before="100" w:line="240"/>
                     <w:ind w:left="100" w:right="100" w:firstLine="0" w:firstLineChars="0"/>
-                    <w:rPr>
-                      <w:rFonts w:ascii="Helvetica" w:hAnsi="Helvetica" w:eastAsia="Helvetica" w:cs="Helvetica"/>
-                      <w:i w:val="false"/>
-                      <w:b w:val="false"/>
-                      <w:u w:val="none"/>
-                      <w:strike w:val="false"/>
-                      <w:sz w:val="22"/>
-                      <w:szCs w:val="22"/>
-                      <w:color w:val="000000"/>
-                    </w:rPr>
                   </w:pPr>
                   <w:r xmlns:w="http://schemas.openxmlformats.org/wordprocessingml/2006/main" xmlns:wp="http://schemas.openxmlformats.org/drawingml/2006/wordprocessingDrawing" xmlns:r="http://schemas.openxmlformats.org/officeDocument/2006/relationships" xmlns:w14="http://schemas.microsoft.com/office/word/2010/wordml">
                     <w:rPr>
@@ -7204,7 +7851,6 @@
                       <w:i w:val="false"/>
                       <w:b w:val="false"/>
                       <w:u w:val="none"/>
-                      <w:strike w:val="false"/>
                       <w:sz w:val="22"/>
                       <w:szCs w:val="22"/>
                       <w:color w:val="000000"/>
@@ -7232,6 +7878,7 @@
                 </w:tcPr>
                 <w:p>
                   <w:pPr>
+                    <w:pStyle w:val="Normal"/>
                     <w:jc w:val="right"/>
                     <w:pBdr>
                       <w:bottom w:val="none" w:sz="0" w:space="0" w:color="000000"/>
@@ -7241,16 +7888,6 @@
                     </w:pBdr>
                     <w:spacing w:after="100" w:before="100" w:line="240"/>
                     <w:ind w:left="100" w:right="100" w:firstLine="0" w:firstLineChars="0"/>
-                    <w:rPr>
-                      <w:rFonts w:ascii="Helvetica" w:hAnsi="Helvetica" w:eastAsia="Helvetica" w:cs="Helvetica"/>
-                      <w:i w:val="false"/>
-                      <w:b w:val="false"/>
-                      <w:u w:val="none"/>
-                      <w:strike w:val="false"/>
-                      <w:sz w:val="22"/>
-                      <w:szCs w:val="22"/>
-                      <w:color w:val="000000"/>
-                    </w:rPr>
                   </w:pPr>
                   <w:r xmlns:w="http://schemas.openxmlformats.org/wordprocessingml/2006/main" xmlns:wp="http://schemas.openxmlformats.org/drawingml/2006/wordprocessingDrawing" xmlns:r="http://schemas.openxmlformats.org/officeDocument/2006/relationships" xmlns:w14="http://schemas.microsoft.com/office/word/2010/wordml">
                     <w:rPr>
@@ -7258,7 +7895,6 @@
                       <w:i w:val="false"/>
                       <w:b w:val="false"/>
                       <w:u w:val="none"/>
-                      <w:strike w:val="false"/>
                       <w:sz w:val="22"/>
                       <w:szCs w:val="22"/>
                       <w:color w:val="000000"/>
@@ -7272,6 +7908,7 @@
               <w:trPr>
                 <w:trHeight w:val="618" w:hRule="auto"/>
               </w:trPr>
+              body7
               <w:tc>
                 <w:tcPr>
                   <w:tcBorders>
@@ -7291,6 +7928,7 @@
                 </w:tcPr>
                 <w:p>
                   <w:pPr>
+                    <w:pStyle w:val="Normal"/>
                     <w:jc w:val="left"/>
                     <w:pBdr>
                       <w:bottom w:val="none" w:sz="0" w:space="0" w:color="000000"/>
@@ -7300,16 +7938,6 @@
                     </w:pBdr>
                     <w:spacing w:after="100" w:before="100" w:line="240"/>
                     <w:ind w:left="100" w:right="100" w:firstLine="0" w:firstLineChars="0"/>
-                    <w:rPr>
-                      <w:rFonts w:ascii="Helvetica" w:hAnsi="Helvetica" w:eastAsia="Helvetica" w:cs="Helvetica"/>
-                      <w:i w:val="false"/>
-                      <w:b w:val="false"/>
-                      <w:u w:val="none"/>
-                      <w:strike w:val="false"/>
-                      <w:sz w:val="22"/>
-                      <w:szCs w:val="22"/>
-                      <w:color w:val="000000"/>
-                    </w:rPr>
                   </w:pPr>
                   <w:r xmlns:w="http://schemas.openxmlformats.org/wordprocessingml/2006/main" xmlns:wp="http://schemas.openxmlformats.org/drawingml/2006/wordprocessingDrawing" xmlns:r="http://schemas.openxmlformats.org/officeDocument/2006/relationships" xmlns:w14="http://schemas.microsoft.com/office/word/2010/wordml">
                     <w:rPr>
@@ -7317,7 +7945,6 @@
                       <w:i w:val="false"/>
                       <w:b w:val="false"/>
                       <w:u w:val="none"/>
-                      <w:strike w:val="false"/>
                       <w:sz w:val="22"/>
                       <w:szCs w:val="22"/>
                       <w:color w:val="000000"/>
@@ -7345,6 +7972,7 @@
                 </w:tcPr>
                 <w:p>
                   <w:pPr>
+                    <w:pStyle w:val="Normal"/>
                     <w:jc w:val="right"/>
                     <w:pBdr>
                       <w:bottom w:val="none" w:sz="0" w:space="0" w:color="000000"/>
@@ -7354,16 +7982,6 @@
                     </w:pBdr>
                     <w:spacing w:after="100" w:before="100" w:line="240"/>
                     <w:ind w:left="100" w:right="100" w:firstLine="0" w:firstLineChars="0"/>
-                    <w:rPr>
-                      <w:rFonts w:ascii="Helvetica" w:hAnsi="Helvetica" w:eastAsia="Helvetica" w:cs="Helvetica"/>
-                      <w:i w:val="false"/>
-                      <w:b w:val="false"/>
-                      <w:u w:val="none"/>
-                      <w:strike w:val="false"/>
-                      <w:sz w:val="22"/>
-                      <w:szCs w:val="22"/>
-                      <w:color w:val="000000"/>
-                    </w:rPr>
                   </w:pPr>
                   <w:r xmlns:w="http://schemas.openxmlformats.org/wordprocessingml/2006/main" xmlns:wp="http://schemas.openxmlformats.org/drawingml/2006/wordprocessingDrawing" xmlns:r="http://schemas.openxmlformats.org/officeDocument/2006/relationships" xmlns:w14="http://schemas.microsoft.com/office/word/2010/wordml">
                     <w:rPr>
@@ -7371,7 +7989,6 @@
                       <w:i w:val="false"/>
                       <w:b w:val="false"/>
                       <w:u w:val="none"/>
-                      <w:strike w:val="false"/>
                       <w:sz w:val="22"/>
                       <w:szCs w:val="22"/>
                       <w:color w:val="000000"/>
@@ -7399,6 +8016,7 @@
                 </w:tcPr>
                 <w:p>
                   <w:pPr>
+                    <w:pStyle w:val="Normal"/>
                     <w:jc w:val="right"/>
                     <w:pBdr>
                       <w:bottom w:val="none" w:sz="0" w:space="0" w:color="000000"/>
@@ -7408,16 +8026,6 @@
                     </w:pBdr>
                     <w:spacing w:after="100" w:before="100" w:line="240"/>
                     <w:ind w:left="100" w:right="100" w:firstLine="0" w:firstLineChars="0"/>
-                    <w:rPr>
-                      <w:rFonts w:ascii="Helvetica" w:hAnsi="Helvetica" w:eastAsia="Helvetica" w:cs="Helvetica"/>
-                      <w:i w:val="false"/>
-                      <w:b w:val="false"/>
-                      <w:u w:val="none"/>
-                      <w:strike w:val="false"/>
-                      <w:sz w:val="22"/>
-                      <w:szCs w:val="22"/>
-                      <w:color w:val="000000"/>
-                    </w:rPr>
                   </w:pPr>
                   <w:r xmlns:w="http://schemas.openxmlformats.org/wordprocessingml/2006/main" xmlns:wp="http://schemas.openxmlformats.org/drawingml/2006/wordprocessingDrawing" xmlns:r="http://schemas.openxmlformats.org/officeDocument/2006/relationships" xmlns:w14="http://schemas.microsoft.com/office/word/2010/wordml">
                     <w:rPr>
@@ -7425,7 +8033,6 @@
                       <w:i w:val="false"/>
                       <w:b w:val="false"/>
                       <w:u w:val="none"/>
-                      <w:strike w:val="false"/>
                       <w:sz w:val="22"/>
                       <w:szCs w:val="22"/>
                       <w:color w:val="000000"/>
@@ -7453,6 +8060,7 @@
                 </w:tcPr>
                 <w:p>
                   <w:pPr>
+                    <w:pStyle w:val="Normal"/>
                     <w:jc w:val="right"/>
                     <w:pBdr>
                       <w:bottom w:val="none" w:sz="0" w:space="0" w:color="000000"/>
@@ -7462,16 +8070,6 @@
                     </w:pBdr>
                     <w:spacing w:after="100" w:before="100" w:line="240"/>
                     <w:ind w:left="100" w:right="100" w:firstLine="0" w:firstLineChars="0"/>
-                    <w:rPr>
-                      <w:rFonts w:ascii="Helvetica" w:hAnsi="Helvetica" w:eastAsia="Helvetica" w:cs="Helvetica"/>
-                      <w:i w:val="false"/>
-                      <w:b w:val="false"/>
-                      <w:u w:val="none"/>
-                      <w:strike w:val="false"/>
-                      <w:sz w:val="22"/>
-                      <w:szCs w:val="22"/>
-                      <w:color w:val="000000"/>
-                    </w:rPr>
                   </w:pPr>
                   <w:r xmlns:w="http://schemas.openxmlformats.org/wordprocessingml/2006/main" xmlns:wp="http://schemas.openxmlformats.org/drawingml/2006/wordprocessingDrawing" xmlns:r="http://schemas.openxmlformats.org/officeDocument/2006/relationships" xmlns:w14="http://schemas.microsoft.com/office/word/2010/wordml">
                     <w:rPr>
@@ -7479,7 +8077,6 @@
                       <w:i w:val="false"/>
                       <w:b w:val="false"/>
                       <w:u w:val="none"/>
-                      <w:strike w:val="false"/>
                       <w:sz w:val="22"/>
                       <w:szCs w:val="22"/>
                       <w:color w:val="000000"/>
@@ -7490,7 +8087,7 @@
               </w:tc>
             </w:tr>
           </w:tbl>
-          <w:bookmarkEnd w:id="47"/>
+          <w:bookmarkEnd w:id="52"/>
         </w:tc>
       </w:tr>
     </w:tbl>
@@ -7499,9 +8096,9 @@
         <w:br w:type="page"/>
       </w:r>
     </w:p>
-    <w:bookmarkEnd w:id="48"/>
-    <w:bookmarkEnd w:id="49"/>
-    <w:bookmarkStart w:id="53" w:name="references"/>
+    <w:bookmarkEnd w:id="53"/>
+    <w:bookmarkEnd w:id="54"/>
+    <w:bookmarkStart w:id="58" w:name="references"/>
     <w:p>
       <w:pPr>
         <w:pStyle w:val="Heading1"/>
@@ -7510,8 +8107,8 @@
         <w:t xml:space="preserve">References</w:t>
       </w:r>
     </w:p>
-    <w:bookmarkStart w:id="52" w:name="refs"/>
-    <w:bookmarkStart w:id="50" w:name="ref-vandepol2009"/>
+    <w:bookmarkStart w:id="57" w:name="refs"/>
+    <w:bookmarkStart w:id="55" w:name="ref-vandepol2009"/>
     <w:p>
       <w:pPr>
         <w:pStyle w:val="Bibliography"/>
@@ -7520,8 +8117,8 @@
         <w:t xml:space="preserve">Pol, M. van de, and J. Wright. 2009. A simple method for distinguishing within- versus between-subject effects using mixed models. Anim Behav 77:753–758.</w:t>
       </w:r>
     </w:p>
-    <w:bookmarkEnd w:id="50"/>
-    <w:bookmarkStart w:id="51" w:name="ref-westneat2020"/>
+    <w:bookmarkEnd w:id="55"/>
+    <w:bookmarkStart w:id="56" w:name="ref-westneat2020"/>
     <w:p>
       <w:pPr>
         <w:pStyle w:val="Bibliography"/>
@@ -7530,9 +8127,9 @@
         <w:t xml:space="preserve">Westneat, D. F., Y. G. Araya-Ajoy, H. Allegue, B. Class, N. Dingemanse, N. A. Dochtermann, L. Z. Garamszegi, J. G. A. Martin, S. Nakagawa, D. Réale, and H. Schielzeth. 2020. Collision between biological process and statistical analysis revealed by mean centring. J Anim Ecol 89:2813–2824.</w:t>
       </w:r>
     </w:p>
-    <w:bookmarkEnd w:id="51"/>
-    <w:bookmarkEnd w:id="52"/>
-    <w:bookmarkEnd w:id="53"/>
+    <w:bookmarkEnd w:id="56"/>
+    <w:bookmarkEnd w:id="57"/>
+    <w:bookmarkEnd w:id="58"/>
     <w:sectPr>
       <w:headerReference r:id="rId10" w:type="even"/>
       <w:headerReference r:id="rId9" w:type="default"/>
@@ -8299,6 +8896,109 @@
       </w:pPr>
     </w:lvl>
   </w:abstractNum>
+  <w:abstractNum w:abstractNumId="991">
+    <w:nsid w:val="0000A991"/>
+    <w:multiLevelType w:val="multilevel"/>
+    <w:lvl w:ilvl="0">
+      <w:numFmt w:val="bullet"/>
+      <w:lvlText w:val=""/>
+      <w:lvlJc w:val="left"/>
+      <w:pPr>
+        <w:ind w:left="720" w:hanging="360"/>
+      </w:pPr>
+      <w:rPr>
+        <w:rFonts w:ascii="Symbol" w:hAnsi="Symbol" w:cs="Symbol" w:hint="default"/>
+      </w:rPr>
+    </w:lvl>
+    <w:lvl w:ilvl="1">
+      <w:numFmt w:val="bullet"/>
+      <w:lvlText w:val="o"/>
+      <w:lvlJc w:val="left"/>
+      <w:pPr>
+        <w:ind w:left="1440" w:hanging="360"/>
+      </w:pPr>
+      <w:rPr>
+        <w:rFonts w:ascii="Courier New" w:hAnsi="Courier New" w:cs="Courier New" w:hint="default"/>
+      </w:rPr>
+    </w:lvl>
+    <w:lvl w:ilvl="2">
+      <w:numFmt w:val="bullet"/>
+      <w:lvlText w:val=""/>
+      <w:lvlJc w:val="left"/>
+      <w:pPr>
+        <w:ind w:left="2160" w:hanging="360"/>
+      </w:pPr>
+      <w:rPr>
+        <w:rFonts w:ascii="Wingdings" w:hAnsi="Wingdings" w:cs="Wingdings" w:hint="default"/>
+      </w:rPr>
+    </w:lvl>
+    <w:lvl w:ilvl="3">
+      <w:numFmt w:val="bullet"/>
+      <w:lvlText w:val=""/>
+      <w:lvlJc w:val="left"/>
+      <w:pPr>
+        <w:ind w:left="2880" w:hanging="360"/>
+      </w:pPr>
+      <w:rPr>
+        <w:rFonts w:ascii="Symbol" w:hAnsi="Symbol" w:cs="Symbol" w:hint="default"/>
+      </w:rPr>
+    </w:lvl>
+    <w:lvl w:ilvl="4">
+      <w:numFmt w:val="bullet"/>
+      <w:lvlText w:val="o"/>
+      <w:lvlJc w:val="left"/>
+      <w:pPr>
+        <w:ind w:left="3600" w:hanging="360"/>
+      </w:pPr>
+      <w:rPr>
+        <w:rFonts w:ascii="Courier New" w:hAnsi="Courier New" w:cs="Courier New" w:hint="default"/>
+      </w:rPr>
+    </w:lvl>
+    <w:lvl w:ilvl="5">
+      <w:numFmt w:val="bullet"/>
+      <w:lvlText w:val=""/>
+      <w:lvlJc w:val="left"/>
+      <w:pPr>
+        <w:ind w:left="4320" w:hanging="360"/>
+      </w:pPr>
+      <w:rPr>
+        <w:rFonts w:ascii="Wingdings" w:hAnsi="Wingdings" w:cs="Wingdings" w:hint="default"/>
+      </w:rPr>
+    </w:lvl>
+    <w:lvl w:ilvl="6">
+      <w:numFmt w:val="bullet"/>
+      <w:lvlText w:val=""/>
+      <w:lvlJc w:val="left"/>
+      <w:pPr>
+        <w:ind w:left="5040" w:hanging="360"/>
+      </w:pPr>
+      <w:rPr>
+        <w:rFonts w:ascii="Symbol" w:hAnsi="Symbol" w:cs="Symbol" w:hint="default"/>
+      </w:rPr>
+    </w:lvl>
+    <w:lvl w:ilvl="7">
+      <w:numFmt w:val="bullet"/>
+      <w:lvlText w:val="o"/>
+      <w:lvlJc w:val="left"/>
+      <w:pPr>
+        <w:ind w:left="5760" w:hanging="360"/>
+      </w:pPr>
+      <w:rPr>
+        <w:rFonts w:ascii="Courier New" w:hAnsi="Courier New" w:cs="Courier New" w:hint="default"/>
+      </w:rPr>
+    </w:lvl>
+    <w:lvl w:ilvl="8">
+      <w:numFmt w:val="bullet"/>
+      <w:lvlText w:val=""/>
+      <w:lvlJc w:val="left"/>
+      <w:pPr>
+        <w:ind w:left="6480" w:hanging="360"/>
+      </w:pPr>
+      <w:rPr>
+        <w:rFonts w:ascii="Wingdings" w:hAnsi="Wingdings" w:cs="Wingdings" w:hint="default"/>
+      </w:rPr>
+    </w:lvl>
+  </w:abstractNum>
   <w:num w16cid:durableId="1845054215" w:numId="1">
     <w:abstractNumId w:val="10"/>
   </w:num>
@@ -8340,6 +9040,15 @@
   </w:num>
   <w:num w:numId="1000">
     <w:abstractNumId w:val="990"/>
+  </w:num>
+  <w:num w:numId="1001">
+    <w:abstractNumId w:val="991"/>
+  </w:num>
+  <w:num w:numId="1002">
+    <w:abstractNumId w:val="991"/>
+  </w:num>
+  <w:num w:numId="1003">
+    <w:abstractNumId w:val="991"/>
   </w:num>
 </w:numbering>
 </file>

</xml_diff>